<commit_message>
[research/skills-2026-08-05] Bước 3b: Bảng 5 đề xuất E1-E5 từ mattpocock/skills
- E1: disable-model-invocation cho 5 commands (30 phút)
- E2: grilling.md — interview primitive tái dùng (2-3 giờ)
- E3: diagnosing-bugs.md — 6-phase debug loop (2 giờ)
- E4: tdd.md — red-green-refactor loop (2-3 giờ)
- E5: code-review.md — 2-axis parallel sub-agents (3-4 giờ)

Chờ user duyệt tại Bước 4.
Plan: docs/research/RESEARCH-skills-mattpocock-2026-08-05.md §7
</commit_message>
<xml_diff>
--- a/docs/research/RESEARCH-skills-mattpocock-2026-08-05.docx
+++ b/docs/research/RESEARCH-skills-mattpocock-2026-08-05.docx
@@ -6127,14 +6127,3491 @@
     </w:p>
     <w:p>
       <w:pPr>
+        <w:pBdr>
+          <w:bottom w:val="single" w:sz="6" w:space="1" w:color="F05922"/>
+        </w:pBdr>
+        <w:spacing w:after="120"/>
+      </w:pPr>
+    </w:p>
+    <w:p>
+      <w:pPr>
+        <w:pStyle w:val="Heading2"/>
+        <w:spacing w:before="200" w:after="80"/>
+      </w:pPr>
+      <w:r>
+        <w:rPr>
+          <w:color w:val="F05922"/>
+          <w:sz w:val="28"/>
+        </w:rPr>
+        <w:t>7. Bảng đề xuất cải tiến (Mode A — Bước 3b)</w:t>
+      </w:r>
+    </w:p>
+    <w:p>
+      <w:pPr>
+        <w:spacing w:before="40" w:after="40"/>
+        <w:ind w:left="567"/>
+        <w:pBdr>
+          <w:left w:val="single" w:sz="12" w:space="10" w:color="F05922"/>
+        </w:pBdr>
+      </w:pPr>
+      <w:r>
+        <w:rPr>
+          <w:b/>
+          <w:color w:val="4A3F8C"/>
+        </w:rPr>
+        <w:t>Trạng thái:</w:t>
+      </w:r>
+      <w:r>
+        <w:rPr>
+          <w:color w:val="4A3F8C"/>
+        </w:rPr>
+        <w:t xml:space="preserve"> Chờ user duyệt tại Bước 4. CHƯA áp dụng bất kỳ thay đổi nào.</w:t>
+      </w:r>
+    </w:p>
+    <w:p>
+      <w:pPr>
         <w:spacing w:after="80"/>
       </w:pPr>
       <w:r>
         <w:rPr>
-          <w:i/>
           <w:sz w:val="21"/>
         </w:rPr>
-        <w:t>Tài liệu này chỉ phân tích, không kèm đề xuất áp dụng. Xem Bước 3b để đọc đề xuất cải tiến (Mode A) hoặc Bước 3c/3d/3e để đi sâu học nguyên lý (Mode B).</w:t>
+        <w:t xml:space="preserve">Sau khi đối chiếu hiện trạng KZTEK với repo nguồn, chọn </w:t>
+      </w:r>
+      <w:r>
+        <w:rPr>
+          <w:b/>
+          <w:sz w:val="21"/>
+        </w:rPr>
+        <w:t>5 đề xuất</w:t>
+      </w:r>
+      <w:r>
+        <w:rPr>
+          <w:sz w:val="21"/>
+        </w:rPr>
+        <w:t xml:space="preserve"> có giá trị rõ ràng và effort/rủi ro hợp lý. Đã loại bỏ: CONTEXT.md (chỉ có ý nghĩa khi có product repo cụ thể), skill lifecycle (nice-to-have, không block gì), router skill (CLAUDE.md dispatcher đã xử lý).</w:t>
+      </w:r>
+    </w:p>
+    <w:p>
+      <w:pPr>
+        <w:pBdr>
+          <w:bottom w:val="single" w:sz="6" w:space="1" w:color="F05922"/>
+        </w:pBdr>
+        <w:spacing w:after="120"/>
+      </w:pPr>
+    </w:p>
+    <w:p>
+      <w:pPr>
+        <w:pStyle w:val="Heading3"/>
+        <w:spacing w:before="160" w:after="60"/>
+      </w:pPr>
+      <w:r>
+        <w:rPr>
+          <w:color w:val="4A3F8C"/>
+          <w:sz w:val="24"/>
+        </w:rPr>
+        <w:t>E1 — Thêm `disable-model-invocation: true` cho commands chỉ nên human trigger</w:t>
+      </w:r>
+    </w:p>
+    <w:tbl>
+      <w:tblPr>
+        <w:tblStyle w:val="TableGrid"/>
+        <w:tblW w:type="auto" w:w="0"/>
+        <w:tblLook w:firstColumn="1" w:firstRow="1" w:lastColumn="0" w:lastRow="0" w:noHBand="0" w:noVBand="1" w:val="04A0"/>
+      </w:tblPr>
+      <w:tblGrid>
+        <w:gridCol w:w="4844"/>
+        <w:gridCol w:w="4844"/>
+      </w:tblGrid>
+      <w:tr>
+        <w:tc>
+          <w:tcPr>
+            <w:tcW w:type="dxa" w:w="4844"/>
+            <w:shd w:val="clear" w:color="auto" w:fill="251C53"/>
+            <w:tcBorders>
+              <w:top w:val="single" w:sz="4" w:space="0" w:color="251C53"/>
+              <w:left w:val="single" w:sz="4" w:space="0" w:color="251C53"/>
+              <w:bottom w:val="single" w:sz="4" w:space="0" w:color="251C53"/>
+              <w:right w:val="single" w:sz="4" w:space="0" w:color="251C53"/>
+            </w:tcBorders>
+          </w:tcPr>
+          <w:p>
+            <w:r>
+              <w:rPr>
+                <w:b/>
+                <w:color w:val="FFFFFF"/>
+                <w:sz w:val="20"/>
+              </w:rPr>
+              <w:t>Cột</w:t>
+            </w:r>
+          </w:p>
+        </w:tc>
+        <w:tc>
+          <w:tcPr>
+            <w:tcW w:type="dxa" w:w="4844"/>
+            <w:shd w:val="clear" w:color="auto" w:fill="251C53"/>
+            <w:tcBorders>
+              <w:top w:val="single" w:sz="4" w:space="0" w:color="251C53"/>
+              <w:left w:val="single" w:sz="4" w:space="0" w:color="251C53"/>
+              <w:bottom w:val="single" w:sz="4" w:space="0" w:color="251C53"/>
+              <w:right w:val="single" w:sz="4" w:space="0" w:color="251C53"/>
+            </w:tcBorders>
+          </w:tcPr>
+          <w:p>
+            <w:r>
+              <w:rPr>
+                <w:b/>
+                <w:color w:val="FFFFFF"/>
+                <w:sz w:val="20"/>
+              </w:rPr>
+              <w:t>Nội dung</w:t>
+            </w:r>
+          </w:p>
+        </w:tc>
+      </w:tr>
+      <w:tr>
+        <w:tc>
+          <w:tcPr>
+            <w:tcW w:type="dxa" w:w="4844"/>
+            <w:tcBorders>
+              <w:top w:val="single" w:sz="4" w:space="0" w:color="CBCBCB"/>
+              <w:left w:val="single" w:sz="4" w:space="0" w:color="CBCBCB"/>
+              <w:bottom w:val="single" w:sz="4" w:space="0" w:color="CBCBCB"/>
+              <w:right w:val="single" w:sz="4" w:space="0" w:color="CBCBCB"/>
+            </w:tcBorders>
+          </w:tcPr>
+          <w:p>
+            <w:r>
+              <w:rPr>
+                <w:sz w:val="20"/>
+              </w:rPr>
+              <w:t>-----</w:t>
+            </w:r>
+          </w:p>
+        </w:tc>
+        <w:tc>
+          <w:tcPr>
+            <w:tcW w:type="dxa" w:w="4844"/>
+            <w:tcBorders>
+              <w:top w:val="single" w:sz="4" w:space="0" w:color="CBCBCB"/>
+              <w:left w:val="single" w:sz="4" w:space="0" w:color="CBCBCB"/>
+              <w:bottom w:val="single" w:sz="4" w:space="0" w:color="CBCBCB"/>
+              <w:right w:val="single" w:sz="4" w:space="0" w:color="CBCBCB"/>
+            </w:tcBorders>
+          </w:tcPr>
+          <w:p>
+            <w:r>
+              <w:rPr>
+                <w:sz w:val="20"/>
+              </w:rPr>
+              <w:t>---------</w:t>
+            </w:r>
+          </w:p>
+        </w:tc>
+      </w:tr>
+      <w:tr>
+        <w:tc>
+          <w:tcPr>
+            <w:tcW w:type="dxa" w:w="4844"/>
+            <w:shd w:val="clear" w:color="auto" w:fill="B8B3D6"/>
+            <w:tcBorders>
+              <w:top w:val="single" w:sz="4" w:space="0" w:color="CBCBCB"/>
+              <w:left w:val="single" w:sz="4" w:space="0" w:color="CBCBCB"/>
+              <w:bottom w:val="single" w:sz="4" w:space="0" w:color="CBCBCB"/>
+              <w:right w:val="single" w:sz="4" w:space="0" w:color="CBCBCB"/>
+            </w:tcBorders>
+          </w:tcPr>
+          <w:p>
+            <w:r>
+              <w:rPr>
+                <w:b/>
+                <w:sz w:val="20"/>
+              </w:rPr>
+              <w:t>Học từ đâu</w:t>
+            </w:r>
+          </w:p>
+        </w:tc>
+        <w:tc>
+          <w:tcPr>
+            <w:tcW w:type="dxa" w:w="4844"/>
+            <w:shd w:val="clear" w:color="auto" w:fill="B8B3D6"/>
+            <w:tcBorders>
+              <w:top w:val="single" w:sz="4" w:space="0" w:color="CBCBCB"/>
+              <w:left w:val="single" w:sz="4" w:space="0" w:color="CBCBCB"/>
+              <w:bottom w:val="single" w:sz="4" w:space="0" w:color="CBCBCB"/>
+              <w:right w:val="single" w:sz="4" w:space="0" w:color="CBCBCB"/>
+            </w:tcBorders>
+          </w:tcPr>
+          <w:p>
+            <w:r>
+              <w:rPr>
+                <w:rFonts w:ascii="Courier New" w:hAnsi="Courier New"/>
+                <w:color w:val="F05922"/>
+                <w:sz w:val="20"/>
+              </w:rPr>
+              <w:t>.agents/invocation.md</w:t>
+            </w:r>
+            <w:r>
+              <w:rPr>
+                <w:sz w:val="20"/>
+              </w:rPr>
+              <w:t xml:space="preserve"> + frontmatter </w:t>
+            </w:r>
+            <w:r>
+              <w:rPr>
+                <w:rFonts w:ascii="Courier New" w:hAnsi="Courier New"/>
+                <w:color w:val="F05922"/>
+                <w:sz w:val="20"/>
+              </w:rPr>
+              <w:t>disable-model-invocation: true</w:t>
+            </w:r>
+            <w:r>
+              <w:rPr>
+                <w:sz w:val="20"/>
+              </w:rPr>
+              <w:t xml:space="preserve"> trong SKILL.md của các user-invoked skills (</w:t>
+            </w:r>
+            <w:r>
+              <w:rPr>
+                <w:rFonts w:ascii="Courier New" w:hAnsi="Courier New"/>
+                <w:color w:val="F05922"/>
+                <w:sz w:val="20"/>
+              </w:rPr>
+              <w:t>ask-matt</w:t>
+            </w:r>
+            <w:r>
+              <w:rPr>
+                <w:sz w:val="20"/>
+              </w:rPr>
+              <w:t xml:space="preserve">, </w:t>
+            </w:r>
+            <w:r>
+              <w:rPr>
+                <w:rFonts w:ascii="Courier New" w:hAnsi="Courier New"/>
+                <w:color w:val="F05922"/>
+                <w:sz w:val="20"/>
+              </w:rPr>
+              <w:t>grill-with-docs</w:t>
+            </w:r>
+            <w:r>
+              <w:rPr>
+                <w:sz w:val="20"/>
+              </w:rPr>
+              <w:t xml:space="preserve">, </w:t>
+            </w:r>
+            <w:r>
+              <w:rPr>
+                <w:rFonts w:ascii="Courier New" w:hAnsi="Courier New"/>
+                <w:color w:val="F05922"/>
+                <w:sz w:val="20"/>
+              </w:rPr>
+              <w:t>implement</w:t>
+            </w:r>
+            <w:r>
+              <w:rPr>
+                <w:sz w:val="20"/>
+              </w:rPr>
+              <w:t xml:space="preserve">, </w:t>
+            </w:r>
+            <w:r>
+              <w:rPr>
+                <w:rFonts w:ascii="Courier New" w:hAnsi="Courier New"/>
+                <w:color w:val="F05922"/>
+                <w:sz w:val="20"/>
+              </w:rPr>
+              <w:t>wayfinder</w:t>
+            </w:r>
+            <w:r>
+              <w:rPr>
+                <w:sz w:val="20"/>
+              </w:rPr>
+              <w:t xml:space="preserve">, </w:t>
+            </w:r>
+            <w:r>
+              <w:rPr>
+                <w:rFonts w:ascii="Courier New" w:hAnsi="Courier New"/>
+                <w:color w:val="F05922"/>
+                <w:sz w:val="20"/>
+              </w:rPr>
+              <w:t>handoff</w:t>
+            </w:r>
+            <w:r>
+              <w:rPr>
+                <w:sz w:val="20"/>
+              </w:rPr>
+              <w:t>). Pattern: nếu skill orchestrate luồng lớn hoặc cần human intent rõ ràng → phải tường minh block model khỏi tự trigger.</w:t>
+            </w:r>
+          </w:p>
+        </w:tc>
+      </w:tr>
+      <w:tr>
+        <w:tc>
+          <w:tcPr>
+            <w:tcW w:type="dxa" w:w="4844"/>
+            <w:tcBorders>
+              <w:top w:val="single" w:sz="4" w:space="0" w:color="CBCBCB"/>
+              <w:left w:val="single" w:sz="4" w:space="0" w:color="CBCBCB"/>
+              <w:bottom w:val="single" w:sz="4" w:space="0" w:color="CBCBCB"/>
+              <w:right w:val="single" w:sz="4" w:space="0" w:color="CBCBCB"/>
+            </w:tcBorders>
+          </w:tcPr>
+          <w:p>
+            <w:r>
+              <w:rPr>
+                <w:b/>
+                <w:sz w:val="20"/>
+              </w:rPr>
+              <w:t>Hiện trạng KZTEK</w:t>
+            </w:r>
+          </w:p>
+        </w:tc>
+        <w:tc>
+          <w:tcPr>
+            <w:tcW w:type="dxa" w:w="4844"/>
+            <w:tcBorders>
+              <w:top w:val="single" w:sz="4" w:space="0" w:color="CBCBCB"/>
+              <w:left w:val="single" w:sz="4" w:space="0" w:color="CBCBCB"/>
+              <w:bottom w:val="single" w:sz="4" w:space="0" w:color="CBCBCB"/>
+              <w:right w:val="single" w:sz="4" w:space="0" w:color="CBCBCB"/>
+            </w:tcBorders>
+          </w:tcPr>
+          <w:p>
+            <w:r>
+              <w:rPr>
+                <w:sz w:val="20"/>
+              </w:rPr>
+              <w:t xml:space="preserve">Tất cả 17 commands trong </w:t>
+            </w:r>
+            <w:r>
+              <w:rPr>
+                <w:rFonts w:ascii="Courier New" w:hAnsi="Courier New"/>
+                <w:color w:val="F05922"/>
+                <w:sz w:val="20"/>
+              </w:rPr>
+              <w:t>.claude/commands/</w:t>
+            </w:r>
+            <w:r>
+              <w:rPr>
+                <w:sz w:val="20"/>
+              </w:rPr>
+              <w:t xml:space="preserve"> đều không có frontmatter </w:t>
+            </w:r>
+            <w:r>
+              <w:rPr>
+                <w:rFonts w:ascii="Courier New" w:hAnsi="Courier New"/>
+                <w:color w:val="F05922"/>
+                <w:sz w:val="20"/>
+              </w:rPr>
+              <w:t>disable-model-invocation</w:t>
+            </w:r>
+            <w:r>
+              <w:rPr>
+                <w:sz w:val="20"/>
+              </w:rPr>
+              <w:t xml:space="preserve">. Không có cơ chế nào ngăn agent tự trigger </w:t>
+            </w:r>
+            <w:r>
+              <w:rPr>
+                <w:rFonts w:ascii="Courier New" w:hAnsi="Courier New"/>
+                <w:color w:val="F05922"/>
+                <w:sz w:val="20"/>
+              </w:rPr>
+              <w:t>scope-check</w:t>
+            </w:r>
+            <w:r>
+              <w:rPr>
+                <w:sz w:val="20"/>
+              </w:rPr>
+              <w:t xml:space="preserve">, </w:t>
+            </w:r>
+            <w:r>
+              <w:rPr>
+                <w:rFonts w:ascii="Courier New" w:hAnsi="Courier New"/>
+                <w:color w:val="F05922"/>
+                <w:sz w:val="20"/>
+              </w:rPr>
+              <w:t>ship</w:t>
+            </w:r>
+            <w:r>
+              <w:rPr>
+                <w:sz w:val="20"/>
+              </w:rPr>
+              <w:t xml:space="preserve">, </w:t>
+            </w:r>
+            <w:r>
+              <w:rPr>
+                <w:rFonts w:ascii="Courier New" w:hAnsi="Courier New"/>
+                <w:color w:val="F05922"/>
+                <w:sz w:val="20"/>
+              </w:rPr>
+              <w:t>run-plan-step</w:t>
+            </w:r>
+            <w:r>
+              <w:rPr>
+                <w:sz w:val="20"/>
+              </w:rPr>
+              <w:t xml:space="preserve">, </w:t>
+            </w:r>
+            <w:r>
+              <w:rPr>
+                <w:rFonts w:ascii="Courier New" w:hAnsi="Courier New"/>
+                <w:color w:val="F05922"/>
+                <w:sz w:val="20"/>
+              </w:rPr>
+              <w:t>sync-global</w:t>
+            </w:r>
+            <w:r>
+              <w:rPr>
+                <w:sz w:val="20"/>
+              </w:rPr>
+              <w:t xml:space="preserve">, </w:t>
+            </w:r>
+            <w:r>
+              <w:rPr>
+                <w:rFonts w:ascii="Courier New" w:hAnsi="Courier New"/>
+                <w:color w:val="F05922"/>
+                <w:sz w:val="20"/>
+              </w:rPr>
+              <w:t>sdk-crossplatform-eval</w:t>
+            </w:r>
+            <w:r>
+              <w:rPr>
+                <w:sz w:val="20"/>
+              </w:rPr>
+              <w:t xml:space="preserve"> — các commands có side effect lớn hoặc chỉ có ý nghĩa khi human chủ động.</w:t>
+            </w:r>
+          </w:p>
+        </w:tc>
+      </w:tr>
+      <w:tr>
+        <w:tc>
+          <w:tcPr>
+            <w:tcW w:type="dxa" w:w="4844"/>
+            <w:shd w:val="clear" w:color="auto" w:fill="B8B3D6"/>
+            <w:tcBorders>
+              <w:top w:val="single" w:sz="4" w:space="0" w:color="CBCBCB"/>
+              <w:left w:val="single" w:sz="4" w:space="0" w:color="CBCBCB"/>
+              <w:bottom w:val="single" w:sz="4" w:space="0" w:color="CBCBCB"/>
+              <w:right w:val="single" w:sz="4" w:space="0" w:color="CBCBCB"/>
+            </w:tcBorders>
+          </w:tcPr>
+          <w:p>
+            <w:r>
+              <w:rPr>
+                <w:b/>
+                <w:sz w:val="20"/>
+              </w:rPr>
+              <w:t>Lý do thay đổi</w:t>
+            </w:r>
+          </w:p>
+        </w:tc>
+        <w:tc>
+          <w:tcPr>
+            <w:tcW w:type="dxa" w:w="4844"/>
+            <w:shd w:val="clear" w:color="auto" w:fill="B8B3D6"/>
+            <w:tcBorders>
+              <w:top w:val="single" w:sz="4" w:space="0" w:color="CBCBCB"/>
+              <w:left w:val="single" w:sz="4" w:space="0" w:color="CBCBCB"/>
+              <w:bottom w:val="single" w:sz="4" w:space="0" w:color="CBCBCB"/>
+              <w:right w:val="single" w:sz="4" w:space="0" w:color="CBCBCB"/>
+            </w:tcBorders>
+          </w:tcPr>
+          <w:p>
+            <w:r>
+              <w:rPr>
+                <w:sz w:val="20"/>
+              </w:rPr>
+              <w:t xml:space="preserve">Nếu không block, agent có thể tự trigger </w:t>
+            </w:r>
+            <w:r>
+              <w:rPr>
+                <w:rFonts w:ascii="Courier New" w:hAnsi="Courier New"/>
+                <w:color w:val="F05922"/>
+                <w:sz w:val="20"/>
+              </w:rPr>
+              <w:t>ship</w:t>
+            </w:r>
+            <w:r>
+              <w:rPr>
+                <w:sz w:val="20"/>
+              </w:rPr>
+              <w:t xml:space="preserve"> (deploy gate) hoặc </w:t>
+            </w:r>
+            <w:r>
+              <w:rPr>
+                <w:rFonts w:ascii="Courier New" w:hAnsi="Courier New"/>
+                <w:color w:val="F05922"/>
+                <w:sz w:val="20"/>
+              </w:rPr>
+              <w:t>run-plan-step</w:t>
+            </w:r>
+            <w:r>
+              <w:rPr>
+                <w:sz w:val="20"/>
+              </w:rPr>
+              <w:t xml:space="preserve"> (chạy bước kế tiếp trong plan) mà không có human intent — vi phạm Two-Eyes Principle ngầm. Hiện trạng này là "may mắn chưa xảy ra vấn đề" chứ không phải "đã được bảo vệ".</w:t>
+            </w:r>
+          </w:p>
+        </w:tc>
+      </w:tr>
+      <w:tr>
+        <w:tc>
+          <w:tcPr>
+            <w:tcW w:type="dxa" w:w="4844"/>
+            <w:tcBorders>
+              <w:top w:val="single" w:sz="4" w:space="0" w:color="CBCBCB"/>
+              <w:left w:val="single" w:sz="4" w:space="0" w:color="CBCBCB"/>
+              <w:bottom w:val="single" w:sz="4" w:space="0" w:color="CBCBCB"/>
+              <w:right w:val="single" w:sz="4" w:space="0" w:color="CBCBCB"/>
+            </w:tcBorders>
+          </w:tcPr>
+          <w:p>
+            <w:r>
+              <w:rPr>
+                <w:b/>
+                <w:sz w:val="20"/>
+              </w:rPr>
+              <w:t>Áp dụng vào đâu</w:t>
+            </w:r>
+          </w:p>
+        </w:tc>
+        <w:tc>
+          <w:tcPr>
+            <w:tcW w:type="dxa" w:w="4844"/>
+            <w:tcBorders>
+              <w:top w:val="single" w:sz="4" w:space="0" w:color="CBCBCB"/>
+              <w:left w:val="single" w:sz="4" w:space="0" w:color="CBCBCB"/>
+              <w:bottom w:val="single" w:sz="4" w:space="0" w:color="CBCBCB"/>
+              <w:right w:val="single" w:sz="4" w:space="0" w:color="CBCBCB"/>
+            </w:tcBorders>
+          </w:tcPr>
+          <w:p>
+            <w:r>
+              <w:rPr>
+                <w:sz w:val="20"/>
+              </w:rPr>
+              <w:t xml:space="preserve">Thêm </w:t>
+            </w:r>
+            <w:r>
+              <w:rPr>
+                <w:rFonts w:ascii="Courier New" w:hAnsi="Courier New"/>
+                <w:color w:val="F05922"/>
+                <w:sz w:val="20"/>
+              </w:rPr>
+              <w:t>disable-model-invocation: true</w:t>
+            </w:r>
+            <w:r>
+              <w:rPr>
+                <w:sz w:val="20"/>
+              </w:rPr>
+              <w:t xml:space="preserve"> vào frontmatter của 5 commands: </w:t>
+            </w:r>
+            <w:r>
+              <w:rPr>
+                <w:rFonts w:ascii="Courier New" w:hAnsi="Courier New"/>
+                <w:color w:val="F05922"/>
+                <w:sz w:val="20"/>
+              </w:rPr>
+              <w:t>scope-check.md</w:t>
+            </w:r>
+            <w:r>
+              <w:rPr>
+                <w:sz w:val="20"/>
+              </w:rPr>
+              <w:t xml:space="preserve">, </w:t>
+            </w:r>
+            <w:r>
+              <w:rPr>
+                <w:rFonts w:ascii="Courier New" w:hAnsi="Courier New"/>
+                <w:color w:val="F05922"/>
+                <w:sz w:val="20"/>
+              </w:rPr>
+              <w:t>ship.md</w:t>
+            </w:r>
+            <w:r>
+              <w:rPr>
+                <w:sz w:val="20"/>
+              </w:rPr>
+              <w:t xml:space="preserve">, </w:t>
+            </w:r>
+            <w:r>
+              <w:rPr>
+                <w:rFonts w:ascii="Courier New" w:hAnsi="Courier New"/>
+                <w:color w:val="F05922"/>
+                <w:sz w:val="20"/>
+              </w:rPr>
+              <w:t>run-plan-step.md</w:t>
+            </w:r>
+            <w:r>
+              <w:rPr>
+                <w:sz w:val="20"/>
+              </w:rPr>
+              <w:t xml:space="preserve">, </w:t>
+            </w:r>
+            <w:r>
+              <w:rPr>
+                <w:rFonts w:ascii="Courier New" w:hAnsi="Courier New"/>
+                <w:color w:val="F05922"/>
+                <w:sz w:val="20"/>
+              </w:rPr>
+              <w:t>sync-global.md</w:t>
+            </w:r>
+            <w:r>
+              <w:rPr>
+                <w:sz w:val="20"/>
+              </w:rPr>
+              <w:t xml:space="preserve">, </w:t>
+            </w:r>
+            <w:r>
+              <w:rPr>
+                <w:rFonts w:ascii="Courier New" w:hAnsi="Courier New"/>
+                <w:color w:val="F05922"/>
+                <w:sz w:val="20"/>
+              </w:rPr>
+              <w:t>sdk-crossplatform-eval.md</w:t>
+            </w:r>
+            <w:r>
+              <w:rPr>
+                <w:sz w:val="20"/>
+              </w:rPr>
+              <w:t>. Các commands có thể agent tự trigger hợp lý (</w:t>
+            </w:r>
+            <w:r>
+              <w:rPr>
+                <w:rFonts w:ascii="Courier New" w:hAnsi="Courier New"/>
+                <w:color w:val="F05922"/>
+                <w:sz w:val="20"/>
+              </w:rPr>
+              <w:t>pre-coding-check</w:t>
+            </w:r>
+            <w:r>
+              <w:rPr>
+                <w:sz w:val="20"/>
+              </w:rPr>
+              <w:t xml:space="preserve">, </w:t>
+            </w:r>
+            <w:r>
+              <w:rPr>
+                <w:rFonts w:ascii="Courier New" w:hAnsi="Courier New"/>
+                <w:color w:val="F05922"/>
+                <w:sz w:val="20"/>
+              </w:rPr>
+              <w:t>verify-pr</w:t>
+            </w:r>
+            <w:r>
+              <w:rPr>
+                <w:sz w:val="20"/>
+              </w:rPr>
+              <w:t xml:space="preserve">, </w:t>
+            </w:r>
+            <w:r>
+              <w:rPr>
+                <w:rFonts w:ascii="Courier New" w:hAnsi="Courier New"/>
+                <w:color w:val="F05922"/>
+                <w:sz w:val="20"/>
+              </w:rPr>
+              <w:t>detect-impact</w:t>
+            </w:r>
+            <w:r>
+              <w:rPr>
+                <w:sz w:val="20"/>
+              </w:rPr>
+              <w:t>) thì giữ nguyên.</w:t>
+            </w:r>
+          </w:p>
+        </w:tc>
+      </w:tr>
+      <w:tr>
+        <w:tc>
+          <w:tcPr>
+            <w:tcW w:type="dxa" w:w="4844"/>
+            <w:shd w:val="clear" w:color="auto" w:fill="B8B3D6"/>
+            <w:tcBorders>
+              <w:top w:val="single" w:sz="4" w:space="0" w:color="CBCBCB"/>
+              <w:left w:val="single" w:sz="4" w:space="0" w:color="CBCBCB"/>
+              <w:bottom w:val="single" w:sz="4" w:space="0" w:color="CBCBCB"/>
+              <w:right w:val="single" w:sz="4" w:space="0" w:color="CBCBCB"/>
+            </w:tcBorders>
+          </w:tcPr>
+          <w:p>
+            <w:r>
+              <w:rPr>
+                <w:b/>
+                <w:sz w:val="20"/>
+              </w:rPr>
+              <w:t>Đạt được gì</w:t>
+            </w:r>
+          </w:p>
+        </w:tc>
+        <w:tc>
+          <w:tcPr>
+            <w:tcW w:type="dxa" w:w="4844"/>
+            <w:shd w:val="clear" w:color="auto" w:fill="B8B3D6"/>
+            <w:tcBorders>
+              <w:top w:val="single" w:sz="4" w:space="0" w:color="CBCBCB"/>
+              <w:left w:val="single" w:sz="4" w:space="0" w:color="CBCBCB"/>
+              <w:bottom w:val="single" w:sz="4" w:space="0" w:color="CBCBCB"/>
+              <w:right w:val="single" w:sz="4" w:space="0" w:color="CBCBCB"/>
+            </w:tcBorders>
+          </w:tcPr>
+          <w:p>
+            <w:r>
+              <w:rPr>
+                <w:sz w:val="20"/>
+              </w:rPr>
+              <w:t xml:space="preserve">Agent không còn tự ý trigger các flow orchestration-level. Ví dụ cụ thể: trong 1 session dài, agent không tự gọi </w:t>
+            </w:r>
+            <w:r>
+              <w:rPr>
+                <w:rFonts w:ascii="Courier New" w:hAnsi="Courier New"/>
+                <w:color w:val="F05922"/>
+                <w:sz w:val="20"/>
+              </w:rPr>
+              <w:t>ship</w:t>
+            </w:r>
+            <w:r>
+              <w:rPr>
+                <w:sz w:val="20"/>
+              </w:rPr>
+              <w:t xml:space="preserve"> để deploy khi thấy code đã "xong" theo nhận định của nó — thay vào đó phải chờ human </w:t>
+            </w:r>
+            <w:r>
+              <w:rPr>
+                <w:rFonts w:ascii="Courier New" w:hAnsi="Courier New"/>
+                <w:color w:val="F05922"/>
+                <w:sz w:val="20"/>
+              </w:rPr>
+              <w:t>/ship</w:t>
+            </w:r>
+            <w:r>
+              <w:rPr>
+                <w:sz w:val="20"/>
+              </w:rPr>
+              <w:t>.</w:t>
+            </w:r>
+          </w:p>
+        </w:tc>
+      </w:tr>
+      <w:tr>
+        <w:tc>
+          <w:tcPr>
+            <w:tcW w:type="dxa" w:w="4844"/>
+            <w:tcBorders>
+              <w:top w:val="single" w:sz="4" w:space="0" w:color="CBCBCB"/>
+              <w:left w:val="single" w:sz="4" w:space="0" w:color="CBCBCB"/>
+              <w:bottom w:val="single" w:sz="4" w:space="0" w:color="CBCBCB"/>
+              <w:right w:val="single" w:sz="4" w:space="0" w:color="CBCBCB"/>
+            </w:tcBorders>
+          </w:tcPr>
+          <w:p>
+            <w:r>
+              <w:rPr>
+                <w:b/>
+                <w:sz w:val="20"/>
+              </w:rPr>
+              <w:t>Rủi ro/Effort</w:t>
+            </w:r>
+          </w:p>
+        </w:tc>
+        <w:tc>
+          <w:tcPr>
+            <w:tcW w:type="dxa" w:w="4844"/>
+            <w:tcBorders>
+              <w:top w:val="single" w:sz="4" w:space="0" w:color="CBCBCB"/>
+              <w:left w:val="single" w:sz="4" w:space="0" w:color="CBCBCB"/>
+              <w:bottom w:val="single" w:sz="4" w:space="0" w:color="CBCBCB"/>
+              <w:right w:val="single" w:sz="4" w:space="0" w:color="CBCBCB"/>
+            </w:tcBorders>
+          </w:tcPr>
+          <w:p>
+            <w:r>
+              <w:rPr>
+                <w:sz w:val="20"/>
+              </w:rPr>
+              <w:t>Rủi ro: Gần như không có — chỉ thêm 1 dòng frontmatter, không thay đổi behavior của skill. Effort: 30 phút — Edit 5 file.</w:t>
+            </w:r>
+          </w:p>
+        </w:tc>
+      </w:tr>
+    </w:tbl>
+    <w:p/>
+    <w:p>
+      <w:pPr>
+        <w:pBdr>
+          <w:bottom w:val="single" w:sz="6" w:space="1" w:color="F05922"/>
+        </w:pBdr>
+        <w:spacing w:after="120"/>
+      </w:pPr>
+    </w:p>
+    <w:p>
+      <w:pPr>
+        <w:pStyle w:val="Heading3"/>
+        <w:spacing w:before="160" w:after="60"/>
+      </w:pPr>
+      <w:r>
+        <w:rPr>
+          <w:color w:val="4A3F8C"/>
+          <w:sz w:val="24"/>
+        </w:rPr>
+        <w:t>E2 — Tạo skill `grilling.md` — Interview primitive tái dùng được</w:t>
+      </w:r>
+    </w:p>
+    <w:tbl>
+      <w:tblPr>
+        <w:tblStyle w:val="TableGrid"/>
+        <w:tblW w:type="auto" w:w="0"/>
+        <w:tblLook w:firstColumn="1" w:firstRow="1" w:lastColumn="0" w:lastRow="0" w:noHBand="0" w:noVBand="1" w:val="04A0"/>
+      </w:tblPr>
+      <w:tblGrid>
+        <w:gridCol w:w="4844"/>
+        <w:gridCol w:w="4844"/>
+      </w:tblGrid>
+      <w:tr>
+        <w:tc>
+          <w:tcPr>
+            <w:tcW w:type="dxa" w:w="4844"/>
+            <w:shd w:val="clear" w:color="auto" w:fill="251C53"/>
+            <w:tcBorders>
+              <w:top w:val="single" w:sz="4" w:space="0" w:color="251C53"/>
+              <w:left w:val="single" w:sz="4" w:space="0" w:color="251C53"/>
+              <w:bottom w:val="single" w:sz="4" w:space="0" w:color="251C53"/>
+              <w:right w:val="single" w:sz="4" w:space="0" w:color="251C53"/>
+            </w:tcBorders>
+          </w:tcPr>
+          <w:p>
+            <w:r>
+              <w:rPr>
+                <w:b/>
+                <w:color w:val="FFFFFF"/>
+                <w:sz w:val="20"/>
+              </w:rPr>
+              <w:t>Cột</w:t>
+            </w:r>
+          </w:p>
+        </w:tc>
+        <w:tc>
+          <w:tcPr>
+            <w:tcW w:type="dxa" w:w="4844"/>
+            <w:shd w:val="clear" w:color="auto" w:fill="251C53"/>
+            <w:tcBorders>
+              <w:top w:val="single" w:sz="4" w:space="0" w:color="251C53"/>
+              <w:left w:val="single" w:sz="4" w:space="0" w:color="251C53"/>
+              <w:bottom w:val="single" w:sz="4" w:space="0" w:color="251C53"/>
+              <w:right w:val="single" w:sz="4" w:space="0" w:color="251C53"/>
+            </w:tcBorders>
+          </w:tcPr>
+          <w:p>
+            <w:r>
+              <w:rPr>
+                <w:b/>
+                <w:color w:val="FFFFFF"/>
+                <w:sz w:val="20"/>
+              </w:rPr>
+              <w:t>Nội dung</w:t>
+            </w:r>
+          </w:p>
+        </w:tc>
+      </w:tr>
+      <w:tr>
+        <w:tc>
+          <w:tcPr>
+            <w:tcW w:type="dxa" w:w="4844"/>
+            <w:tcBorders>
+              <w:top w:val="single" w:sz="4" w:space="0" w:color="CBCBCB"/>
+              <w:left w:val="single" w:sz="4" w:space="0" w:color="CBCBCB"/>
+              <w:bottom w:val="single" w:sz="4" w:space="0" w:color="CBCBCB"/>
+              <w:right w:val="single" w:sz="4" w:space="0" w:color="CBCBCB"/>
+            </w:tcBorders>
+          </w:tcPr>
+          <w:p>
+            <w:r>
+              <w:rPr>
+                <w:sz w:val="20"/>
+              </w:rPr>
+              <w:t>-----</w:t>
+            </w:r>
+          </w:p>
+        </w:tc>
+        <w:tc>
+          <w:tcPr>
+            <w:tcW w:type="dxa" w:w="4844"/>
+            <w:tcBorders>
+              <w:top w:val="single" w:sz="4" w:space="0" w:color="CBCBCB"/>
+              <w:left w:val="single" w:sz="4" w:space="0" w:color="CBCBCB"/>
+              <w:bottom w:val="single" w:sz="4" w:space="0" w:color="CBCBCB"/>
+              <w:right w:val="single" w:sz="4" w:space="0" w:color="CBCBCB"/>
+            </w:tcBorders>
+          </w:tcPr>
+          <w:p>
+            <w:r>
+              <w:rPr>
+                <w:sz w:val="20"/>
+              </w:rPr>
+              <w:t>---------</w:t>
+            </w:r>
+          </w:p>
+        </w:tc>
+      </w:tr>
+      <w:tr>
+        <w:tc>
+          <w:tcPr>
+            <w:tcW w:type="dxa" w:w="4844"/>
+            <w:shd w:val="clear" w:color="auto" w:fill="B8B3D6"/>
+            <w:tcBorders>
+              <w:top w:val="single" w:sz="4" w:space="0" w:color="CBCBCB"/>
+              <w:left w:val="single" w:sz="4" w:space="0" w:color="CBCBCB"/>
+              <w:bottom w:val="single" w:sz="4" w:space="0" w:color="CBCBCB"/>
+              <w:right w:val="single" w:sz="4" w:space="0" w:color="CBCBCB"/>
+            </w:tcBorders>
+          </w:tcPr>
+          <w:p>
+            <w:r>
+              <w:rPr>
+                <w:b/>
+                <w:sz w:val="20"/>
+              </w:rPr>
+              <w:t>Học từ đâu</w:t>
+            </w:r>
+          </w:p>
+        </w:tc>
+        <w:tc>
+          <w:tcPr>
+            <w:tcW w:type="dxa" w:w="4844"/>
+            <w:shd w:val="clear" w:color="auto" w:fill="B8B3D6"/>
+            <w:tcBorders>
+              <w:top w:val="single" w:sz="4" w:space="0" w:color="CBCBCB"/>
+              <w:left w:val="single" w:sz="4" w:space="0" w:color="CBCBCB"/>
+              <w:bottom w:val="single" w:sz="4" w:space="0" w:color="CBCBCB"/>
+              <w:right w:val="single" w:sz="4" w:space="0" w:color="CBCBCB"/>
+            </w:tcBorders>
+          </w:tcPr>
+          <w:p>
+            <w:r>
+              <w:rPr>
+                <w:rFonts w:ascii="Courier New" w:hAnsi="Courier New"/>
+                <w:color w:val="F05922"/>
+                <w:sz w:val="20"/>
+              </w:rPr>
+              <w:t>skills/productivity/grilling/SKILL.md</w:t>
+            </w:r>
+            <w:r>
+              <w:rPr>
+                <w:sz w:val="20"/>
+              </w:rPr>
+              <w:t xml:space="preserve"> — model interview như design tree: rounds, frontier (tất cả quyết định đã settled prerequisite), agent tự tìm facts (không hỏi user về thứ tra được), kết thúc khi frontier rỗng.</w:t>
+            </w:r>
+          </w:p>
+        </w:tc>
+      </w:tr>
+      <w:tr>
+        <w:tc>
+          <w:tcPr>
+            <w:tcW w:type="dxa" w:w="4844"/>
+            <w:tcBorders>
+              <w:top w:val="single" w:sz="4" w:space="0" w:color="CBCBCB"/>
+              <w:left w:val="single" w:sz="4" w:space="0" w:color="CBCBCB"/>
+              <w:bottom w:val="single" w:sz="4" w:space="0" w:color="CBCBCB"/>
+              <w:right w:val="single" w:sz="4" w:space="0" w:color="CBCBCB"/>
+            </w:tcBorders>
+          </w:tcPr>
+          <w:p>
+            <w:r>
+              <w:rPr>
+                <w:b/>
+                <w:sz w:val="20"/>
+              </w:rPr>
+              <w:t>Hiện trạng KZTEK</w:t>
+            </w:r>
+          </w:p>
+        </w:tc>
+        <w:tc>
+          <w:tcPr>
+            <w:tcW w:type="dxa" w:w="4844"/>
+            <w:tcBorders>
+              <w:top w:val="single" w:sz="4" w:space="0" w:color="CBCBCB"/>
+              <w:left w:val="single" w:sz="4" w:space="0" w:color="CBCBCB"/>
+              <w:bottom w:val="single" w:sz="4" w:space="0" w:color="CBCBCB"/>
+              <w:right w:val="single" w:sz="4" w:space="0" w:color="CBCBCB"/>
+            </w:tcBorders>
+          </w:tcPr>
+          <w:p>
+            <w:r>
+              <w:rPr>
+                <w:rFonts w:ascii="Courier New" w:hAnsi="Courier New"/>
+                <w:color w:val="F05922"/>
+                <w:sz w:val="20"/>
+              </w:rPr>
+              <w:t>.claude/commands/scope-check.md</w:t>
+            </w:r>
+            <w:r>
+              <w:rPr>
+                <w:sz w:val="20"/>
+              </w:rPr>
+              <w:t xml:space="preserve"> — hỏi tối đa 5 câu cứng nhắc về scope/priority/workflow, không có design tree, không có round model, không tái dùng được bởi skill khác. Khi task phức tạp cần làm rõ yêu cầu sâu hơn (VD: feature mới có nhiều nhánh quyết định), scope-check dừng sau 5 câu dù design tree chưa settled.</w:t>
+            </w:r>
+          </w:p>
+        </w:tc>
+      </w:tr>
+      <w:tr>
+        <w:tc>
+          <w:tcPr>
+            <w:tcW w:type="dxa" w:w="4844"/>
+            <w:shd w:val="clear" w:color="auto" w:fill="B8B3D6"/>
+            <w:tcBorders>
+              <w:top w:val="single" w:sz="4" w:space="0" w:color="CBCBCB"/>
+              <w:left w:val="single" w:sz="4" w:space="0" w:color="CBCBCB"/>
+              <w:bottom w:val="single" w:sz="4" w:space="0" w:color="CBCBCB"/>
+              <w:right w:val="single" w:sz="4" w:space="0" w:color="CBCBCB"/>
+            </w:tcBorders>
+          </w:tcPr>
+          <w:p>
+            <w:r>
+              <w:rPr>
+                <w:b/>
+                <w:sz w:val="20"/>
+              </w:rPr>
+              <w:t>Lý do thay đổi</w:t>
+            </w:r>
+          </w:p>
+        </w:tc>
+        <w:tc>
+          <w:tcPr>
+            <w:tcW w:type="dxa" w:w="4844"/>
+            <w:shd w:val="clear" w:color="auto" w:fill="B8B3D6"/>
+            <w:tcBorders>
+              <w:top w:val="single" w:sz="4" w:space="0" w:color="CBCBCB"/>
+              <w:left w:val="single" w:sz="4" w:space="0" w:color="CBCBCB"/>
+              <w:bottom w:val="single" w:sz="4" w:space="0" w:color="CBCBCB"/>
+              <w:right w:val="single" w:sz="4" w:space="0" w:color="CBCBCB"/>
+            </w:tcBorders>
+          </w:tcPr>
+          <w:p>
+            <w:r>
+              <w:rPr>
+                <w:sz w:val="20"/>
+              </w:rPr>
+              <w:t>scope-check giải quyết vấn đề khác (</w:t>
+            </w:r>
+            <w:r>
+              <w:rPr>
+                <w:rFonts w:ascii="Courier New" w:hAnsi="Courier New"/>
+                <w:color w:val="F05922"/>
+                <w:sz w:val="20"/>
+              </w:rPr>
+              <w:t>map yêu cầu → workflow ID + priority</w:t>
+            </w:r>
+            <w:r>
+              <w:rPr>
+                <w:sz w:val="20"/>
+              </w:rPr>
+              <w:t>) — không phải "làm rõ yêu cầu sâu". Hiện KZTEK không có primitive nào để agent gọi khi cần interview user cho đến khi "every branch of the decision tree is resolved". Nếu thiếu grilling, agent tiếp tục với hiểu biết chưa đầy đủ → sai scope → làm lại.</w:t>
+            </w:r>
+          </w:p>
+        </w:tc>
+      </w:tr>
+      <w:tr>
+        <w:tc>
+          <w:tcPr>
+            <w:tcW w:type="dxa" w:w="4844"/>
+            <w:tcBorders>
+              <w:top w:val="single" w:sz="4" w:space="0" w:color="CBCBCB"/>
+              <w:left w:val="single" w:sz="4" w:space="0" w:color="CBCBCB"/>
+              <w:bottom w:val="single" w:sz="4" w:space="0" w:color="CBCBCB"/>
+              <w:right w:val="single" w:sz="4" w:space="0" w:color="CBCBCB"/>
+            </w:tcBorders>
+          </w:tcPr>
+          <w:p>
+            <w:r>
+              <w:rPr>
+                <w:b/>
+                <w:sz w:val="20"/>
+              </w:rPr>
+              <w:t>Áp dụng vào đâu</w:t>
+            </w:r>
+          </w:p>
+        </w:tc>
+        <w:tc>
+          <w:tcPr>
+            <w:tcW w:type="dxa" w:w="4844"/>
+            <w:tcBorders>
+              <w:top w:val="single" w:sz="4" w:space="0" w:color="CBCBCB"/>
+              <w:left w:val="single" w:sz="4" w:space="0" w:color="CBCBCB"/>
+              <w:bottom w:val="single" w:sz="4" w:space="0" w:color="CBCBCB"/>
+              <w:right w:val="single" w:sz="4" w:space="0" w:color="CBCBCB"/>
+            </w:tcBorders>
+          </w:tcPr>
+          <w:p>
+            <w:r>
+              <w:rPr>
+                <w:sz w:val="20"/>
+              </w:rPr>
+              <w:t xml:space="preserve">Tạo mới </w:t>
+            </w:r>
+            <w:r>
+              <w:rPr>
+                <w:rFonts w:ascii="Courier New" w:hAnsi="Courier New"/>
+                <w:color w:val="F05922"/>
+                <w:sz w:val="20"/>
+              </w:rPr>
+              <w:t>.claude/commands/grilling.md</w:t>
+            </w:r>
+            <w:r>
+              <w:rPr>
+                <w:sz w:val="20"/>
+              </w:rPr>
+              <w:t xml:space="preserve">. Cập nhật </w:t>
+            </w:r>
+            <w:r>
+              <w:rPr>
+                <w:rFonts w:ascii="Courier New" w:hAnsi="Courier New"/>
+                <w:color w:val="F05922"/>
+                <w:sz w:val="20"/>
+              </w:rPr>
+              <w:t>scope-check.md</w:t>
+            </w:r>
+            <w:r>
+              <w:rPr>
+                <w:sz w:val="20"/>
+              </w:rPr>
+              <w:t xml:space="preserve"> để gọi grilling khi scope phức tạp (thay vì tự hỏi 5 câu cứng). Cập nhật </w:t>
+            </w:r>
+            <w:r>
+              <w:rPr>
+                <w:rFonts w:ascii="Courier New" w:hAnsi="Courier New"/>
+                <w:color w:val="F05922"/>
+                <w:sz w:val="20"/>
+              </w:rPr>
+              <w:t>CLAUDE.md</w:t>
+            </w:r>
+            <w:r>
+              <w:rPr>
+                <w:sz w:val="20"/>
+              </w:rPr>
+              <w:t xml:space="preserve"> §Pre-0a để mention grilling là option khi scope-check không đủ.</w:t>
+            </w:r>
+          </w:p>
+        </w:tc>
+      </w:tr>
+      <w:tr>
+        <w:tc>
+          <w:tcPr>
+            <w:tcW w:type="dxa" w:w="4844"/>
+            <w:shd w:val="clear" w:color="auto" w:fill="B8B3D6"/>
+            <w:tcBorders>
+              <w:top w:val="single" w:sz="4" w:space="0" w:color="CBCBCB"/>
+              <w:left w:val="single" w:sz="4" w:space="0" w:color="CBCBCB"/>
+              <w:bottom w:val="single" w:sz="4" w:space="0" w:color="CBCBCB"/>
+              <w:right w:val="single" w:sz="4" w:space="0" w:color="CBCBCB"/>
+            </w:tcBorders>
+          </w:tcPr>
+          <w:p>
+            <w:r>
+              <w:rPr>
+                <w:b/>
+                <w:sz w:val="20"/>
+              </w:rPr>
+              <w:t>Đạt được gì</w:t>
+            </w:r>
+          </w:p>
+        </w:tc>
+        <w:tc>
+          <w:tcPr>
+            <w:tcW w:type="dxa" w:w="4844"/>
+            <w:shd w:val="clear" w:color="auto" w:fill="B8B3D6"/>
+            <w:tcBorders>
+              <w:top w:val="single" w:sz="4" w:space="0" w:color="CBCBCB"/>
+              <w:left w:val="single" w:sz="4" w:space="0" w:color="CBCBCB"/>
+              <w:bottom w:val="single" w:sz="4" w:space="0" w:color="CBCBCB"/>
+              <w:right w:val="single" w:sz="4" w:space="0" w:color="CBCBCB"/>
+            </w:tcBorders>
+          </w:tcPr>
+          <w:p>
+            <w:r>
+              <w:rPr>
+                <w:sz w:val="20"/>
+              </w:rPr>
+              <w:t>Khi PM/Tech Lead cần làm rõ yêu cầu feature mới phức tạp, agent có thể chạy grilling session theo rounds (hỏi toàn bộ frontier, chờ answer, recompute frontier) thay vì hỏi 5 câu rồi đoán phần còn lại. Giảm vòng lặp "làm xong rồi sai yêu cầu → làm lại" — hiện tại xảy ra khi PRD dựa trên 5 câu scope-check không đủ.</w:t>
+            </w:r>
+          </w:p>
+        </w:tc>
+      </w:tr>
+      <w:tr>
+        <w:tc>
+          <w:tcPr>
+            <w:tcW w:type="dxa" w:w="4844"/>
+            <w:tcBorders>
+              <w:top w:val="single" w:sz="4" w:space="0" w:color="CBCBCB"/>
+              <w:left w:val="single" w:sz="4" w:space="0" w:color="CBCBCB"/>
+              <w:bottom w:val="single" w:sz="4" w:space="0" w:color="CBCBCB"/>
+              <w:right w:val="single" w:sz="4" w:space="0" w:color="CBCBCB"/>
+            </w:tcBorders>
+          </w:tcPr>
+          <w:p>
+            <w:r>
+              <w:rPr>
+                <w:b/>
+                <w:sz w:val="20"/>
+              </w:rPr>
+              <w:t>Rủi ro/Effort</w:t>
+            </w:r>
+          </w:p>
+        </w:tc>
+        <w:tc>
+          <w:tcPr>
+            <w:tcW w:type="dxa" w:w="4844"/>
+            <w:tcBorders>
+              <w:top w:val="single" w:sz="4" w:space="0" w:color="CBCBCB"/>
+              <w:left w:val="single" w:sz="4" w:space="0" w:color="CBCBCB"/>
+              <w:bottom w:val="single" w:sz="4" w:space="0" w:color="CBCBCB"/>
+              <w:right w:val="single" w:sz="4" w:space="0" w:color="CBCBCB"/>
+            </w:tcBorders>
+          </w:tcPr>
+          <w:p>
+            <w:r>
+              <w:rPr>
+                <w:sz w:val="20"/>
+              </w:rPr>
+              <w:t xml:space="preserve">Rủi ro: Thấp — grilling là model-invoked (không thay thế scope-check). Effort: 2–3 giờ — viết SKILL.md theo mattpocock template, qua </w:t>
+            </w:r>
+            <w:r>
+              <w:rPr>
+                <w:rFonts w:ascii="Courier New" w:hAnsi="Courier New"/>
+                <w:color w:val="F05922"/>
+                <w:sz w:val="20"/>
+              </w:rPr>
+              <w:t>writing-agent-skill.md</w:t>
+            </w:r>
+            <w:r>
+              <w:rPr>
+                <w:sz w:val="20"/>
+              </w:rPr>
+              <w:t xml:space="preserve"> workflow, cập nhật 2 file.</w:t>
+            </w:r>
+          </w:p>
+        </w:tc>
+      </w:tr>
+    </w:tbl>
+    <w:p/>
+    <w:p>
+      <w:pPr>
+        <w:pBdr>
+          <w:bottom w:val="single" w:sz="6" w:space="1" w:color="F05922"/>
+        </w:pBdr>
+        <w:spacing w:after="120"/>
+      </w:pPr>
+    </w:p>
+    <w:p>
+      <w:pPr>
+        <w:pStyle w:val="Heading3"/>
+        <w:spacing w:before="160" w:after="60"/>
+      </w:pPr>
+      <w:r>
+        <w:rPr>
+          <w:color w:val="4A3F8C"/>
+          <w:sz w:val="24"/>
+        </w:rPr>
+        <w:t>E3 — Tạo skill `diagnosing-bugs.md` — 6-phase disciplined debug loop</w:t>
+      </w:r>
+    </w:p>
+    <w:tbl>
+      <w:tblPr>
+        <w:tblStyle w:val="TableGrid"/>
+        <w:tblW w:type="auto" w:w="0"/>
+        <w:tblLook w:firstColumn="1" w:firstRow="1" w:lastColumn="0" w:lastRow="0" w:noHBand="0" w:noVBand="1" w:val="04A0"/>
+      </w:tblPr>
+      <w:tblGrid>
+        <w:gridCol w:w="4844"/>
+        <w:gridCol w:w="4844"/>
+      </w:tblGrid>
+      <w:tr>
+        <w:tc>
+          <w:tcPr>
+            <w:tcW w:type="dxa" w:w="4844"/>
+            <w:shd w:val="clear" w:color="auto" w:fill="251C53"/>
+            <w:tcBorders>
+              <w:top w:val="single" w:sz="4" w:space="0" w:color="251C53"/>
+              <w:left w:val="single" w:sz="4" w:space="0" w:color="251C53"/>
+              <w:bottom w:val="single" w:sz="4" w:space="0" w:color="251C53"/>
+              <w:right w:val="single" w:sz="4" w:space="0" w:color="251C53"/>
+            </w:tcBorders>
+          </w:tcPr>
+          <w:p>
+            <w:r>
+              <w:rPr>
+                <w:b/>
+                <w:color w:val="FFFFFF"/>
+                <w:sz w:val="20"/>
+              </w:rPr>
+              <w:t>Cột</w:t>
+            </w:r>
+          </w:p>
+        </w:tc>
+        <w:tc>
+          <w:tcPr>
+            <w:tcW w:type="dxa" w:w="4844"/>
+            <w:shd w:val="clear" w:color="auto" w:fill="251C53"/>
+            <w:tcBorders>
+              <w:top w:val="single" w:sz="4" w:space="0" w:color="251C53"/>
+              <w:left w:val="single" w:sz="4" w:space="0" w:color="251C53"/>
+              <w:bottom w:val="single" w:sz="4" w:space="0" w:color="251C53"/>
+              <w:right w:val="single" w:sz="4" w:space="0" w:color="251C53"/>
+            </w:tcBorders>
+          </w:tcPr>
+          <w:p>
+            <w:r>
+              <w:rPr>
+                <w:b/>
+                <w:color w:val="FFFFFF"/>
+                <w:sz w:val="20"/>
+              </w:rPr>
+              <w:t>Nội dung</w:t>
+            </w:r>
+          </w:p>
+        </w:tc>
+      </w:tr>
+      <w:tr>
+        <w:tc>
+          <w:tcPr>
+            <w:tcW w:type="dxa" w:w="4844"/>
+            <w:tcBorders>
+              <w:top w:val="single" w:sz="4" w:space="0" w:color="CBCBCB"/>
+              <w:left w:val="single" w:sz="4" w:space="0" w:color="CBCBCB"/>
+              <w:bottom w:val="single" w:sz="4" w:space="0" w:color="CBCBCB"/>
+              <w:right w:val="single" w:sz="4" w:space="0" w:color="CBCBCB"/>
+            </w:tcBorders>
+          </w:tcPr>
+          <w:p>
+            <w:r>
+              <w:rPr>
+                <w:sz w:val="20"/>
+              </w:rPr>
+              <w:t>-----</w:t>
+            </w:r>
+          </w:p>
+        </w:tc>
+        <w:tc>
+          <w:tcPr>
+            <w:tcW w:type="dxa" w:w="4844"/>
+            <w:tcBorders>
+              <w:top w:val="single" w:sz="4" w:space="0" w:color="CBCBCB"/>
+              <w:left w:val="single" w:sz="4" w:space="0" w:color="CBCBCB"/>
+              <w:bottom w:val="single" w:sz="4" w:space="0" w:color="CBCBCB"/>
+              <w:right w:val="single" w:sz="4" w:space="0" w:color="CBCBCB"/>
+            </w:tcBorders>
+          </w:tcPr>
+          <w:p>
+            <w:r>
+              <w:rPr>
+                <w:sz w:val="20"/>
+              </w:rPr>
+              <w:t>---------</w:t>
+            </w:r>
+          </w:p>
+        </w:tc>
+      </w:tr>
+      <w:tr>
+        <w:tc>
+          <w:tcPr>
+            <w:tcW w:type="dxa" w:w="4844"/>
+            <w:shd w:val="clear" w:color="auto" w:fill="B8B3D6"/>
+            <w:tcBorders>
+              <w:top w:val="single" w:sz="4" w:space="0" w:color="CBCBCB"/>
+              <w:left w:val="single" w:sz="4" w:space="0" w:color="CBCBCB"/>
+              <w:bottom w:val="single" w:sz="4" w:space="0" w:color="CBCBCB"/>
+              <w:right w:val="single" w:sz="4" w:space="0" w:color="CBCBCB"/>
+            </w:tcBorders>
+          </w:tcPr>
+          <w:p>
+            <w:r>
+              <w:rPr>
+                <w:b/>
+                <w:sz w:val="20"/>
+              </w:rPr>
+              <w:t>Học từ đâu</w:t>
+            </w:r>
+          </w:p>
+        </w:tc>
+        <w:tc>
+          <w:tcPr>
+            <w:tcW w:type="dxa" w:w="4844"/>
+            <w:shd w:val="clear" w:color="auto" w:fill="B8B3D6"/>
+            <w:tcBorders>
+              <w:top w:val="single" w:sz="4" w:space="0" w:color="CBCBCB"/>
+              <w:left w:val="single" w:sz="4" w:space="0" w:color="CBCBCB"/>
+              <w:bottom w:val="single" w:sz="4" w:space="0" w:color="CBCBCB"/>
+              <w:right w:val="single" w:sz="4" w:space="0" w:color="CBCBCB"/>
+            </w:tcBorders>
+          </w:tcPr>
+          <w:p>
+            <w:r>
+              <w:rPr>
+                <w:rFonts w:ascii="Courier New" w:hAnsi="Courier New"/>
+                <w:color w:val="F05922"/>
+                <w:sz w:val="20"/>
+              </w:rPr>
+              <w:t>skills/engineering/diagnosing-bugs/SKILL.md</w:t>
+            </w:r>
+            <w:r>
+              <w:rPr>
+                <w:sz w:val="20"/>
+              </w:rPr>
+              <w:t xml:space="preserve"> — 6 phases với completion criteria rõ ràng, đặc biệt Phase 1 "build a feedback loop" là critical path (10 cách build loop, không cho hypothesise khi chưa có tight loop). Keyword: "tight loop that goes red".</w:t>
+            </w:r>
+          </w:p>
+        </w:tc>
+      </w:tr>
+      <w:tr>
+        <w:tc>
+          <w:tcPr>
+            <w:tcW w:type="dxa" w:w="4844"/>
+            <w:tcBorders>
+              <w:top w:val="single" w:sz="4" w:space="0" w:color="CBCBCB"/>
+              <w:left w:val="single" w:sz="4" w:space="0" w:color="CBCBCB"/>
+              <w:bottom w:val="single" w:sz="4" w:space="0" w:color="CBCBCB"/>
+              <w:right w:val="single" w:sz="4" w:space="0" w:color="CBCBCB"/>
+            </w:tcBorders>
+          </w:tcPr>
+          <w:p>
+            <w:r>
+              <w:rPr>
+                <w:b/>
+                <w:sz w:val="20"/>
+              </w:rPr>
+              <w:t>Hiện trạng KZTEK</w:t>
+            </w:r>
+          </w:p>
+        </w:tc>
+        <w:tc>
+          <w:tcPr>
+            <w:tcW w:type="dxa" w:w="4844"/>
+            <w:tcBorders>
+              <w:top w:val="single" w:sz="4" w:space="0" w:color="CBCBCB"/>
+              <w:left w:val="single" w:sz="4" w:space="0" w:color="CBCBCB"/>
+              <w:bottom w:val="single" w:sz="4" w:space="0" w:color="CBCBCB"/>
+              <w:right w:val="single" w:sz="4" w:space="0" w:color="CBCBCB"/>
+            </w:tcBorders>
+          </w:tcPr>
+          <w:p>
+            <w:r>
+              <w:rPr>
+                <w:rFonts w:ascii="Courier New" w:hAnsi="Courier New"/>
+                <w:color w:val="F05922"/>
+                <w:sz w:val="20"/>
+              </w:rPr>
+              <w:t>CLAUDE.md §9a Agent Introspection Debugging</w:t>
+            </w:r>
+            <w:r>
+              <w:rPr>
+                <w:sz w:val="20"/>
+              </w:rPr>
+              <w:t xml:space="preserve"> — xử lý "agent bị stuck/loop" (≥3 retries cùng tool), không phải debugging app/feature. Không có skill nào hướng dẫn Senior Dev / QA Engineer approach bug trong sản phẩm theo discipline. Khi gặp bug khó, agent thường: đọc code → hypothesis ngay → fix thử → sai → đọc lại — không có feedback loop.</w:t>
+            </w:r>
+          </w:p>
+        </w:tc>
+      </w:tr>
+      <w:tr>
+        <w:tc>
+          <w:tcPr>
+            <w:tcW w:type="dxa" w:w="4844"/>
+            <w:shd w:val="clear" w:color="auto" w:fill="B8B3D6"/>
+            <w:tcBorders>
+              <w:top w:val="single" w:sz="4" w:space="0" w:color="CBCBCB"/>
+              <w:left w:val="single" w:sz="4" w:space="0" w:color="CBCBCB"/>
+              <w:bottom w:val="single" w:sz="4" w:space="0" w:color="CBCBCB"/>
+              <w:right w:val="single" w:sz="4" w:space="0" w:color="CBCBCB"/>
+            </w:tcBorders>
+          </w:tcPr>
+          <w:p>
+            <w:r>
+              <w:rPr>
+                <w:b/>
+                <w:sz w:val="20"/>
+              </w:rPr>
+              <w:t>Lý do thay đổi</w:t>
+            </w:r>
+          </w:p>
+        </w:tc>
+        <w:tc>
+          <w:tcPr>
+            <w:tcW w:type="dxa" w:w="4844"/>
+            <w:shd w:val="clear" w:color="auto" w:fill="B8B3D6"/>
+            <w:tcBorders>
+              <w:top w:val="single" w:sz="4" w:space="0" w:color="CBCBCB"/>
+              <w:left w:val="single" w:sz="4" w:space="0" w:color="CBCBCB"/>
+              <w:bottom w:val="single" w:sz="4" w:space="0" w:color="CBCBCB"/>
+              <w:right w:val="single" w:sz="4" w:space="0" w:color="CBCBCB"/>
+            </w:tcBorders>
+          </w:tcPr>
+          <w:p>
+            <w:r>
+              <w:rPr>
+                <w:sz w:val="20"/>
+              </w:rPr>
+              <w:t>§9a xử lý infrastructure problem (agent stuck), không xử lý domain problem (bug trong business logic/UI). Thiếu skill debugging cho sản phẩm → agent hay bỏ qua "build feedback loop first" để hypothesise ngay (lỗi kinh điển), dẫn đến fix sai root cause hoặc mất nhiều vòng thử.</w:t>
+            </w:r>
+          </w:p>
+        </w:tc>
+      </w:tr>
+      <w:tr>
+        <w:tc>
+          <w:tcPr>
+            <w:tcW w:type="dxa" w:w="4844"/>
+            <w:tcBorders>
+              <w:top w:val="single" w:sz="4" w:space="0" w:color="CBCBCB"/>
+              <w:left w:val="single" w:sz="4" w:space="0" w:color="CBCBCB"/>
+              <w:bottom w:val="single" w:sz="4" w:space="0" w:color="CBCBCB"/>
+              <w:right w:val="single" w:sz="4" w:space="0" w:color="CBCBCB"/>
+            </w:tcBorders>
+          </w:tcPr>
+          <w:p>
+            <w:r>
+              <w:rPr>
+                <w:b/>
+                <w:sz w:val="20"/>
+              </w:rPr>
+              <w:t>Áp dụng vào đâu</w:t>
+            </w:r>
+          </w:p>
+        </w:tc>
+        <w:tc>
+          <w:tcPr>
+            <w:tcW w:type="dxa" w:w="4844"/>
+            <w:tcBorders>
+              <w:top w:val="single" w:sz="4" w:space="0" w:color="CBCBCB"/>
+              <w:left w:val="single" w:sz="4" w:space="0" w:color="CBCBCB"/>
+              <w:bottom w:val="single" w:sz="4" w:space="0" w:color="CBCBCB"/>
+              <w:right w:val="single" w:sz="4" w:space="0" w:color="CBCBCB"/>
+            </w:tcBorders>
+          </w:tcPr>
+          <w:p>
+            <w:r>
+              <w:rPr>
+                <w:sz w:val="20"/>
+              </w:rPr>
+              <w:t xml:space="preserve">Tạo mới </w:t>
+            </w:r>
+            <w:r>
+              <w:rPr>
+                <w:rFonts w:ascii="Courier New" w:hAnsi="Courier New"/>
+                <w:color w:val="F05922"/>
+                <w:sz w:val="20"/>
+              </w:rPr>
+              <w:t>.claude/commands/diagnosing-bugs.md</w:t>
+            </w:r>
+            <w:r>
+              <w:rPr>
+                <w:sz w:val="20"/>
+              </w:rPr>
+              <w:t xml:space="preserve"> (model-invoked — agent tự trigger khi thấy user báo bug/exception). Cập nhật </w:t>
+            </w:r>
+            <w:r>
+              <w:rPr>
+                <w:rFonts w:ascii="Courier New" w:hAnsi="Courier New"/>
+                <w:color w:val="F05922"/>
+                <w:sz w:val="20"/>
+              </w:rPr>
+              <w:t>CLAUDE.md §4 WF-BUGFIX</w:t>
+            </w:r>
+            <w:r>
+              <w:rPr>
+                <w:sz w:val="20"/>
+              </w:rPr>
+              <w:t xml:space="preserve"> bước 1 để mention </w:t>
+            </w:r>
+            <w:r>
+              <w:rPr>
+                <w:rFonts w:ascii="Courier New" w:hAnsi="Courier New"/>
+                <w:color w:val="F05922"/>
+                <w:sz w:val="20"/>
+              </w:rPr>
+              <w:t>/diagnosing-bugs</w:t>
+            </w:r>
+            <w:r>
+              <w:rPr>
+                <w:sz w:val="20"/>
+              </w:rPr>
+              <w:t xml:space="preserve"> khi bug khó reproduce. Cập nhật </w:t>
+            </w:r>
+            <w:r>
+              <w:rPr>
+                <w:rFonts w:ascii="Courier New" w:hAnsi="Courier New"/>
+                <w:color w:val="F05922"/>
+                <w:sz w:val="20"/>
+              </w:rPr>
+              <w:t>senior-developer.md</w:t>
+            </w:r>
+            <w:r>
+              <w:rPr>
+                <w:sz w:val="20"/>
+              </w:rPr>
+              <w:t xml:space="preserve"> và </w:t>
+            </w:r>
+            <w:r>
+              <w:rPr>
+                <w:rFonts w:ascii="Courier New" w:hAnsi="Courier New"/>
+                <w:color w:val="F05922"/>
+                <w:sz w:val="20"/>
+              </w:rPr>
+              <w:t>qa-engineer.md</w:t>
+            </w:r>
+            <w:r>
+              <w:rPr>
+                <w:sz w:val="20"/>
+              </w:rPr>
+              <w:t xml:space="preserve"> description để trigger diagnosing-bugs khi gặp hard bug.</w:t>
+            </w:r>
+          </w:p>
+        </w:tc>
+      </w:tr>
+      <w:tr>
+        <w:tc>
+          <w:tcPr>
+            <w:tcW w:type="dxa" w:w="4844"/>
+            <w:shd w:val="clear" w:color="auto" w:fill="B8B3D6"/>
+            <w:tcBorders>
+              <w:top w:val="single" w:sz="4" w:space="0" w:color="CBCBCB"/>
+              <w:left w:val="single" w:sz="4" w:space="0" w:color="CBCBCB"/>
+              <w:bottom w:val="single" w:sz="4" w:space="0" w:color="CBCBCB"/>
+              <w:right w:val="single" w:sz="4" w:space="0" w:color="CBCBCB"/>
+            </w:tcBorders>
+          </w:tcPr>
+          <w:p>
+            <w:r>
+              <w:rPr>
+                <w:b/>
+                <w:sz w:val="20"/>
+              </w:rPr>
+              <w:t>Đạt được gì</w:t>
+            </w:r>
+          </w:p>
+        </w:tc>
+        <w:tc>
+          <w:tcPr>
+            <w:tcW w:type="dxa" w:w="4844"/>
+            <w:shd w:val="clear" w:color="auto" w:fill="B8B3D6"/>
+            <w:tcBorders>
+              <w:top w:val="single" w:sz="4" w:space="0" w:color="CBCBCB"/>
+              <w:left w:val="single" w:sz="4" w:space="0" w:color="CBCBCB"/>
+              <w:bottom w:val="single" w:sz="4" w:space="0" w:color="CBCBCB"/>
+              <w:right w:val="single" w:sz="4" w:space="0" w:color="CBCBCB"/>
+            </w:tcBorders>
+          </w:tcPr>
+          <w:p>
+            <w:r>
+              <w:rPr>
+                <w:sz w:val="20"/>
+              </w:rPr>
+              <w:t>Senior Dev / QA gặp bug khó sẽ không hypothesis ngay mà build feedback loop trước (1 command red-capable). Cụ thể: Phase 1 completion criterion = "paste 1 command + output của nó đang red" — nếu không có thì STOP, không tiến. Giảm "fix sai root cause, phát hiện bởi QA 2 vòng sau".</w:t>
+            </w:r>
+          </w:p>
+        </w:tc>
+      </w:tr>
+      <w:tr>
+        <w:tc>
+          <w:tcPr>
+            <w:tcW w:type="dxa" w:w="4844"/>
+            <w:tcBorders>
+              <w:top w:val="single" w:sz="4" w:space="0" w:color="CBCBCB"/>
+              <w:left w:val="single" w:sz="4" w:space="0" w:color="CBCBCB"/>
+              <w:bottom w:val="single" w:sz="4" w:space="0" w:color="CBCBCB"/>
+              <w:right w:val="single" w:sz="4" w:space="0" w:color="CBCBCB"/>
+            </w:tcBorders>
+          </w:tcPr>
+          <w:p>
+            <w:r>
+              <w:rPr>
+                <w:b/>
+                <w:sz w:val="20"/>
+              </w:rPr>
+              <w:t>Rủi ro/Effort</w:t>
+            </w:r>
+          </w:p>
+        </w:tc>
+        <w:tc>
+          <w:tcPr>
+            <w:tcW w:type="dxa" w:w="4844"/>
+            <w:tcBorders>
+              <w:top w:val="single" w:sz="4" w:space="0" w:color="CBCBCB"/>
+              <w:left w:val="single" w:sz="4" w:space="0" w:color="CBCBCB"/>
+              <w:bottom w:val="single" w:sz="4" w:space="0" w:color="CBCBCB"/>
+              <w:right w:val="single" w:sz="4" w:space="0" w:color="CBCBCB"/>
+            </w:tcBorders>
+          </w:tcPr>
+          <w:p>
+            <w:r>
+              <w:rPr>
+                <w:sz w:val="20"/>
+              </w:rPr>
+              <w:t>Rủi ro: Không có — model-invoked, không thay thế WF-BUGFIX. Effort: 2 giờ — adapt từ mattpocock (6 phases giữ nguyên logic, chỉnh ngôn ngữ + stack context C#/.NET).</w:t>
+            </w:r>
+          </w:p>
+        </w:tc>
+      </w:tr>
+    </w:tbl>
+    <w:p/>
+    <w:p>
+      <w:pPr>
+        <w:pBdr>
+          <w:bottom w:val="single" w:sz="6" w:space="1" w:color="F05922"/>
+        </w:pBdr>
+        <w:spacing w:after="120"/>
+      </w:pPr>
+    </w:p>
+    <w:p>
+      <w:pPr>
+        <w:pStyle w:val="Heading3"/>
+        <w:spacing w:before="160" w:after="60"/>
+      </w:pPr>
+      <w:r>
+        <w:rPr>
+          <w:color w:val="4A3F8C"/>
+          <w:sz w:val="24"/>
+        </w:rPr>
+        <w:t>E4 — Tạo skill `tdd.md` — Red-green-refactor loop</w:t>
+      </w:r>
+    </w:p>
+    <w:tbl>
+      <w:tblPr>
+        <w:tblStyle w:val="TableGrid"/>
+        <w:tblW w:type="auto" w:w="0"/>
+        <w:tblLook w:firstColumn="1" w:firstRow="1" w:lastColumn="0" w:lastRow="0" w:noHBand="0" w:noVBand="1" w:val="04A0"/>
+      </w:tblPr>
+      <w:tblGrid>
+        <w:gridCol w:w="4844"/>
+        <w:gridCol w:w="4844"/>
+      </w:tblGrid>
+      <w:tr>
+        <w:tc>
+          <w:tcPr>
+            <w:tcW w:type="dxa" w:w="4844"/>
+            <w:shd w:val="clear" w:color="auto" w:fill="251C53"/>
+            <w:tcBorders>
+              <w:top w:val="single" w:sz="4" w:space="0" w:color="251C53"/>
+              <w:left w:val="single" w:sz="4" w:space="0" w:color="251C53"/>
+              <w:bottom w:val="single" w:sz="4" w:space="0" w:color="251C53"/>
+              <w:right w:val="single" w:sz="4" w:space="0" w:color="251C53"/>
+            </w:tcBorders>
+          </w:tcPr>
+          <w:p>
+            <w:r>
+              <w:rPr>
+                <w:b/>
+                <w:color w:val="FFFFFF"/>
+                <w:sz w:val="20"/>
+              </w:rPr>
+              <w:t>Cột</w:t>
+            </w:r>
+          </w:p>
+        </w:tc>
+        <w:tc>
+          <w:tcPr>
+            <w:tcW w:type="dxa" w:w="4844"/>
+            <w:shd w:val="clear" w:color="auto" w:fill="251C53"/>
+            <w:tcBorders>
+              <w:top w:val="single" w:sz="4" w:space="0" w:color="251C53"/>
+              <w:left w:val="single" w:sz="4" w:space="0" w:color="251C53"/>
+              <w:bottom w:val="single" w:sz="4" w:space="0" w:color="251C53"/>
+              <w:right w:val="single" w:sz="4" w:space="0" w:color="251C53"/>
+            </w:tcBorders>
+          </w:tcPr>
+          <w:p>
+            <w:r>
+              <w:rPr>
+                <w:b/>
+                <w:color w:val="FFFFFF"/>
+                <w:sz w:val="20"/>
+              </w:rPr>
+              <w:t>Nội dung</w:t>
+            </w:r>
+          </w:p>
+        </w:tc>
+      </w:tr>
+      <w:tr>
+        <w:tc>
+          <w:tcPr>
+            <w:tcW w:type="dxa" w:w="4844"/>
+            <w:tcBorders>
+              <w:top w:val="single" w:sz="4" w:space="0" w:color="CBCBCB"/>
+              <w:left w:val="single" w:sz="4" w:space="0" w:color="CBCBCB"/>
+              <w:bottom w:val="single" w:sz="4" w:space="0" w:color="CBCBCB"/>
+              <w:right w:val="single" w:sz="4" w:space="0" w:color="CBCBCB"/>
+            </w:tcBorders>
+          </w:tcPr>
+          <w:p>
+            <w:r>
+              <w:rPr>
+                <w:sz w:val="20"/>
+              </w:rPr>
+              <w:t>-----</w:t>
+            </w:r>
+          </w:p>
+        </w:tc>
+        <w:tc>
+          <w:tcPr>
+            <w:tcW w:type="dxa" w:w="4844"/>
+            <w:tcBorders>
+              <w:top w:val="single" w:sz="4" w:space="0" w:color="CBCBCB"/>
+              <w:left w:val="single" w:sz="4" w:space="0" w:color="CBCBCB"/>
+              <w:bottom w:val="single" w:sz="4" w:space="0" w:color="CBCBCB"/>
+              <w:right w:val="single" w:sz="4" w:space="0" w:color="CBCBCB"/>
+            </w:tcBorders>
+          </w:tcPr>
+          <w:p>
+            <w:r>
+              <w:rPr>
+                <w:sz w:val="20"/>
+              </w:rPr>
+              <w:t>---------</w:t>
+            </w:r>
+          </w:p>
+        </w:tc>
+      </w:tr>
+      <w:tr>
+        <w:tc>
+          <w:tcPr>
+            <w:tcW w:type="dxa" w:w="4844"/>
+            <w:shd w:val="clear" w:color="auto" w:fill="B8B3D6"/>
+            <w:tcBorders>
+              <w:top w:val="single" w:sz="4" w:space="0" w:color="CBCBCB"/>
+              <w:left w:val="single" w:sz="4" w:space="0" w:color="CBCBCB"/>
+              <w:bottom w:val="single" w:sz="4" w:space="0" w:color="CBCBCB"/>
+              <w:right w:val="single" w:sz="4" w:space="0" w:color="CBCBCB"/>
+            </w:tcBorders>
+          </w:tcPr>
+          <w:p>
+            <w:r>
+              <w:rPr>
+                <w:b/>
+                <w:sz w:val="20"/>
+              </w:rPr>
+              <w:t>Học từ đâu</w:t>
+            </w:r>
+          </w:p>
+        </w:tc>
+        <w:tc>
+          <w:tcPr>
+            <w:tcW w:type="dxa" w:w="4844"/>
+            <w:shd w:val="clear" w:color="auto" w:fill="B8B3D6"/>
+            <w:tcBorders>
+              <w:top w:val="single" w:sz="4" w:space="0" w:color="CBCBCB"/>
+              <w:left w:val="single" w:sz="4" w:space="0" w:color="CBCBCB"/>
+              <w:bottom w:val="single" w:sz="4" w:space="0" w:color="CBCBCB"/>
+              <w:right w:val="single" w:sz="4" w:space="0" w:color="CBCBCB"/>
+            </w:tcBorders>
+          </w:tcPr>
+          <w:p>
+            <w:r>
+              <w:rPr>
+                <w:rFonts w:ascii="Courier New" w:hAnsi="Courier New"/>
+                <w:color w:val="F05922"/>
+                <w:sz w:val="20"/>
+              </w:rPr>
+              <w:t>skills/engineering/tdd/SKILL.md</w:t>
+            </w:r>
+            <w:r>
+              <w:rPr>
+                <w:sz w:val="20"/>
+              </w:rPr>
+              <w:t xml:space="preserve"> — red-green-refactor, seam-based testing, 3 anti-patterns rõ (implementation-coupled, tautological, horizontal slicing), vertical slice model (1 test → 1 implementation → repeat).</w:t>
+            </w:r>
+          </w:p>
+        </w:tc>
+      </w:tr>
+      <w:tr>
+        <w:tc>
+          <w:tcPr>
+            <w:tcW w:type="dxa" w:w="4844"/>
+            <w:tcBorders>
+              <w:top w:val="single" w:sz="4" w:space="0" w:color="CBCBCB"/>
+              <w:left w:val="single" w:sz="4" w:space="0" w:color="CBCBCB"/>
+              <w:bottom w:val="single" w:sz="4" w:space="0" w:color="CBCBCB"/>
+              <w:right w:val="single" w:sz="4" w:space="0" w:color="CBCBCB"/>
+            </w:tcBorders>
+          </w:tcPr>
+          <w:p>
+            <w:r>
+              <w:rPr>
+                <w:b/>
+                <w:sz w:val="20"/>
+              </w:rPr>
+              <w:t>Hiện trạng KZTEK</w:t>
+            </w:r>
+          </w:p>
+        </w:tc>
+        <w:tc>
+          <w:tcPr>
+            <w:tcW w:type="dxa" w:w="4844"/>
+            <w:tcBorders>
+              <w:top w:val="single" w:sz="4" w:space="0" w:color="CBCBCB"/>
+              <w:left w:val="single" w:sz="4" w:space="0" w:color="CBCBCB"/>
+              <w:bottom w:val="single" w:sz="4" w:space="0" w:color="CBCBCB"/>
+              <w:right w:val="single" w:sz="4" w:space="0" w:color="CBCBCB"/>
+            </w:tcBorders>
+          </w:tcPr>
+          <w:p>
+            <w:r>
+              <w:rPr>
+                <w:sz w:val="20"/>
+              </w:rPr>
+              <w:t xml:space="preserve">Không có TDD skill. </w:t>
+            </w:r>
+            <w:r>
+              <w:rPr>
+                <w:rFonts w:ascii="Courier New" w:hAnsi="Courier New"/>
+                <w:color w:val="F05922"/>
+                <w:sz w:val="20"/>
+              </w:rPr>
+              <w:t>verify-pr.md</w:t>
+            </w:r>
+            <w:r>
+              <w:rPr>
+                <w:sz w:val="20"/>
+              </w:rPr>
+              <w:t xml:space="preserve"> chạy test suite nhưng không hướng dẫn process viết test. Senior Dev / Junior Dev hiện không có guidance về "viết test trước hay code trước", không có định nghĩa "seam", không có anti-pattern checklist. </w:t>
+            </w:r>
+            <w:r>
+              <w:rPr>
+                <w:rFonts w:ascii="Courier New" w:hAnsi="Courier New"/>
+                <w:color w:val="F05922"/>
+                <w:sz w:val="20"/>
+              </w:rPr>
+              <w:t>CLAUDE.md §4 WF-FEATURE Bước 8-9</w:t>
+            </w:r>
+            <w:r>
+              <w:rPr>
+                <w:sz w:val="20"/>
+              </w:rPr>
+              <w:t xml:space="preserve"> chỉ nói "viết unit test" không nói cách tiếp cận.</w:t>
+            </w:r>
+          </w:p>
+        </w:tc>
+      </w:tr>
+      <w:tr>
+        <w:tc>
+          <w:tcPr>
+            <w:tcW w:type="dxa" w:w="4844"/>
+            <w:shd w:val="clear" w:color="auto" w:fill="B8B3D6"/>
+            <w:tcBorders>
+              <w:top w:val="single" w:sz="4" w:space="0" w:color="CBCBCB"/>
+              <w:left w:val="single" w:sz="4" w:space="0" w:color="CBCBCB"/>
+              <w:bottom w:val="single" w:sz="4" w:space="0" w:color="CBCBCB"/>
+              <w:right w:val="single" w:sz="4" w:space="0" w:color="CBCBCB"/>
+            </w:tcBorders>
+          </w:tcPr>
+          <w:p>
+            <w:r>
+              <w:rPr>
+                <w:b/>
+                <w:sz w:val="20"/>
+              </w:rPr>
+              <w:t>Lý do thay đổi</w:t>
+            </w:r>
+          </w:p>
+        </w:tc>
+        <w:tc>
+          <w:tcPr>
+            <w:tcW w:type="dxa" w:w="4844"/>
+            <w:shd w:val="clear" w:color="auto" w:fill="B8B3D6"/>
+            <w:tcBorders>
+              <w:top w:val="single" w:sz="4" w:space="0" w:color="CBCBCB"/>
+              <w:left w:val="single" w:sz="4" w:space="0" w:color="CBCBCB"/>
+              <w:bottom w:val="single" w:sz="4" w:space="0" w:color="CBCBCB"/>
+              <w:right w:val="single" w:sz="4" w:space="0" w:color="CBCBCB"/>
+            </w:tcBorders>
+          </w:tcPr>
+          <w:p>
+            <w:r>
+              <w:rPr>
+                <w:sz w:val="20"/>
+              </w:rPr>
+              <w:t>Không có TDD guidance → developers mặc định viết code trước, test sau (nếu có). Hệ quả đo được: tests thường implementation-coupled (break khi refactor dù behavior không đổi), test coverage thấp cho business logic phức tạp, QA Engineer phải catch nhiều hơn.</w:t>
+            </w:r>
+          </w:p>
+        </w:tc>
+      </w:tr>
+      <w:tr>
+        <w:tc>
+          <w:tcPr>
+            <w:tcW w:type="dxa" w:w="4844"/>
+            <w:tcBorders>
+              <w:top w:val="single" w:sz="4" w:space="0" w:color="CBCBCB"/>
+              <w:left w:val="single" w:sz="4" w:space="0" w:color="CBCBCB"/>
+              <w:bottom w:val="single" w:sz="4" w:space="0" w:color="CBCBCB"/>
+              <w:right w:val="single" w:sz="4" w:space="0" w:color="CBCBCB"/>
+            </w:tcBorders>
+          </w:tcPr>
+          <w:p>
+            <w:r>
+              <w:rPr>
+                <w:b/>
+                <w:sz w:val="20"/>
+              </w:rPr>
+              <w:t>Áp dụng vào đâu</w:t>
+            </w:r>
+          </w:p>
+        </w:tc>
+        <w:tc>
+          <w:tcPr>
+            <w:tcW w:type="dxa" w:w="4844"/>
+            <w:tcBorders>
+              <w:top w:val="single" w:sz="4" w:space="0" w:color="CBCBCB"/>
+              <w:left w:val="single" w:sz="4" w:space="0" w:color="CBCBCB"/>
+              <w:bottom w:val="single" w:sz="4" w:space="0" w:color="CBCBCB"/>
+              <w:right w:val="single" w:sz="4" w:space="0" w:color="CBCBCB"/>
+            </w:tcBorders>
+          </w:tcPr>
+          <w:p>
+            <w:r>
+              <w:rPr>
+                <w:sz w:val="20"/>
+              </w:rPr>
+              <w:t xml:space="preserve">Tạo mới </w:t>
+            </w:r>
+            <w:r>
+              <w:rPr>
+                <w:rFonts w:ascii="Courier New" w:hAnsi="Courier New"/>
+                <w:color w:val="F05922"/>
+                <w:sz w:val="20"/>
+              </w:rPr>
+              <w:t>.claude/commands/tdd.md</w:t>
+            </w:r>
+            <w:r>
+              <w:rPr>
+                <w:sz w:val="20"/>
+              </w:rPr>
+              <w:t xml:space="preserve"> (model-invoked — agent tự trigger khi user muốn build feature test-first hoặc fix bug với regression test). Cập nhật </w:t>
+            </w:r>
+            <w:r>
+              <w:rPr>
+                <w:rFonts w:ascii="Courier New" w:hAnsi="Courier New"/>
+                <w:color w:val="F05922"/>
+                <w:sz w:val="20"/>
+              </w:rPr>
+              <w:t>WF-FEATURE Bước 8-9</w:t>
+            </w:r>
+            <w:r>
+              <w:rPr>
+                <w:sz w:val="20"/>
+              </w:rPr>
+              <w:t xml:space="preserve"> trong </w:t>
+            </w:r>
+            <w:r>
+              <w:rPr>
+                <w:rFonts w:ascii="Courier New" w:hAnsi="Courier New"/>
+                <w:color w:val="F05922"/>
+                <w:sz w:val="20"/>
+              </w:rPr>
+              <w:t>CLAUDE.md §4</w:t>
+            </w:r>
+            <w:r>
+              <w:rPr>
+                <w:sz w:val="20"/>
+              </w:rPr>
+              <w:t xml:space="preserve"> để Senior/Junior Dev PHẢI dùng </w:t>
+            </w:r>
+            <w:r>
+              <w:rPr>
+                <w:rFonts w:ascii="Courier New" w:hAnsi="Courier New"/>
+                <w:color w:val="F05922"/>
+                <w:sz w:val="20"/>
+              </w:rPr>
+              <w:t>/tdd</w:t>
+            </w:r>
+            <w:r>
+              <w:rPr>
+                <w:sz w:val="20"/>
+              </w:rPr>
+              <w:t xml:space="preserve"> cho các phần logic phức tạp. Cập nhật </w:t>
+            </w:r>
+            <w:r>
+              <w:rPr>
+                <w:rFonts w:ascii="Courier New" w:hAnsi="Courier New"/>
+                <w:color w:val="F05922"/>
+                <w:sz w:val="20"/>
+              </w:rPr>
+              <w:t>senior-developer.md</w:t>
+            </w:r>
+            <w:r>
+              <w:rPr>
+                <w:sz w:val="20"/>
+              </w:rPr>
+              <w:t xml:space="preserve"> và </w:t>
+            </w:r>
+            <w:r>
+              <w:rPr>
+                <w:rFonts w:ascii="Courier New" w:hAnsi="Courier New"/>
+                <w:color w:val="F05922"/>
+                <w:sz w:val="20"/>
+              </w:rPr>
+              <w:t>junior-developer.md</w:t>
+            </w:r>
+            <w:r>
+              <w:rPr>
+                <w:sz w:val="20"/>
+              </w:rPr>
+              <w:t xml:space="preserve"> để mention tdd.</w:t>
+            </w:r>
+          </w:p>
+        </w:tc>
+      </w:tr>
+      <w:tr>
+        <w:tc>
+          <w:tcPr>
+            <w:tcW w:type="dxa" w:w="4844"/>
+            <w:shd w:val="clear" w:color="auto" w:fill="B8B3D6"/>
+            <w:tcBorders>
+              <w:top w:val="single" w:sz="4" w:space="0" w:color="CBCBCB"/>
+              <w:left w:val="single" w:sz="4" w:space="0" w:color="CBCBCB"/>
+              <w:bottom w:val="single" w:sz="4" w:space="0" w:color="CBCBCB"/>
+              <w:right w:val="single" w:sz="4" w:space="0" w:color="CBCBCB"/>
+            </w:tcBorders>
+          </w:tcPr>
+          <w:p>
+            <w:r>
+              <w:rPr>
+                <w:b/>
+                <w:sz w:val="20"/>
+              </w:rPr>
+              <w:t>Đạt được gì</w:t>
+            </w:r>
+          </w:p>
+        </w:tc>
+        <w:tc>
+          <w:tcPr>
+            <w:tcW w:type="dxa" w:w="4844"/>
+            <w:shd w:val="clear" w:color="auto" w:fill="B8B3D6"/>
+            <w:tcBorders>
+              <w:top w:val="single" w:sz="4" w:space="0" w:color="CBCBCB"/>
+              <w:left w:val="single" w:sz="4" w:space="0" w:color="CBCBCB"/>
+              <w:bottom w:val="single" w:sz="4" w:space="0" w:color="CBCBCB"/>
+              <w:right w:val="single" w:sz="4" w:space="0" w:color="CBCBCB"/>
+            </w:tcBorders>
+          </w:tcPr>
+          <w:p>
+            <w:r>
+              <w:rPr>
+                <w:sz w:val="20"/>
+              </w:rPr>
+              <w:t>Developer có framework rõ ràng: seam trước, test đỏ trước, code tối thiểu để pass. Anti-pattern checklist trong skill ngăn viết test tautological hoặc test implementation. Verify-pr.md bước 3 (test check) từ chỗ "test pass/fail" → chỗ "test đúng seam, không implementation-coupled".</w:t>
+            </w:r>
+          </w:p>
+        </w:tc>
+      </w:tr>
+      <w:tr>
+        <w:tc>
+          <w:tcPr>
+            <w:tcW w:type="dxa" w:w="4844"/>
+            <w:tcBorders>
+              <w:top w:val="single" w:sz="4" w:space="0" w:color="CBCBCB"/>
+              <w:left w:val="single" w:sz="4" w:space="0" w:color="CBCBCB"/>
+              <w:bottom w:val="single" w:sz="4" w:space="0" w:color="CBCBCB"/>
+              <w:right w:val="single" w:sz="4" w:space="0" w:color="CBCBCB"/>
+            </w:tcBorders>
+          </w:tcPr>
+          <w:p>
+            <w:r>
+              <w:rPr>
+                <w:b/>
+                <w:sz w:val="20"/>
+              </w:rPr>
+              <w:t>Rủi ro/Effort</w:t>
+            </w:r>
+          </w:p>
+        </w:tc>
+        <w:tc>
+          <w:tcPr>
+            <w:tcW w:type="dxa" w:w="4844"/>
+            <w:tcBorders>
+              <w:top w:val="single" w:sz="4" w:space="0" w:color="CBCBCB"/>
+              <w:left w:val="single" w:sz="4" w:space="0" w:color="CBCBCB"/>
+              <w:bottom w:val="single" w:sz="4" w:space="0" w:color="CBCBCB"/>
+              <w:right w:val="single" w:sz="4" w:space="0" w:color="CBCBCB"/>
+            </w:tcBorders>
+          </w:tcPr>
+          <w:p>
+            <w:r>
+              <w:rPr>
+                <w:sz w:val="20"/>
+              </w:rPr>
+              <w:t>Rủi ro: Thấp — model-invoked, opt-in. Effort: 2–3 giờ — adapt từ mattpocock, điều chỉnh cho C#/xUnit context (thay TypeScript examples).</w:t>
+            </w:r>
+          </w:p>
+        </w:tc>
+      </w:tr>
+    </w:tbl>
+    <w:p/>
+    <w:p>
+      <w:pPr>
+        <w:pBdr>
+          <w:bottom w:val="single" w:sz="6" w:space="1" w:color="F05922"/>
+        </w:pBdr>
+        <w:spacing w:after="120"/>
+      </w:pPr>
+    </w:p>
+    <w:p>
+      <w:pPr>
+        <w:pStyle w:val="Heading3"/>
+        <w:spacing w:before="160" w:after="60"/>
+      </w:pPr>
+      <w:r>
+        <w:rPr>
+          <w:color w:val="4A3F8C"/>
+          <w:sz w:val="24"/>
+        </w:rPr>
+        <w:t>E5 — Tạo skill `code-review.md` — 2-axis parallel sub-agents (Standards + Spec)</w:t>
+      </w:r>
+    </w:p>
+    <w:tbl>
+      <w:tblPr>
+        <w:tblStyle w:val="TableGrid"/>
+        <w:tblW w:type="auto" w:w="0"/>
+        <w:tblLook w:firstColumn="1" w:firstRow="1" w:lastColumn="0" w:lastRow="0" w:noHBand="0" w:noVBand="1" w:val="04A0"/>
+      </w:tblPr>
+      <w:tblGrid>
+        <w:gridCol w:w="4844"/>
+        <w:gridCol w:w="4844"/>
+      </w:tblGrid>
+      <w:tr>
+        <w:tc>
+          <w:tcPr>
+            <w:tcW w:type="dxa" w:w="4844"/>
+            <w:shd w:val="clear" w:color="auto" w:fill="251C53"/>
+            <w:tcBorders>
+              <w:top w:val="single" w:sz="4" w:space="0" w:color="251C53"/>
+              <w:left w:val="single" w:sz="4" w:space="0" w:color="251C53"/>
+              <w:bottom w:val="single" w:sz="4" w:space="0" w:color="251C53"/>
+              <w:right w:val="single" w:sz="4" w:space="0" w:color="251C53"/>
+            </w:tcBorders>
+          </w:tcPr>
+          <w:p>
+            <w:r>
+              <w:rPr>
+                <w:b/>
+                <w:color w:val="FFFFFF"/>
+                <w:sz w:val="20"/>
+              </w:rPr>
+              <w:t>Cột</w:t>
+            </w:r>
+          </w:p>
+        </w:tc>
+        <w:tc>
+          <w:tcPr>
+            <w:tcW w:type="dxa" w:w="4844"/>
+            <w:shd w:val="clear" w:color="auto" w:fill="251C53"/>
+            <w:tcBorders>
+              <w:top w:val="single" w:sz="4" w:space="0" w:color="251C53"/>
+              <w:left w:val="single" w:sz="4" w:space="0" w:color="251C53"/>
+              <w:bottom w:val="single" w:sz="4" w:space="0" w:color="251C53"/>
+              <w:right w:val="single" w:sz="4" w:space="0" w:color="251C53"/>
+            </w:tcBorders>
+          </w:tcPr>
+          <w:p>
+            <w:r>
+              <w:rPr>
+                <w:b/>
+                <w:color w:val="FFFFFF"/>
+                <w:sz w:val="20"/>
+              </w:rPr>
+              <w:t>Nội dung</w:t>
+            </w:r>
+          </w:p>
+        </w:tc>
+      </w:tr>
+      <w:tr>
+        <w:tc>
+          <w:tcPr>
+            <w:tcW w:type="dxa" w:w="4844"/>
+            <w:tcBorders>
+              <w:top w:val="single" w:sz="4" w:space="0" w:color="CBCBCB"/>
+              <w:left w:val="single" w:sz="4" w:space="0" w:color="CBCBCB"/>
+              <w:bottom w:val="single" w:sz="4" w:space="0" w:color="CBCBCB"/>
+              <w:right w:val="single" w:sz="4" w:space="0" w:color="CBCBCB"/>
+            </w:tcBorders>
+          </w:tcPr>
+          <w:p>
+            <w:r>
+              <w:rPr>
+                <w:sz w:val="20"/>
+              </w:rPr>
+              <w:t>-----</w:t>
+            </w:r>
+          </w:p>
+        </w:tc>
+        <w:tc>
+          <w:tcPr>
+            <w:tcW w:type="dxa" w:w="4844"/>
+            <w:tcBorders>
+              <w:top w:val="single" w:sz="4" w:space="0" w:color="CBCBCB"/>
+              <w:left w:val="single" w:sz="4" w:space="0" w:color="CBCBCB"/>
+              <w:bottom w:val="single" w:sz="4" w:space="0" w:color="CBCBCB"/>
+              <w:right w:val="single" w:sz="4" w:space="0" w:color="CBCBCB"/>
+            </w:tcBorders>
+          </w:tcPr>
+          <w:p>
+            <w:r>
+              <w:rPr>
+                <w:sz w:val="20"/>
+              </w:rPr>
+              <w:t>---------</w:t>
+            </w:r>
+          </w:p>
+        </w:tc>
+      </w:tr>
+      <w:tr>
+        <w:tc>
+          <w:tcPr>
+            <w:tcW w:type="dxa" w:w="4844"/>
+            <w:shd w:val="clear" w:color="auto" w:fill="B8B3D6"/>
+            <w:tcBorders>
+              <w:top w:val="single" w:sz="4" w:space="0" w:color="CBCBCB"/>
+              <w:left w:val="single" w:sz="4" w:space="0" w:color="CBCBCB"/>
+              <w:bottom w:val="single" w:sz="4" w:space="0" w:color="CBCBCB"/>
+              <w:right w:val="single" w:sz="4" w:space="0" w:color="CBCBCB"/>
+            </w:tcBorders>
+          </w:tcPr>
+          <w:p>
+            <w:r>
+              <w:rPr>
+                <w:b/>
+                <w:sz w:val="20"/>
+              </w:rPr>
+              <w:t>Học từ đâu</w:t>
+            </w:r>
+          </w:p>
+        </w:tc>
+        <w:tc>
+          <w:tcPr>
+            <w:tcW w:type="dxa" w:w="4844"/>
+            <w:shd w:val="clear" w:color="auto" w:fill="B8B3D6"/>
+            <w:tcBorders>
+              <w:top w:val="single" w:sz="4" w:space="0" w:color="CBCBCB"/>
+              <w:left w:val="single" w:sz="4" w:space="0" w:color="CBCBCB"/>
+              <w:bottom w:val="single" w:sz="4" w:space="0" w:color="CBCBCB"/>
+              <w:right w:val="single" w:sz="4" w:space="0" w:color="CBCBCB"/>
+            </w:tcBorders>
+          </w:tcPr>
+          <w:p>
+            <w:r>
+              <w:rPr>
+                <w:rFonts w:ascii="Courier New" w:hAnsi="Courier New"/>
+                <w:color w:val="F05922"/>
+                <w:sz w:val="20"/>
+              </w:rPr>
+              <w:t>skills/engineering/code-review/SKILL.md</w:t>
+            </w:r>
+            <w:r>
+              <w:rPr>
+                <w:sz w:val="20"/>
+              </w:rPr>
+              <w:t xml:space="preserve"> — 2 trục hoàn toàn độc lập, chạy song song (parallel sub-agents): (1) Standards: documented coding standards + Fowler smell baseline (12 smells); (2) Spec: faithful implementation của originating issue/spec. Merge chỉ ở output, không ở context.</w:t>
+            </w:r>
+          </w:p>
+        </w:tc>
+      </w:tr>
+      <w:tr>
+        <w:tc>
+          <w:tcPr>
+            <w:tcW w:type="dxa" w:w="4844"/>
+            <w:tcBorders>
+              <w:top w:val="single" w:sz="4" w:space="0" w:color="CBCBCB"/>
+              <w:left w:val="single" w:sz="4" w:space="0" w:color="CBCBCB"/>
+              <w:bottom w:val="single" w:sz="4" w:space="0" w:color="CBCBCB"/>
+              <w:right w:val="single" w:sz="4" w:space="0" w:color="CBCBCB"/>
+            </w:tcBorders>
+          </w:tcPr>
+          <w:p>
+            <w:r>
+              <w:rPr>
+                <w:b/>
+                <w:sz w:val="20"/>
+              </w:rPr>
+              <w:t>Hiện trạng KZTEK</w:t>
+            </w:r>
+          </w:p>
+        </w:tc>
+        <w:tc>
+          <w:tcPr>
+            <w:tcW w:type="dxa" w:w="4844"/>
+            <w:tcBorders>
+              <w:top w:val="single" w:sz="4" w:space="0" w:color="CBCBCB"/>
+              <w:left w:val="single" w:sz="4" w:space="0" w:color="CBCBCB"/>
+              <w:bottom w:val="single" w:sz="4" w:space="0" w:color="CBCBCB"/>
+              <w:right w:val="single" w:sz="4" w:space="0" w:color="CBCBCB"/>
+            </w:tcBorders>
+          </w:tcPr>
+          <w:p>
+            <w:r>
+              <w:rPr>
+                <w:rFonts w:ascii="Courier New" w:hAnsi="Courier New"/>
+                <w:color w:val="F05922"/>
+                <w:sz w:val="20"/>
+              </w:rPr>
+              <w:t>verify-pr.md</w:t>
+            </w:r>
+            <w:r>
+              <w:rPr>
+                <w:sz w:val="20"/>
+              </w:rPr>
+              <w:t xml:space="preserve"> — automated self-check (build, lint, test, security, diff). Đây là pre-PR checklist của Developer, không phải code review. </w:t>
+            </w:r>
+            <w:r>
+              <w:rPr>
+                <w:rFonts w:ascii="Courier New" w:hAnsi="Courier New"/>
+                <w:color w:val="F05922"/>
+                <w:sz w:val="20"/>
+              </w:rPr>
+              <w:t>CLAUDE.md §4 WF-FEATURE Bước 10</w:t>
+            </w:r>
+            <w:r>
+              <w:rPr>
+                <w:sz w:val="20"/>
+              </w:rPr>
+              <w:t xml:space="preserve"> nói "Tech Lead code review" nhưng không có skill/format nào hướng dẫn review theo chiều nào, check gì. Tech Lead review hiện dựa vào judgment cá nhân — không có checklist, không có format, không đảm bảo cả 2 trục đều được check.</w:t>
+            </w:r>
+          </w:p>
+        </w:tc>
+      </w:tr>
+      <w:tr>
+        <w:tc>
+          <w:tcPr>
+            <w:tcW w:type="dxa" w:w="4844"/>
+            <w:shd w:val="clear" w:color="auto" w:fill="B8B3D6"/>
+            <w:tcBorders>
+              <w:top w:val="single" w:sz="4" w:space="0" w:color="CBCBCB"/>
+              <w:left w:val="single" w:sz="4" w:space="0" w:color="CBCBCB"/>
+              <w:bottom w:val="single" w:sz="4" w:space="0" w:color="CBCBCB"/>
+              <w:right w:val="single" w:sz="4" w:space="0" w:color="CBCBCB"/>
+            </w:tcBorders>
+          </w:tcPr>
+          <w:p>
+            <w:r>
+              <w:rPr>
+                <w:b/>
+                <w:sz w:val="20"/>
+              </w:rPr>
+              <w:t>Lý do thay đổi</w:t>
+            </w:r>
+          </w:p>
+        </w:tc>
+        <w:tc>
+          <w:tcPr>
+            <w:tcW w:type="dxa" w:w="4844"/>
+            <w:shd w:val="clear" w:color="auto" w:fill="B8B3D6"/>
+            <w:tcBorders>
+              <w:top w:val="single" w:sz="4" w:space="0" w:color="CBCBCB"/>
+              <w:left w:val="single" w:sz="4" w:space="0" w:color="CBCBCB"/>
+              <w:bottom w:val="single" w:sz="4" w:space="0" w:color="CBCBCB"/>
+              <w:right w:val="single" w:sz="4" w:space="0" w:color="CBCBCB"/>
+            </w:tcBorders>
+          </w:tcPr>
+          <w:p>
+            <w:r>
+              <w:rPr>
+                <w:sz w:val="20"/>
+              </w:rPr>
+              <w:t>Tech Lead review "tự do" → dễ focus 1 chiều (thường Standards) và bỏ qua Spec chiều (code đúng convention nhưng thiếu AC). Hoặc ngược lại: check spec kỹ nhưng miss code smell. 2 trục riêng biệt + parallel context đảm bảo cả 2 được check độc lập, không bias lẫn nhau. Fowler smell baseline là safety net khi repo chưa có documented standards.</w:t>
+            </w:r>
+          </w:p>
+        </w:tc>
+      </w:tr>
+      <w:tr>
+        <w:tc>
+          <w:tcPr>
+            <w:tcW w:type="dxa" w:w="4844"/>
+            <w:tcBorders>
+              <w:top w:val="single" w:sz="4" w:space="0" w:color="CBCBCB"/>
+              <w:left w:val="single" w:sz="4" w:space="0" w:color="CBCBCB"/>
+              <w:bottom w:val="single" w:sz="4" w:space="0" w:color="CBCBCB"/>
+              <w:right w:val="single" w:sz="4" w:space="0" w:color="CBCBCB"/>
+            </w:tcBorders>
+          </w:tcPr>
+          <w:p>
+            <w:r>
+              <w:rPr>
+                <w:b/>
+                <w:sz w:val="20"/>
+              </w:rPr>
+              <w:t>Áp dụng vào đâu</w:t>
+            </w:r>
+          </w:p>
+        </w:tc>
+        <w:tc>
+          <w:tcPr>
+            <w:tcW w:type="dxa" w:w="4844"/>
+            <w:tcBorders>
+              <w:top w:val="single" w:sz="4" w:space="0" w:color="CBCBCB"/>
+              <w:left w:val="single" w:sz="4" w:space="0" w:color="CBCBCB"/>
+              <w:bottom w:val="single" w:sz="4" w:space="0" w:color="CBCBCB"/>
+              <w:right w:val="single" w:sz="4" w:space="0" w:color="CBCBCB"/>
+            </w:tcBorders>
+          </w:tcPr>
+          <w:p>
+            <w:r>
+              <w:rPr>
+                <w:sz w:val="20"/>
+              </w:rPr>
+              <w:t xml:space="preserve">Tạo mới </w:t>
+            </w:r>
+            <w:r>
+              <w:rPr>
+                <w:rFonts w:ascii="Courier New" w:hAnsi="Courier New"/>
+                <w:color w:val="F05922"/>
+                <w:sz w:val="20"/>
+              </w:rPr>
+              <w:t>.claude/commands/code-review.md</w:t>
+            </w:r>
+            <w:r>
+              <w:rPr>
+                <w:sz w:val="20"/>
+              </w:rPr>
+              <w:t xml:space="preserve"> (model-invoked). Cập nhật </w:t>
+            </w:r>
+            <w:r>
+              <w:rPr>
+                <w:rFonts w:ascii="Courier New" w:hAnsi="Courier New"/>
+                <w:color w:val="F05922"/>
+                <w:sz w:val="20"/>
+              </w:rPr>
+              <w:t>CLAUDE.md §4 WF-FEATURE Bước 10</w:t>
+            </w:r>
+            <w:r>
+              <w:rPr>
+                <w:sz w:val="20"/>
+              </w:rPr>
+              <w:t xml:space="preserve"> và </w:t>
+            </w:r>
+            <w:r>
+              <w:rPr>
+                <w:rFonts w:ascii="Courier New" w:hAnsi="Courier New"/>
+                <w:color w:val="F05922"/>
+                <w:sz w:val="20"/>
+              </w:rPr>
+              <w:t>WF-BUGFIX Bước 3</w:t>
+            </w:r>
+            <w:r>
+              <w:rPr>
+                <w:sz w:val="20"/>
+              </w:rPr>
+              <w:t xml:space="preserve">, </w:t>
+            </w:r>
+            <w:r>
+              <w:rPr>
+                <w:rFonts w:ascii="Courier New" w:hAnsi="Courier New"/>
+                <w:color w:val="F05922"/>
+                <w:sz w:val="20"/>
+              </w:rPr>
+              <w:t>WF-REVIEW-STD</w:t>
+            </w:r>
+            <w:r>
+              <w:rPr>
+                <w:sz w:val="20"/>
+              </w:rPr>
+              <w:t xml:space="preserve">, </w:t>
+            </w:r>
+            <w:r>
+              <w:rPr>
+                <w:rFonts w:ascii="Courier New" w:hAnsi="Courier New"/>
+                <w:color w:val="F05922"/>
+                <w:sz w:val="20"/>
+              </w:rPr>
+              <w:t>WF-REVIEW-CRIT</w:t>
+            </w:r>
+            <w:r>
+              <w:rPr>
+                <w:sz w:val="20"/>
+              </w:rPr>
+              <w:t xml:space="preserve"> để Tech Lead chạy </w:t>
+            </w:r>
+            <w:r>
+              <w:rPr>
+                <w:rFonts w:ascii="Courier New" w:hAnsi="Courier New"/>
+                <w:color w:val="F05922"/>
+                <w:sz w:val="20"/>
+              </w:rPr>
+              <w:t>/code-review</w:t>
+            </w:r>
+            <w:r>
+              <w:rPr>
+                <w:sz w:val="20"/>
+              </w:rPr>
+              <w:t xml:space="preserve"> thay vì review "tự do". Cập nhật </w:t>
+            </w:r>
+            <w:r>
+              <w:rPr>
+                <w:rFonts w:ascii="Courier New" w:hAnsi="Courier New"/>
+                <w:color w:val="F05922"/>
+                <w:sz w:val="20"/>
+              </w:rPr>
+              <w:t>tech-lead.md</w:t>
+            </w:r>
+            <w:r>
+              <w:rPr>
+                <w:sz w:val="20"/>
+              </w:rPr>
+              <w:t xml:space="preserve"> agent để mention skill này.</w:t>
+            </w:r>
+          </w:p>
+        </w:tc>
+      </w:tr>
+      <w:tr>
+        <w:tc>
+          <w:tcPr>
+            <w:tcW w:type="dxa" w:w="4844"/>
+            <w:shd w:val="clear" w:color="auto" w:fill="B8B3D6"/>
+            <w:tcBorders>
+              <w:top w:val="single" w:sz="4" w:space="0" w:color="CBCBCB"/>
+              <w:left w:val="single" w:sz="4" w:space="0" w:color="CBCBCB"/>
+              <w:bottom w:val="single" w:sz="4" w:space="0" w:color="CBCBCB"/>
+              <w:right w:val="single" w:sz="4" w:space="0" w:color="CBCBCB"/>
+            </w:tcBorders>
+          </w:tcPr>
+          <w:p>
+            <w:r>
+              <w:rPr>
+                <w:b/>
+                <w:sz w:val="20"/>
+              </w:rPr>
+              <w:t>Đạt được gì</w:t>
+            </w:r>
+          </w:p>
+        </w:tc>
+        <w:tc>
+          <w:tcPr>
+            <w:tcW w:type="dxa" w:w="4844"/>
+            <w:shd w:val="clear" w:color="auto" w:fill="B8B3D6"/>
+            <w:tcBorders>
+              <w:top w:val="single" w:sz="4" w:space="0" w:color="CBCBCB"/>
+              <w:left w:val="single" w:sz="4" w:space="0" w:color="CBCBCB"/>
+              <w:bottom w:val="single" w:sz="4" w:space="0" w:color="CBCBCB"/>
+              <w:right w:val="single" w:sz="4" w:space="0" w:color="CBCBCB"/>
+            </w:tcBorders>
+          </w:tcPr>
+          <w:p>
+            <w:r>
+              <w:rPr>
+                <w:sz w:val="20"/>
+              </w:rPr>
+              <w:t>Mỗi PR được review theo 2 trục rõ ràng: Tech Lead có output riêng biệt cho Standards vs Spec, không bỏ sót. Fowler smell baseline là backstop tối thiểu dù project chưa có CODING_STANDARDS.md. Format chuẩn giúp Developer hiểu lý do change request (Standards? Spec?).</w:t>
+            </w:r>
+          </w:p>
+        </w:tc>
+      </w:tr>
+      <w:tr>
+        <w:tc>
+          <w:tcPr>
+            <w:tcW w:type="dxa" w:w="4844"/>
+            <w:tcBorders>
+              <w:top w:val="single" w:sz="4" w:space="0" w:color="CBCBCB"/>
+              <w:left w:val="single" w:sz="4" w:space="0" w:color="CBCBCB"/>
+              <w:bottom w:val="single" w:sz="4" w:space="0" w:color="CBCBCB"/>
+              <w:right w:val="single" w:sz="4" w:space="0" w:color="CBCBCB"/>
+            </w:tcBorders>
+          </w:tcPr>
+          <w:p>
+            <w:r>
+              <w:rPr>
+                <w:b/>
+                <w:sz w:val="20"/>
+              </w:rPr>
+              <w:t>Rủi ro/Effort</w:t>
+            </w:r>
+          </w:p>
+        </w:tc>
+        <w:tc>
+          <w:tcPr>
+            <w:tcW w:type="dxa" w:w="4844"/>
+            <w:tcBorders>
+              <w:top w:val="single" w:sz="4" w:space="0" w:color="CBCBCB"/>
+              <w:left w:val="single" w:sz="4" w:space="0" w:color="CBCBCB"/>
+              <w:bottom w:val="single" w:sz="4" w:space="0" w:color="CBCBCB"/>
+              <w:right w:val="single" w:sz="4" w:space="0" w:color="CBCBCB"/>
+            </w:tcBorders>
+          </w:tcPr>
+          <w:p>
+            <w:r>
+              <w:rPr>
+                <w:sz w:val="20"/>
+              </w:rPr>
+              <w:t>Rủi ro: Trung bình — cần đảm bảo parallel sub-agents có đủ context (diff + standards sources + spec). Nếu project không có spec/issue rõ → Spec trục chạy degraded. Effort: 3–4 giờ — adapt từ mattpocock, thêm context cho C# stack, viết Fowler smell baseline tiếng Việt nếu cần.</w:t>
+            </w:r>
+          </w:p>
+        </w:tc>
+      </w:tr>
+    </w:tbl>
+    <w:p/>
+    <w:p>
+      <w:pPr>
+        <w:pBdr>
+          <w:bottom w:val="single" w:sz="6" w:space="1" w:color="F05922"/>
+        </w:pBdr>
+        <w:spacing w:after="120"/>
+      </w:pPr>
+    </w:p>
+    <w:p>
+      <w:pPr>
+        <w:pStyle w:val="Heading3"/>
+        <w:spacing w:before="160" w:after="60"/>
+      </w:pPr>
+      <w:r>
+        <w:rPr>
+          <w:color w:val="4A3F8C"/>
+          <w:sz w:val="24"/>
+        </w:rPr>
+        <w:t>Tóm tắt nhanh 5 đề xuất</w:t>
+      </w:r>
+    </w:p>
+    <w:tbl>
+      <w:tblPr>
+        <w:tblStyle w:val="TableGrid"/>
+        <w:tblW w:type="auto" w:w="0"/>
+        <w:tblLook w:firstColumn="1" w:firstRow="1" w:lastColumn="0" w:lastRow="0" w:noHBand="0" w:noVBand="1" w:val="04A0"/>
+      </w:tblPr>
+      <w:tblGrid>
+        <w:gridCol w:w="1938"/>
+        <w:gridCol w:w="1938"/>
+        <w:gridCol w:w="1938"/>
+        <w:gridCol w:w="1938"/>
+        <w:gridCol w:w="1938"/>
+      </w:tblGrid>
+      <w:tr>
+        <w:tc>
+          <w:tcPr>
+            <w:tcW w:type="dxa" w:w="1938"/>
+            <w:shd w:val="clear" w:color="auto" w:fill="251C53"/>
+            <w:tcBorders>
+              <w:top w:val="single" w:sz="4" w:space="0" w:color="251C53"/>
+              <w:left w:val="single" w:sz="4" w:space="0" w:color="251C53"/>
+              <w:bottom w:val="single" w:sz="4" w:space="0" w:color="251C53"/>
+              <w:right w:val="single" w:sz="4" w:space="0" w:color="251C53"/>
+            </w:tcBorders>
+          </w:tcPr>
+          <w:p>
+            <w:r>
+              <w:rPr>
+                <w:b/>
+                <w:color w:val="FFFFFF"/>
+                <w:sz w:val="20"/>
+              </w:rPr>
+              <w:t>#</w:t>
+            </w:r>
+          </w:p>
+        </w:tc>
+        <w:tc>
+          <w:tcPr>
+            <w:tcW w:type="dxa" w:w="1938"/>
+            <w:shd w:val="clear" w:color="auto" w:fill="251C53"/>
+            <w:tcBorders>
+              <w:top w:val="single" w:sz="4" w:space="0" w:color="251C53"/>
+              <w:left w:val="single" w:sz="4" w:space="0" w:color="251C53"/>
+              <w:bottom w:val="single" w:sz="4" w:space="0" w:color="251C53"/>
+              <w:right w:val="single" w:sz="4" w:space="0" w:color="251C53"/>
+            </w:tcBorders>
+          </w:tcPr>
+          <w:p>
+            <w:r>
+              <w:rPr>
+                <w:b/>
+                <w:color w:val="FFFFFF"/>
+                <w:sz w:val="20"/>
+              </w:rPr>
+              <w:t>Đề xuất</w:t>
+            </w:r>
+          </w:p>
+        </w:tc>
+        <w:tc>
+          <w:tcPr>
+            <w:tcW w:type="dxa" w:w="1938"/>
+            <w:shd w:val="clear" w:color="auto" w:fill="251C53"/>
+            <w:tcBorders>
+              <w:top w:val="single" w:sz="4" w:space="0" w:color="251C53"/>
+              <w:left w:val="single" w:sz="4" w:space="0" w:color="251C53"/>
+              <w:bottom w:val="single" w:sz="4" w:space="0" w:color="251C53"/>
+              <w:right w:val="single" w:sz="4" w:space="0" w:color="251C53"/>
+            </w:tcBorders>
+          </w:tcPr>
+          <w:p>
+            <w:r>
+              <w:rPr>
+                <w:b/>
+                <w:color w:val="FFFFFF"/>
+                <w:sz w:val="20"/>
+              </w:rPr>
+              <w:t>Effort</w:t>
+            </w:r>
+          </w:p>
+        </w:tc>
+        <w:tc>
+          <w:tcPr>
+            <w:tcW w:type="dxa" w:w="1938"/>
+            <w:shd w:val="clear" w:color="auto" w:fill="251C53"/>
+            <w:tcBorders>
+              <w:top w:val="single" w:sz="4" w:space="0" w:color="251C53"/>
+              <w:left w:val="single" w:sz="4" w:space="0" w:color="251C53"/>
+              <w:bottom w:val="single" w:sz="4" w:space="0" w:color="251C53"/>
+              <w:right w:val="single" w:sz="4" w:space="0" w:color="251C53"/>
+            </w:tcBorders>
+          </w:tcPr>
+          <w:p>
+            <w:r>
+              <w:rPr>
+                <w:b/>
+                <w:color w:val="FFFFFF"/>
+                <w:sz w:val="20"/>
+              </w:rPr>
+              <w:t>Rủi ro</w:t>
+            </w:r>
+          </w:p>
+        </w:tc>
+        <w:tc>
+          <w:tcPr>
+            <w:tcW w:type="dxa" w:w="1938"/>
+            <w:shd w:val="clear" w:color="auto" w:fill="251C53"/>
+            <w:tcBorders>
+              <w:top w:val="single" w:sz="4" w:space="0" w:color="251C53"/>
+              <w:left w:val="single" w:sz="4" w:space="0" w:color="251C53"/>
+              <w:bottom w:val="single" w:sz="4" w:space="0" w:color="251C53"/>
+              <w:right w:val="single" w:sz="4" w:space="0" w:color="251C53"/>
+            </w:tcBorders>
+          </w:tcPr>
+          <w:p>
+            <w:r>
+              <w:rPr>
+                <w:b/>
+                <w:color w:val="FFFFFF"/>
+                <w:sz w:val="20"/>
+              </w:rPr>
+              <w:t>Impact</w:t>
+            </w:r>
+          </w:p>
+        </w:tc>
+      </w:tr>
+      <w:tr>
+        <w:tc>
+          <w:tcPr>
+            <w:tcW w:type="dxa" w:w="1938"/>
+            <w:tcBorders>
+              <w:top w:val="single" w:sz="4" w:space="0" w:color="CBCBCB"/>
+              <w:left w:val="single" w:sz="4" w:space="0" w:color="CBCBCB"/>
+              <w:bottom w:val="single" w:sz="4" w:space="0" w:color="CBCBCB"/>
+              <w:right w:val="single" w:sz="4" w:space="0" w:color="CBCBCB"/>
+            </w:tcBorders>
+          </w:tcPr>
+          <w:p>
+            <w:r>
+              <w:rPr>
+                <w:sz w:val="20"/>
+              </w:rPr>
+              <w:t>---</w:t>
+            </w:r>
+          </w:p>
+        </w:tc>
+        <w:tc>
+          <w:tcPr>
+            <w:tcW w:type="dxa" w:w="1938"/>
+            <w:tcBorders>
+              <w:top w:val="single" w:sz="4" w:space="0" w:color="CBCBCB"/>
+              <w:left w:val="single" w:sz="4" w:space="0" w:color="CBCBCB"/>
+              <w:bottom w:val="single" w:sz="4" w:space="0" w:color="CBCBCB"/>
+              <w:right w:val="single" w:sz="4" w:space="0" w:color="CBCBCB"/>
+            </w:tcBorders>
+          </w:tcPr>
+          <w:p>
+            <w:r>
+              <w:rPr>
+                <w:sz w:val="20"/>
+              </w:rPr>
+              <w:t>---------</w:t>
+            </w:r>
+          </w:p>
+        </w:tc>
+        <w:tc>
+          <w:tcPr>
+            <w:tcW w:type="dxa" w:w="1938"/>
+            <w:tcBorders>
+              <w:top w:val="single" w:sz="4" w:space="0" w:color="CBCBCB"/>
+              <w:left w:val="single" w:sz="4" w:space="0" w:color="CBCBCB"/>
+              <w:bottom w:val="single" w:sz="4" w:space="0" w:color="CBCBCB"/>
+              <w:right w:val="single" w:sz="4" w:space="0" w:color="CBCBCB"/>
+            </w:tcBorders>
+          </w:tcPr>
+          <w:p>
+            <w:r>
+              <w:rPr>
+                <w:sz w:val="20"/>
+              </w:rPr>
+              <w:t>--------</w:t>
+            </w:r>
+          </w:p>
+        </w:tc>
+        <w:tc>
+          <w:tcPr>
+            <w:tcW w:type="dxa" w:w="1938"/>
+            <w:tcBorders>
+              <w:top w:val="single" w:sz="4" w:space="0" w:color="CBCBCB"/>
+              <w:left w:val="single" w:sz="4" w:space="0" w:color="CBCBCB"/>
+              <w:bottom w:val="single" w:sz="4" w:space="0" w:color="CBCBCB"/>
+              <w:right w:val="single" w:sz="4" w:space="0" w:color="CBCBCB"/>
+            </w:tcBorders>
+          </w:tcPr>
+          <w:p>
+            <w:r>
+              <w:rPr>
+                <w:sz w:val="20"/>
+              </w:rPr>
+              <w:t>--------</w:t>
+            </w:r>
+          </w:p>
+        </w:tc>
+        <w:tc>
+          <w:tcPr>
+            <w:tcW w:type="dxa" w:w="1938"/>
+            <w:tcBorders>
+              <w:top w:val="single" w:sz="4" w:space="0" w:color="CBCBCB"/>
+              <w:left w:val="single" w:sz="4" w:space="0" w:color="CBCBCB"/>
+              <w:bottom w:val="single" w:sz="4" w:space="0" w:color="CBCBCB"/>
+              <w:right w:val="single" w:sz="4" w:space="0" w:color="CBCBCB"/>
+            </w:tcBorders>
+          </w:tcPr>
+          <w:p>
+            <w:r>
+              <w:rPr>
+                <w:sz w:val="20"/>
+              </w:rPr>
+              <w:t>--------</w:t>
+            </w:r>
+          </w:p>
+        </w:tc>
+      </w:tr>
+      <w:tr>
+        <w:tc>
+          <w:tcPr>
+            <w:tcW w:type="dxa" w:w="1938"/>
+            <w:shd w:val="clear" w:color="auto" w:fill="B8B3D6"/>
+            <w:tcBorders>
+              <w:top w:val="single" w:sz="4" w:space="0" w:color="CBCBCB"/>
+              <w:left w:val="single" w:sz="4" w:space="0" w:color="CBCBCB"/>
+              <w:bottom w:val="single" w:sz="4" w:space="0" w:color="CBCBCB"/>
+              <w:right w:val="single" w:sz="4" w:space="0" w:color="CBCBCB"/>
+            </w:tcBorders>
+          </w:tcPr>
+          <w:p>
+            <w:r>
+              <w:rPr>
+                <w:sz w:val="20"/>
+              </w:rPr>
+              <w:t>E1</w:t>
+            </w:r>
+          </w:p>
+        </w:tc>
+        <w:tc>
+          <w:tcPr>
+            <w:tcW w:type="dxa" w:w="1938"/>
+            <w:shd w:val="clear" w:color="auto" w:fill="B8B3D6"/>
+            <w:tcBorders>
+              <w:top w:val="single" w:sz="4" w:space="0" w:color="CBCBCB"/>
+              <w:left w:val="single" w:sz="4" w:space="0" w:color="CBCBCB"/>
+              <w:bottom w:val="single" w:sz="4" w:space="0" w:color="CBCBCB"/>
+              <w:right w:val="single" w:sz="4" w:space="0" w:color="CBCBCB"/>
+            </w:tcBorders>
+          </w:tcPr>
+          <w:p>
+            <w:r>
+              <w:rPr>
+                <w:sz w:val="20"/>
+              </w:rPr>
+              <w:t>Disable-model-invocation cho 5 commands</w:t>
+            </w:r>
+          </w:p>
+        </w:tc>
+        <w:tc>
+          <w:tcPr>
+            <w:tcW w:type="dxa" w:w="1938"/>
+            <w:shd w:val="clear" w:color="auto" w:fill="B8B3D6"/>
+            <w:tcBorders>
+              <w:top w:val="single" w:sz="4" w:space="0" w:color="CBCBCB"/>
+              <w:left w:val="single" w:sz="4" w:space="0" w:color="CBCBCB"/>
+              <w:bottom w:val="single" w:sz="4" w:space="0" w:color="CBCBCB"/>
+              <w:right w:val="single" w:sz="4" w:space="0" w:color="CBCBCB"/>
+            </w:tcBorders>
+          </w:tcPr>
+          <w:p>
+            <w:r>
+              <w:rPr>
+                <w:sz w:val="20"/>
+              </w:rPr>
+              <w:t>30 phút</w:t>
+            </w:r>
+          </w:p>
+        </w:tc>
+        <w:tc>
+          <w:tcPr>
+            <w:tcW w:type="dxa" w:w="1938"/>
+            <w:shd w:val="clear" w:color="auto" w:fill="B8B3D6"/>
+            <w:tcBorders>
+              <w:top w:val="single" w:sz="4" w:space="0" w:color="CBCBCB"/>
+              <w:left w:val="single" w:sz="4" w:space="0" w:color="CBCBCB"/>
+              <w:bottom w:val="single" w:sz="4" w:space="0" w:color="CBCBCB"/>
+              <w:right w:val="single" w:sz="4" w:space="0" w:color="CBCBCB"/>
+            </w:tcBorders>
+          </w:tcPr>
+          <w:p>
+            <w:r>
+              <w:rPr>
+                <w:sz w:val="20"/>
+              </w:rPr>
+              <w:t>Rất thấp</w:t>
+            </w:r>
+          </w:p>
+        </w:tc>
+        <w:tc>
+          <w:tcPr>
+            <w:tcW w:type="dxa" w:w="1938"/>
+            <w:shd w:val="clear" w:color="auto" w:fill="B8B3D6"/>
+            <w:tcBorders>
+              <w:top w:val="single" w:sz="4" w:space="0" w:color="CBCBCB"/>
+              <w:left w:val="single" w:sz="4" w:space="0" w:color="CBCBCB"/>
+              <w:bottom w:val="single" w:sz="4" w:space="0" w:color="CBCBCB"/>
+              <w:right w:val="single" w:sz="4" w:space="0" w:color="CBCBCB"/>
+            </w:tcBorders>
+          </w:tcPr>
+          <w:p>
+            <w:r>
+              <w:rPr>
+                <w:sz w:val="20"/>
+              </w:rPr>
+              <w:t>Medium</w:t>
+            </w:r>
+          </w:p>
+        </w:tc>
+      </w:tr>
+      <w:tr>
+        <w:tc>
+          <w:tcPr>
+            <w:tcW w:type="dxa" w:w="1938"/>
+            <w:tcBorders>
+              <w:top w:val="single" w:sz="4" w:space="0" w:color="CBCBCB"/>
+              <w:left w:val="single" w:sz="4" w:space="0" w:color="CBCBCB"/>
+              <w:bottom w:val="single" w:sz="4" w:space="0" w:color="CBCBCB"/>
+              <w:right w:val="single" w:sz="4" w:space="0" w:color="CBCBCB"/>
+            </w:tcBorders>
+          </w:tcPr>
+          <w:p>
+            <w:r>
+              <w:rPr>
+                <w:sz w:val="20"/>
+              </w:rPr>
+              <w:t>E2</w:t>
+            </w:r>
+          </w:p>
+        </w:tc>
+        <w:tc>
+          <w:tcPr>
+            <w:tcW w:type="dxa" w:w="1938"/>
+            <w:tcBorders>
+              <w:top w:val="single" w:sz="4" w:space="0" w:color="CBCBCB"/>
+              <w:left w:val="single" w:sz="4" w:space="0" w:color="CBCBCB"/>
+              <w:bottom w:val="single" w:sz="4" w:space="0" w:color="CBCBCB"/>
+              <w:right w:val="single" w:sz="4" w:space="0" w:color="CBCBCB"/>
+            </w:tcBorders>
+          </w:tcPr>
+          <w:p>
+            <w:r>
+              <w:rPr>
+                <w:sz w:val="20"/>
+              </w:rPr>
+              <w:t>Grilling primitive tái dùng</w:t>
+            </w:r>
+          </w:p>
+        </w:tc>
+        <w:tc>
+          <w:tcPr>
+            <w:tcW w:type="dxa" w:w="1938"/>
+            <w:tcBorders>
+              <w:top w:val="single" w:sz="4" w:space="0" w:color="CBCBCB"/>
+              <w:left w:val="single" w:sz="4" w:space="0" w:color="CBCBCB"/>
+              <w:bottom w:val="single" w:sz="4" w:space="0" w:color="CBCBCB"/>
+              <w:right w:val="single" w:sz="4" w:space="0" w:color="CBCBCB"/>
+            </w:tcBorders>
+          </w:tcPr>
+          <w:p>
+            <w:r>
+              <w:rPr>
+                <w:sz w:val="20"/>
+              </w:rPr>
+              <w:t>2–3 giờ</w:t>
+            </w:r>
+          </w:p>
+        </w:tc>
+        <w:tc>
+          <w:tcPr>
+            <w:tcW w:type="dxa" w:w="1938"/>
+            <w:tcBorders>
+              <w:top w:val="single" w:sz="4" w:space="0" w:color="CBCBCB"/>
+              <w:left w:val="single" w:sz="4" w:space="0" w:color="CBCBCB"/>
+              <w:bottom w:val="single" w:sz="4" w:space="0" w:color="CBCBCB"/>
+              <w:right w:val="single" w:sz="4" w:space="0" w:color="CBCBCB"/>
+            </w:tcBorders>
+          </w:tcPr>
+          <w:p>
+            <w:r>
+              <w:rPr>
+                <w:sz w:val="20"/>
+              </w:rPr>
+              <w:t>Thấp</w:t>
+            </w:r>
+          </w:p>
+        </w:tc>
+        <w:tc>
+          <w:tcPr>
+            <w:tcW w:type="dxa" w:w="1938"/>
+            <w:tcBorders>
+              <w:top w:val="single" w:sz="4" w:space="0" w:color="CBCBCB"/>
+              <w:left w:val="single" w:sz="4" w:space="0" w:color="CBCBCB"/>
+              <w:bottom w:val="single" w:sz="4" w:space="0" w:color="CBCBCB"/>
+              <w:right w:val="single" w:sz="4" w:space="0" w:color="CBCBCB"/>
+            </w:tcBorders>
+          </w:tcPr>
+          <w:p>
+            <w:r>
+              <w:rPr>
+                <w:sz w:val="20"/>
+              </w:rPr>
+              <w:t>High</w:t>
+            </w:r>
+          </w:p>
+        </w:tc>
+      </w:tr>
+      <w:tr>
+        <w:tc>
+          <w:tcPr>
+            <w:tcW w:type="dxa" w:w="1938"/>
+            <w:shd w:val="clear" w:color="auto" w:fill="B8B3D6"/>
+            <w:tcBorders>
+              <w:top w:val="single" w:sz="4" w:space="0" w:color="CBCBCB"/>
+              <w:left w:val="single" w:sz="4" w:space="0" w:color="CBCBCB"/>
+              <w:bottom w:val="single" w:sz="4" w:space="0" w:color="CBCBCB"/>
+              <w:right w:val="single" w:sz="4" w:space="0" w:color="CBCBCB"/>
+            </w:tcBorders>
+          </w:tcPr>
+          <w:p>
+            <w:r>
+              <w:rPr>
+                <w:sz w:val="20"/>
+              </w:rPr>
+              <w:t>E3</w:t>
+            </w:r>
+          </w:p>
+        </w:tc>
+        <w:tc>
+          <w:tcPr>
+            <w:tcW w:type="dxa" w:w="1938"/>
+            <w:shd w:val="clear" w:color="auto" w:fill="B8B3D6"/>
+            <w:tcBorders>
+              <w:top w:val="single" w:sz="4" w:space="0" w:color="CBCBCB"/>
+              <w:left w:val="single" w:sz="4" w:space="0" w:color="CBCBCB"/>
+              <w:bottom w:val="single" w:sz="4" w:space="0" w:color="CBCBCB"/>
+              <w:right w:val="single" w:sz="4" w:space="0" w:color="CBCBCB"/>
+            </w:tcBorders>
+          </w:tcPr>
+          <w:p>
+            <w:r>
+              <w:rPr>
+                <w:sz w:val="20"/>
+              </w:rPr>
+              <w:t>Diagnosing-bugs 6-phase</w:t>
+            </w:r>
+          </w:p>
+        </w:tc>
+        <w:tc>
+          <w:tcPr>
+            <w:tcW w:type="dxa" w:w="1938"/>
+            <w:shd w:val="clear" w:color="auto" w:fill="B8B3D6"/>
+            <w:tcBorders>
+              <w:top w:val="single" w:sz="4" w:space="0" w:color="CBCBCB"/>
+              <w:left w:val="single" w:sz="4" w:space="0" w:color="CBCBCB"/>
+              <w:bottom w:val="single" w:sz="4" w:space="0" w:color="CBCBCB"/>
+              <w:right w:val="single" w:sz="4" w:space="0" w:color="CBCBCB"/>
+            </w:tcBorders>
+          </w:tcPr>
+          <w:p>
+            <w:r>
+              <w:rPr>
+                <w:sz w:val="20"/>
+              </w:rPr>
+              <w:t>2 giờ</w:t>
+            </w:r>
+          </w:p>
+        </w:tc>
+        <w:tc>
+          <w:tcPr>
+            <w:tcW w:type="dxa" w:w="1938"/>
+            <w:shd w:val="clear" w:color="auto" w:fill="B8B3D6"/>
+            <w:tcBorders>
+              <w:top w:val="single" w:sz="4" w:space="0" w:color="CBCBCB"/>
+              <w:left w:val="single" w:sz="4" w:space="0" w:color="CBCBCB"/>
+              <w:bottom w:val="single" w:sz="4" w:space="0" w:color="CBCBCB"/>
+              <w:right w:val="single" w:sz="4" w:space="0" w:color="CBCBCB"/>
+            </w:tcBorders>
+          </w:tcPr>
+          <w:p>
+            <w:r>
+              <w:rPr>
+                <w:sz w:val="20"/>
+              </w:rPr>
+              <w:t>Không có</w:t>
+            </w:r>
+          </w:p>
+        </w:tc>
+        <w:tc>
+          <w:tcPr>
+            <w:tcW w:type="dxa" w:w="1938"/>
+            <w:shd w:val="clear" w:color="auto" w:fill="B8B3D6"/>
+            <w:tcBorders>
+              <w:top w:val="single" w:sz="4" w:space="0" w:color="CBCBCB"/>
+              <w:left w:val="single" w:sz="4" w:space="0" w:color="CBCBCB"/>
+              <w:bottom w:val="single" w:sz="4" w:space="0" w:color="CBCBCB"/>
+              <w:right w:val="single" w:sz="4" w:space="0" w:color="CBCBCB"/>
+            </w:tcBorders>
+          </w:tcPr>
+          <w:p>
+            <w:r>
+              <w:rPr>
+                <w:sz w:val="20"/>
+              </w:rPr>
+              <w:t>High</w:t>
+            </w:r>
+          </w:p>
+        </w:tc>
+      </w:tr>
+      <w:tr>
+        <w:tc>
+          <w:tcPr>
+            <w:tcW w:type="dxa" w:w="1938"/>
+            <w:tcBorders>
+              <w:top w:val="single" w:sz="4" w:space="0" w:color="CBCBCB"/>
+              <w:left w:val="single" w:sz="4" w:space="0" w:color="CBCBCB"/>
+              <w:bottom w:val="single" w:sz="4" w:space="0" w:color="CBCBCB"/>
+              <w:right w:val="single" w:sz="4" w:space="0" w:color="CBCBCB"/>
+            </w:tcBorders>
+          </w:tcPr>
+          <w:p>
+            <w:r>
+              <w:rPr>
+                <w:sz w:val="20"/>
+              </w:rPr>
+              <w:t>E4</w:t>
+            </w:r>
+          </w:p>
+        </w:tc>
+        <w:tc>
+          <w:tcPr>
+            <w:tcW w:type="dxa" w:w="1938"/>
+            <w:tcBorders>
+              <w:top w:val="single" w:sz="4" w:space="0" w:color="CBCBCB"/>
+              <w:left w:val="single" w:sz="4" w:space="0" w:color="CBCBCB"/>
+              <w:bottom w:val="single" w:sz="4" w:space="0" w:color="CBCBCB"/>
+              <w:right w:val="single" w:sz="4" w:space="0" w:color="CBCBCB"/>
+            </w:tcBorders>
+          </w:tcPr>
+          <w:p>
+            <w:r>
+              <w:rPr>
+                <w:sz w:val="20"/>
+              </w:rPr>
+              <w:t>TDD skill (red-green-refactor)</w:t>
+            </w:r>
+          </w:p>
+        </w:tc>
+        <w:tc>
+          <w:tcPr>
+            <w:tcW w:type="dxa" w:w="1938"/>
+            <w:tcBorders>
+              <w:top w:val="single" w:sz="4" w:space="0" w:color="CBCBCB"/>
+              <w:left w:val="single" w:sz="4" w:space="0" w:color="CBCBCB"/>
+              <w:bottom w:val="single" w:sz="4" w:space="0" w:color="CBCBCB"/>
+              <w:right w:val="single" w:sz="4" w:space="0" w:color="CBCBCB"/>
+            </w:tcBorders>
+          </w:tcPr>
+          <w:p>
+            <w:r>
+              <w:rPr>
+                <w:sz w:val="20"/>
+              </w:rPr>
+              <w:t>2–3 giờ</w:t>
+            </w:r>
+          </w:p>
+        </w:tc>
+        <w:tc>
+          <w:tcPr>
+            <w:tcW w:type="dxa" w:w="1938"/>
+            <w:tcBorders>
+              <w:top w:val="single" w:sz="4" w:space="0" w:color="CBCBCB"/>
+              <w:left w:val="single" w:sz="4" w:space="0" w:color="CBCBCB"/>
+              <w:bottom w:val="single" w:sz="4" w:space="0" w:color="CBCBCB"/>
+              <w:right w:val="single" w:sz="4" w:space="0" w:color="CBCBCB"/>
+            </w:tcBorders>
+          </w:tcPr>
+          <w:p>
+            <w:r>
+              <w:rPr>
+                <w:sz w:val="20"/>
+              </w:rPr>
+              <w:t>Thấp</w:t>
+            </w:r>
+          </w:p>
+        </w:tc>
+        <w:tc>
+          <w:tcPr>
+            <w:tcW w:type="dxa" w:w="1938"/>
+            <w:tcBorders>
+              <w:top w:val="single" w:sz="4" w:space="0" w:color="CBCBCB"/>
+              <w:left w:val="single" w:sz="4" w:space="0" w:color="CBCBCB"/>
+              <w:bottom w:val="single" w:sz="4" w:space="0" w:color="CBCBCB"/>
+              <w:right w:val="single" w:sz="4" w:space="0" w:color="CBCBCB"/>
+            </w:tcBorders>
+          </w:tcPr>
+          <w:p>
+            <w:r>
+              <w:rPr>
+                <w:sz w:val="20"/>
+              </w:rPr>
+              <w:t>High</w:t>
+            </w:r>
+          </w:p>
+        </w:tc>
+      </w:tr>
+      <w:tr>
+        <w:tc>
+          <w:tcPr>
+            <w:tcW w:type="dxa" w:w="1938"/>
+            <w:shd w:val="clear" w:color="auto" w:fill="B8B3D6"/>
+            <w:tcBorders>
+              <w:top w:val="single" w:sz="4" w:space="0" w:color="CBCBCB"/>
+              <w:left w:val="single" w:sz="4" w:space="0" w:color="CBCBCB"/>
+              <w:bottom w:val="single" w:sz="4" w:space="0" w:color="CBCBCB"/>
+              <w:right w:val="single" w:sz="4" w:space="0" w:color="CBCBCB"/>
+            </w:tcBorders>
+          </w:tcPr>
+          <w:p>
+            <w:r>
+              <w:rPr>
+                <w:sz w:val="20"/>
+              </w:rPr>
+              <w:t>E5</w:t>
+            </w:r>
+          </w:p>
+        </w:tc>
+        <w:tc>
+          <w:tcPr>
+            <w:tcW w:type="dxa" w:w="1938"/>
+            <w:shd w:val="clear" w:color="auto" w:fill="B8B3D6"/>
+            <w:tcBorders>
+              <w:top w:val="single" w:sz="4" w:space="0" w:color="CBCBCB"/>
+              <w:left w:val="single" w:sz="4" w:space="0" w:color="CBCBCB"/>
+              <w:bottom w:val="single" w:sz="4" w:space="0" w:color="CBCBCB"/>
+              <w:right w:val="single" w:sz="4" w:space="0" w:color="CBCBCB"/>
+            </w:tcBorders>
+          </w:tcPr>
+          <w:p>
+            <w:r>
+              <w:rPr>
+                <w:sz w:val="20"/>
+              </w:rPr>
+              <w:t>Code-review 2-axis parallel</w:t>
+            </w:r>
+          </w:p>
+        </w:tc>
+        <w:tc>
+          <w:tcPr>
+            <w:tcW w:type="dxa" w:w="1938"/>
+            <w:shd w:val="clear" w:color="auto" w:fill="B8B3D6"/>
+            <w:tcBorders>
+              <w:top w:val="single" w:sz="4" w:space="0" w:color="CBCBCB"/>
+              <w:left w:val="single" w:sz="4" w:space="0" w:color="CBCBCB"/>
+              <w:bottom w:val="single" w:sz="4" w:space="0" w:color="CBCBCB"/>
+              <w:right w:val="single" w:sz="4" w:space="0" w:color="CBCBCB"/>
+            </w:tcBorders>
+          </w:tcPr>
+          <w:p>
+            <w:r>
+              <w:rPr>
+                <w:sz w:val="20"/>
+              </w:rPr>
+              <w:t>3–4 giờ</w:t>
+            </w:r>
+          </w:p>
+        </w:tc>
+        <w:tc>
+          <w:tcPr>
+            <w:tcW w:type="dxa" w:w="1938"/>
+            <w:shd w:val="clear" w:color="auto" w:fill="B8B3D6"/>
+            <w:tcBorders>
+              <w:top w:val="single" w:sz="4" w:space="0" w:color="CBCBCB"/>
+              <w:left w:val="single" w:sz="4" w:space="0" w:color="CBCBCB"/>
+              <w:bottom w:val="single" w:sz="4" w:space="0" w:color="CBCBCB"/>
+              <w:right w:val="single" w:sz="4" w:space="0" w:color="CBCBCB"/>
+            </w:tcBorders>
+          </w:tcPr>
+          <w:p>
+            <w:r>
+              <w:rPr>
+                <w:sz w:val="20"/>
+              </w:rPr>
+              <w:t>Trung bình</w:t>
+            </w:r>
+          </w:p>
+        </w:tc>
+        <w:tc>
+          <w:tcPr>
+            <w:tcW w:type="dxa" w:w="1938"/>
+            <w:shd w:val="clear" w:color="auto" w:fill="B8B3D6"/>
+            <w:tcBorders>
+              <w:top w:val="single" w:sz="4" w:space="0" w:color="CBCBCB"/>
+              <w:left w:val="single" w:sz="4" w:space="0" w:color="CBCBCB"/>
+              <w:bottom w:val="single" w:sz="4" w:space="0" w:color="CBCBCB"/>
+              <w:right w:val="single" w:sz="4" w:space="0" w:color="CBCBCB"/>
+            </w:tcBorders>
+          </w:tcPr>
+          <w:p>
+            <w:r>
+              <w:rPr>
+                <w:sz w:val="20"/>
+              </w:rPr>
+              <w:t>High</w:t>
+            </w:r>
+          </w:p>
+        </w:tc>
+      </w:tr>
+    </w:tbl>
+    <w:p/>
+    <w:p>
+      <w:pPr>
+        <w:spacing w:after="80"/>
+      </w:pPr>
+      <w:r>
+        <w:rPr>
+          <w:b/>
+          <w:sz w:val="21"/>
+        </w:rPr>
+        <w:t>Tổng effort nếu chọn cả 5:</w:t>
+      </w:r>
+      <w:r>
+        <w:rPr>
+          <w:sz w:val="21"/>
+        </w:rPr>
+        <w:t xml:space="preserve"> ~10–12 giờ làm việc.</w:t>
+      </w:r>
+    </w:p>
+    <w:p>
+      <w:pPr>
+        <w:spacing w:after="80"/>
+      </w:pPr>
+      <w:r>
+        <w:rPr>
+          <w:b/>
+          <w:sz w:val="21"/>
+        </w:rPr>
+        <w:t>Có thể chọn 0, 1, hoặc nhiều đề xuất — không bắt buộc áp dụng cả bộ.</w:t>
       </w:r>
     </w:p>
     <w:sectPr>

</xml_diff>

<commit_message>
[research/skills-2026-08-05] Xuất DOCX RESEARCH doc (cập nhật §9 Bước 4b)
- docs/research/RESEARCH-skills-mattpocock-2026-08-05.docx: cập nhật với §9 trạng thái áp dụng E1-E11

Plan: docs/research/RESEARCH-skills-mattpocock-2026-08-05.md
</commit_message>
<xml_diff>
--- a/docs/research/RESEARCH-skills-mattpocock-2026-08-05.docx
+++ b/docs/research/RESEARCH-skills-mattpocock-2026-08-05.docx
@@ -15362,6 +15362,1652 @@
           <w:sz w:val="21"/>
         </w:rPr>
         <w:t xml:space="preserve"> E7 (sau E3/E4) + E8 (sau E2) (~5–7 giờ).</w:t>
+      </w:r>
+    </w:p>
+    <w:p>
+      <w:pPr>
+        <w:pBdr>
+          <w:bottom w:val="single" w:sz="6" w:space="1" w:color="F05922"/>
+        </w:pBdr>
+        <w:spacing w:after="120"/>
+      </w:pPr>
+    </w:p>
+    <w:p>
+      <w:pPr>
+        <w:pStyle w:val="Heading2"/>
+        <w:spacing w:before="200" w:after="80"/>
+      </w:pPr>
+      <w:r>
+        <w:rPr>
+          <w:color w:val="F05922"/>
+          <w:sz w:val="28"/>
+        </w:rPr>
+        <w:t>9. Bước 4b — Trạng thái áp dụng</w:t>
+      </w:r>
+    </w:p>
+    <w:p>
+      <w:pPr>
+        <w:spacing w:before="40" w:after="40"/>
+        <w:ind w:left="567"/>
+        <w:pBdr>
+          <w:left w:val="single" w:sz="12" w:space="10" w:color="F05922"/>
+        </w:pBdr>
+      </w:pPr>
+      <w:r>
+        <w:rPr>
+          <w:color w:val="4A3F8C"/>
+        </w:rPr>
+        <w:t xml:space="preserve">User xác nhận áp dụng TOÀN BỘ E1–E11 (2026-08-05). Bước 4b đã hoàn thành trên nhánh </w:t>
+      </w:r>
+      <w:r>
+        <w:rPr>
+          <w:rFonts w:ascii="Courier New" w:hAnsi="Courier New"/>
+          <w:color w:val="F05922"/>
+          <w:sz w:val="18"/>
+        </w:rPr>
+        <w:t>research/skills-2026-08-05</w:t>
+      </w:r>
+      <w:r>
+        <w:rPr>
+          <w:color w:val="4A3F8C"/>
+        </w:rPr>
+        <w:t>.</w:t>
+      </w:r>
+    </w:p>
+    <w:tbl>
+      <w:tblPr>
+        <w:tblStyle w:val="TableGrid"/>
+        <w:tblW w:type="auto" w:w="0"/>
+        <w:tblLook w:firstColumn="1" w:firstRow="1" w:lastColumn="0" w:lastRow="0" w:noHBand="0" w:noVBand="1" w:val="04A0"/>
+      </w:tblPr>
+      <w:tblGrid>
+        <w:gridCol w:w="2422"/>
+        <w:gridCol w:w="2422"/>
+        <w:gridCol w:w="2422"/>
+        <w:gridCol w:w="2422"/>
+      </w:tblGrid>
+      <w:tr>
+        <w:tc>
+          <w:tcPr>
+            <w:tcW w:type="dxa" w:w="2422"/>
+            <w:shd w:val="clear" w:color="auto" w:fill="251C53"/>
+            <w:tcBorders>
+              <w:top w:val="single" w:sz="4" w:space="0" w:color="251C53"/>
+              <w:left w:val="single" w:sz="4" w:space="0" w:color="251C53"/>
+              <w:bottom w:val="single" w:sz="4" w:space="0" w:color="251C53"/>
+              <w:right w:val="single" w:sz="4" w:space="0" w:color="251C53"/>
+            </w:tcBorders>
+          </w:tcPr>
+          <w:p>
+            <w:r>
+              <w:rPr>
+                <w:b/>
+                <w:color w:val="FFFFFF"/>
+                <w:sz w:val="20"/>
+              </w:rPr>
+              <w:t>#</w:t>
+            </w:r>
+          </w:p>
+        </w:tc>
+        <w:tc>
+          <w:tcPr>
+            <w:tcW w:type="dxa" w:w="2422"/>
+            <w:shd w:val="clear" w:color="auto" w:fill="251C53"/>
+            <w:tcBorders>
+              <w:top w:val="single" w:sz="4" w:space="0" w:color="251C53"/>
+              <w:left w:val="single" w:sz="4" w:space="0" w:color="251C53"/>
+              <w:bottom w:val="single" w:sz="4" w:space="0" w:color="251C53"/>
+              <w:right w:val="single" w:sz="4" w:space="0" w:color="251C53"/>
+            </w:tcBorders>
+          </w:tcPr>
+          <w:p>
+            <w:r>
+              <w:rPr>
+                <w:b/>
+                <w:color w:val="FFFFFF"/>
+                <w:sz w:val="20"/>
+              </w:rPr>
+              <w:t>Đề xuất</w:t>
+            </w:r>
+          </w:p>
+        </w:tc>
+        <w:tc>
+          <w:tcPr>
+            <w:tcW w:type="dxa" w:w="2422"/>
+            <w:shd w:val="clear" w:color="auto" w:fill="251C53"/>
+            <w:tcBorders>
+              <w:top w:val="single" w:sz="4" w:space="0" w:color="251C53"/>
+              <w:left w:val="single" w:sz="4" w:space="0" w:color="251C53"/>
+              <w:bottom w:val="single" w:sz="4" w:space="0" w:color="251C53"/>
+              <w:right w:val="single" w:sz="4" w:space="0" w:color="251C53"/>
+            </w:tcBorders>
+          </w:tcPr>
+          <w:p>
+            <w:r>
+              <w:rPr>
+                <w:b/>
+                <w:color w:val="FFFFFF"/>
+                <w:sz w:val="20"/>
+              </w:rPr>
+              <w:t>Trạng thái</w:t>
+            </w:r>
+          </w:p>
+        </w:tc>
+        <w:tc>
+          <w:tcPr>
+            <w:tcW w:type="dxa" w:w="2422"/>
+            <w:shd w:val="clear" w:color="auto" w:fill="251C53"/>
+            <w:tcBorders>
+              <w:top w:val="single" w:sz="4" w:space="0" w:color="251C53"/>
+              <w:left w:val="single" w:sz="4" w:space="0" w:color="251C53"/>
+              <w:bottom w:val="single" w:sz="4" w:space="0" w:color="251C53"/>
+              <w:right w:val="single" w:sz="4" w:space="0" w:color="251C53"/>
+            </w:tcBorders>
+          </w:tcPr>
+          <w:p>
+            <w:r>
+              <w:rPr>
+                <w:b/>
+                <w:color w:val="FFFFFF"/>
+                <w:sz w:val="20"/>
+              </w:rPr>
+              <w:t>Artifact đã tạo/sửa</w:t>
+            </w:r>
+          </w:p>
+        </w:tc>
+      </w:tr>
+      <w:tr>
+        <w:tc>
+          <w:tcPr>
+            <w:tcW w:type="dxa" w:w="2422"/>
+            <w:tcBorders>
+              <w:top w:val="single" w:sz="4" w:space="0" w:color="CBCBCB"/>
+              <w:left w:val="single" w:sz="4" w:space="0" w:color="CBCBCB"/>
+              <w:bottom w:val="single" w:sz="4" w:space="0" w:color="CBCBCB"/>
+              <w:right w:val="single" w:sz="4" w:space="0" w:color="CBCBCB"/>
+            </w:tcBorders>
+          </w:tcPr>
+          <w:p>
+            <w:r>
+              <w:rPr>
+                <w:sz w:val="20"/>
+              </w:rPr>
+              <w:t>---</w:t>
+            </w:r>
+          </w:p>
+        </w:tc>
+        <w:tc>
+          <w:tcPr>
+            <w:tcW w:type="dxa" w:w="2422"/>
+            <w:tcBorders>
+              <w:top w:val="single" w:sz="4" w:space="0" w:color="CBCBCB"/>
+              <w:left w:val="single" w:sz="4" w:space="0" w:color="CBCBCB"/>
+              <w:bottom w:val="single" w:sz="4" w:space="0" w:color="CBCBCB"/>
+              <w:right w:val="single" w:sz="4" w:space="0" w:color="CBCBCB"/>
+            </w:tcBorders>
+          </w:tcPr>
+          <w:p>
+            <w:r>
+              <w:rPr>
+                <w:sz w:val="20"/>
+              </w:rPr>
+              <w:t>---------</w:t>
+            </w:r>
+          </w:p>
+        </w:tc>
+        <w:tc>
+          <w:tcPr>
+            <w:tcW w:type="dxa" w:w="2422"/>
+            <w:tcBorders>
+              <w:top w:val="single" w:sz="4" w:space="0" w:color="CBCBCB"/>
+              <w:left w:val="single" w:sz="4" w:space="0" w:color="CBCBCB"/>
+              <w:bottom w:val="single" w:sz="4" w:space="0" w:color="CBCBCB"/>
+              <w:right w:val="single" w:sz="4" w:space="0" w:color="CBCBCB"/>
+            </w:tcBorders>
+          </w:tcPr>
+          <w:p>
+            <w:r>
+              <w:rPr>
+                <w:sz w:val="20"/>
+              </w:rPr>
+              <w:t>-----------</w:t>
+            </w:r>
+          </w:p>
+        </w:tc>
+        <w:tc>
+          <w:tcPr>
+            <w:tcW w:type="dxa" w:w="2422"/>
+            <w:tcBorders>
+              <w:top w:val="single" w:sz="4" w:space="0" w:color="CBCBCB"/>
+              <w:left w:val="single" w:sz="4" w:space="0" w:color="CBCBCB"/>
+              <w:bottom w:val="single" w:sz="4" w:space="0" w:color="CBCBCB"/>
+              <w:right w:val="single" w:sz="4" w:space="0" w:color="CBCBCB"/>
+            </w:tcBorders>
+          </w:tcPr>
+          <w:p>
+            <w:r>
+              <w:rPr>
+                <w:sz w:val="20"/>
+              </w:rPr>
+              <w:t>-------------------</w:t>
+            </w:r>
+          </w:p>
+        </w:tc>
+      </w:tr>
+      <w:tr>
+        <w:tc>
+          <w:tcPr>
+            <w:tcW w:type="dxa" w:w="2422"/>
+            <w:shd w:val="clear" w:color="auto" w:fill="B8B3D6"/>
+            <w:tcBorders>
+              <w:top w:val="single" w:sz="4" w:space="0" w:color="CBCBCB"/>
+              <w:left w:val="single" w:sz="4" w:space="0" w:color="CBCBCB"/>
+              <w:bottom w:val="single" w:sz="4" w:space="0" w:color="CBCBCB"/>
+              <w:right w:val="single" w:sz="4" w:space="0" w:color="CBCBCB"/>
+            </w:tcBorders>
+          </w:tcPr>
+          <w:p>
+            <w:r>
+              <w:rPr>
+                <w:sz w:val="20"/>
+              </w:rPr>
+              <w:t>E1</w:t>
+            </w:r>
+          </w:p>
+        </w:tc>
+        <w:tc>
+          <w:tcPr>
+            <w:tcW w:type="dxa" w:w="2422"/>
+            <w:shd w:val="clear" w:color="auto" w:fill="B8B3D6"/>
+            <w:tcBorders>
+              <w:top w:val="single" w:sz="4" w:space="0" w:color="CBCBCB"/>
+              <w:left w:val="single" w:sz="4" w:space="0" w:color="CBCBCB"/>
+              <w:bottom w:val="single" w:sz="4" w:space="0" w:color="CBCBCB"/>
+              <w:right w:val="single" w:sz="4" w:space="0" w:color="CBCBCB"/>
+            </w:tcBorders>
+          </w:tcPr>
+          <w:p>
+            <w:r>
+              <w:rPr>
+                <w:sz w:val="20"/>
+              </w:rPr>
+              <w:t>disable-model-invocation cho 5 commands</w:t>
+            </w:r>
+          </w:p>
+        </w:tc>
+        <w:tc>
+          <w:tcPr>
+            <w:tcW w:type="dxa" w:w="2422"/>
+            <w:shd w:val="clear" w:color="auto" w:fill="B8B3D6"/>
+            <w:tcBorders>
+              <w:top w:val="single" w:sz="4" w:space="0" w:color="CBCBCB"/>
+              <w:left w:val="single" w:sz="4" w:space="0" w:color="CBCBCB"/>
+              <w:bottom w:val="single" w:sz="4" w:space="0" w:color="CBCBCB"/>
+              <w:right w:val="single" w:sz="4" w:space="0" w:color="CBCBCB"/>
+            </w:tcBorders>
+          </w:tcPr>
+          <w:p>
+            <w:r>
+              <w:rPr>
+                <w:sz w:val="20"/>
+              </w:rPr>
+              <w:t>✅ Đã áp dụng</w:t>
+            </w:r>
+          </w:p>
+        </w:tc>
+        <w:tc>
+          <w:tcPr>
+            <w:tcW w:type="dxa" w:w="2422"/>
+            <w:shd w:val="clear" w:color="auto" w:fill="B8B3D6"/>
+            <w:tcBorders>
+              <w:top w:val="single" w:sz="4" w:space="0" w:color="CBCBCB"/>
+              <w:left w:val="single" w:sz="4" w:space="0" w:color="CBCBCB"/>
+              <w:bottom w:val="single" w:sz="4" w:space="0" w:color="CBCBCB"/>
+              <w:right w:val="single" w:sz="4" w:space="0" w:color="CBCBCB"/>
+            </w:tcBorders>
+          </w:tcPr>
+          <w:p>
+            <w:r>
+              <w:rPr>
+                <w:rFonts w:ascii="Courier New" w:hAnsi="Courier New"/>
+                <w:color w:val="F05922"/>
+                <w:sz w:val="20"/>
+              </w:rPr>
+              <w:t>.claude/commands/scope-check.md</w:t>
+            </w:r>
+            <w:r>
+              <w:rPr>
+                <w:sz w:val="20"/>
+              </w:rPr>
+              <w:t xml:space="preserve">, </w:t>
+            </w:r>
+            <w:r>
+              <w:rPr>
+                <w:rFonts w:ascii="Courier New" w:hAnsi="Courier New"/>
+                <w:color w:val="F05922"/>
+                <w:sz w:val="20"/>
+              </w:rPr>
+              <w:t>ship.md</w:t>
+            </w:r>
+            <w:r>
+              <w:rPr>
+                <w:sz w:val="20"/>
+              </w:rPr>
+              <w:t xml:space="preserve">, </w:t>
+            </w:r>
+            <w:r>
+              <w:rPr>
+                <w:rFonts w:ascii="Courier New" w:hAnsi="Courier New"/>
+                <w:color w:val="F05922"/>
+                <w:sz w:val="20"/>
+              </w:rPr>
+              <w:t>run-plan-step.md</w:t>
+            </w:r>
+            <w:r>
+              <w:rPr>
+                <w:sz w:val="20"/>
+              </w:rPr>
+              <w:t xml:space="preserve">, </w:t>
+            </w:r>
+            <w:r>
+              <w:rPr>
+                <w:rFonts w:ascii="Courier New" w:hAnsi="Courier New"/>
+                <w:color w:val="F05922"/>
+                <w:sz w:val="20"/>
+              </w:rPr>
+              <w:t>sync-global.md</w:t>
+            </w:r>
+            <w:r>
+              <w:rPr>
+                <w:sz w:val="20"/>
+              </w:rPr>
+              <w:t xml:space="preserve">, </w:t>
+            </w:r>
+            <w:r>
+              <w:rPr>
+                <w:rFonts w:ascii="Courier New" w:hAnsi="Courier New"/>
+                <w:color w:val="F05922"/>
+                <w:sz w:val="20"/>
+              </w:rPr>
+              <w:t>sdk-crossplatform-eval.md</w:t>
+            </w:r>
+          </w:p>
+        </w:tc>
+      </w:tr>
+      <w:tr>
+        <w:tc>
+          <w:tcPr>
+            <w:tcW w:type="dxa" w:w="2422"/>
+            <w:tcBorders>
+              <w:top w:val="single" w:sz="4" w:space="0" w:color="CBCBCB"/>
+              <w:left w:val="single" w:sz="4" w:space="0" w:color="CBCBCB"/>
+              <w:bottom w:val="single" w:sz="4" w:space="0" w:color="CBCBCB"/>
+              <w:right w:val="single" w:sz="4" w:space="0" w:color="CBCBCB"/>
+            </w:tcBorders>
+          </w:tcPr>
+          <w:p>
+            <w:r>
+              <w:rPr>
+                <w:sz w:val="20"/>
+              </w:rPr>
+              <w:t>E2</w:t>
+            </w:r>
+          </w:p>
+        </w:tc>
+        <w:tc>
+          <w:tcPr>
+            <w:tcW w:type="dxa" w:w="2422"/>
+            <w:tcBorders>
+              <w:top w:val="single" w:sz="4" w:space="0" w:color="CBCBCB"/>
+              <w:left w:val="single" w:sz="4" w:space="0" w:color="CBCBCB"/>
+              <w:bottom w:val="single" w:sz="4" w:space="0" w:color="CBCBCB"/>
+              <w:right w:val="single" w:sz="4" w:space="0" w:color="CBCBCB"/>
+            </w:tcBorders>
+          </w:tcPr>
+          <w:p>
+            <w:r>
+              <w:rPr>
+                <w:sz w:val="20"/>
+              </w:rPr>
+              <w:t>grilling.md — interview primitive</w:t>
+            </w:r>
+          </w:p>
+        </w:tc>
+        <w:tc>
+          <w:tcPr>
+            <w:tcW w:type="dxa" w:w="2422"/>
+            <w:tcBorders>
+              <w:top w:val="single" w:sz="4" w:space="0" w:color="CBCBCB"/>
+              <w:left w:val="single" w:sz="4" w:space="0" w:color="CBCBCB"/>
+              <w:bottom w:val="single" w:sz="4" w:space="0" w:color="CBCBCB"/>
+              <w:right w:val="single" w:sz="4" w:space="0" w:color="CBCBCB"/>
+            </w:tcBorders>
+          </w:tcPr>
+          <w:p>
+            <w:r>
+              <w:rPr>
+                <w:sz w:val="20"/>
+              </w:rPr>
+              <w:t>✅ Đã áp dụng</w:t>
+            </w:r>
+          </w:p>
+        </w:tc>
+        <w:tc>
+          <w:tcPr>
+            <w:tcW w:type="dxa" w:w="2422"/>
+            <w:tcBorders>
+              <w:top w:val="single" w:sz="4" w:space="0" w:color="CBCBCB"/>
+              <w:left w:val="single" w:sz="4" w:space="0" w:color="CBCBCB"/>
+              <w:bottom w:val="single" w:sz="4" w:space="0" w:color="CBCBCB"/>
+              <w:right w:val="single" w:sz="4" w:space="0" w:color="CBCBCB"/>
+            </w:tcBorders>
+          </w:tcPr>
+          <w:p>
+            <w:r>
+              <w:rPr>
+                <w:rFonts w:ascii="Courier New" w:hAnsi="Courier New"/>
+                <w:color w:val="F05922"/>
+                <w:sz w:val="20"/>
+              </w:rPr>
+              <w:t>.claude/evals/grilling.md</w:t>
+            </w:r>
+            <w:r>
+              <w:rPr>
+                <w:sz w:val="20"/>
+              </w:rPr>
+              <w:t xml:space="preserve"> (mới), </w:t>
+            </w:r>
+            <w:r>
+              <w:rPr>
+                <w:rFonts w:ascii="Courier New" w:hAnsi="Courier New"/>
+                <w:color w:val="F05922"/>
+                <w:sz w:val="20"/>
+              </w:rPr>
+              <w:t>.claude/commands/grilling.md</w:t>
+            </w:r>
+            <w:r>
+              <w:rPr>
+                <w:sz w:val="20"/>
+              </w:rPr>
+              <w:t xml:space="preserve"> (mới), </w:t>
+            </w:r>
+            <w:r>
+              <w:rPr>
+                <w:rFonts w:ascii="Courier New" w:hAnsi="Courier New"/>
+                <w:color w:val="F05922"/>
+                <w:sz w:val="20"/>
+              </w:rPr>
+              <w:t>.claude/commands/scope-check.md</w:t>
+            </w:r>
+            <w:r>
+              <w:rPr>
+                <w:sz w:val="20"/>
+              </w:rPr>
+              <w:t xml:space="preserve"> (cập nhật — gợi ý grilling khi phức tạp)</w:t>
+            </w:r>
+          </w:p>
+        </w:tc>
+      </w:tr>
+      <w:tr>
+        <w:tc>
+          <w:tcPr>
+            <w:tcW w:type="dxa" w:w="2422"/>
+            <w:shd w:val="clear" w:color="auto" w:fill="B8B3D6"/>
+            <w:tcBorders>
+              <w:top w:val="single" w:sz="4" w:space="0" w:color="CBCBCB"/>
+              <w:left w:val="single" w:sz="4" w:space="0" w:color="CBCBCB"/>
+              <w:bottom w:val="single" w:sz="4" w:space="0" w:color="CBCBCB"/>
+              <w:right w:val="single" w:sz="4" w:space="0" w:color="CBCBCB"/>
+            </w:tcBorders>
+          </w:tcPr>
+          <w:p>
+            <w:r>
+              <w:rPr>
+                <w:sz w:val="20"/>
+              </w:rPr>
+              <w:t>E3</w:t>
+            </w:r>
+          </w:p>
+        </w:tc>
+        <w:tc>
+          <w:tcPr>
+            <w:tcW w:type="dxa" w:w="2422"/>
+            <w:shd w:val="clear" w:color="auto" w:fill="B8B3D6"/>
+            <w:tcBorders>
+              <w:top w:val="single" w:sz="4" w:space="0" w:color="CBCBCB"/>
+              <w:left w:val="single" w:sz="4" w:space="0" w:color="CBCBCB"/>
+              <w:bottom w:val="single" w:sz="4" w:space="0" w:color="CBCBCB"/>
+              <w:right w:val="single" w:sz="4" w:space="0" w:color="CBCBCB"/>
+            </w:tcBorders>
+          </w:tcPr>
+          <w:p>
+            <w:r>
+              <w:rPr>
+                <w:sz w:val="20"/>
+              </w:rPr>
+              <w:t>diagnosing-bugs.md — 6-phase debug loop</w:t>
+            </w:r>
+          </w:p>
+        </w:tc>
+        <w:tc>
+          <w:tcPr>
+            <w:tcW w:type="dxa" w:w="2422"/>
+            <w:shd w:val="clear" w:color="auto" w:fill="B8B3D6"/>
+            <w:tcBorders>
+              <w:top w:val="single" w:sz="4" w:space="0" w:color="CBCBCB"/>
+              <w:left w:val="single" w:sz="4" w:space="0" w:color="CBCBCB"/>
+              <w:bottom w:val="single" w:sz="4" w:space="0" w:color="CBCBCB"/>
+              <w:right w:val="single" w:sz="4" w:space="0" w:color="CBCBCB"/>
+            </w:tcBorders>
+          </w:tcPr>
+          <w:p>
+            <w:r>
+              <w:rPr>
+                <w:sz w:val="20"/>
+              </w:rPr>
+              <w:t>✅ Đã áp dụng</w:t>
+            </w:r>
+          </w:p>
+        </w:tc>
+        <w:tc>
+          <w:tcPr>
+            <w:tcW w:type="dxa" w:w="2422"/>
+            <w:shd w:val="clear" w:color="auto" w:fill="B8B3D6"/>
+            <w:tcBorders>
+              <w:top w:val="single" w:sz="4" w:space="0" w:color="CBCBCB"/>
+              <w:left w:val="single" w:sz="4" w:space="0" w:color="CBCBCB"/>
+              <w:bottom w:val="single" w:sz="4" w:space="0" w:color="CBCBCB"/>
+              <w:right w:val="single" w:sz="4" w:space="0" w:color="CBCBCB"/>
+            </w:tcBorders>
+          </w:tcPr>
+          <w:p>
+            <w:r>
+              <w:rPr>
+                <w:rFonts w:ascii="Courier New" w:hAnsi="Courier New"/>
+                <w:color w:val="F05922"/>
+                <w:sz w:val="20"/>
+              </w:rPr>
+              <w:t>.claude/evals/diagnosing-bugs.md</w:t>
+            </w:r>
+            <w:r>
+              <w:rPr>
+                <w:sz w:val="20"/>
+              </w:rPr>
+              <w:t xml:space="preserve"> (mới), </w:t>
+            </w:r>
+            <w:r>
+              <w:rPr>
+                <w:rFonts w:ascii="Courier New" w:hAnsi="Courier New"/>
+                <w:color w:val="F05922"/>
+                <w:sz w:val="20"/>
+              </w:rPr>
+              <w:t>.claude/commands/diagnosing-bugs.md</w:t>
+            </w:r>
+            <w:r>
+              <w:rPr>
+                <w:sz w:val="20"/>
+              </w:rPr>
+              <w:t xml:space="preserve"> (mới)</w:t>
+            </w:r>
+          </w:p>
+        </w:tc>
+      </w:tr>
+      <w:tr>
+        <w:tc>
+          <w:tcPr>
+            <w:tcW w:type="dxa" w:w="2422"/>
+            <w:tcBorders>
+              <w:top w:val="single" w:sz="4" w:space="0" w:color="CBCBCB"/>
+              <w:left w:val="single" w:sz="4" w:space="0" w:color="CBCBCB"/>
+              <w:bottom w:val="single" w:sz="4" w:space="0" w:color="CBCBCB"/>
+              <w:right w:val="single" w:sz="4" w:space="0" w:color="CBCBCB"/>
+            </w:tcBorders>
+          </w:tcPr>
+          <w:p>
+            <w:r>
+              <w:rPr>
+                <w:sz w:val="20"/>
+              </w:rPr>
+              <w:t>E4</w:t>
+            </w:r>
+          </w:p>
+        </w:tc>
+        <w:tc>
+          <w:tcPr>
+            <w:tcW w:type="dxa" w:w="2422"/>
+            <w:tcBorders>
+              <w:top w:val="single" w:sz="4" w:space="0" w:color="CBCBCB"/>
+              <w:left w:val="single" w:sz="4" w:space="0" w:color="CBCBCB"/>
+              <w:bottom w:val="single" w:sz="4" w:space="0" w:color="CBCBCB"/>
+              <w:right w:val="single" w:sz="4" w:space="0" w:color="CBCBCB"/>
+            </w:tcBorders>
+          </w:tcPr>
+          <w:p>
+            <w:r>
+              <w:rPr>
+                <w:sz w:val="20"/>
+              </w:rPr>
+              <w:t>tdd.md — Red-Green-Refactor seam-based</w:t>
+            </w:r>
+          </w:p>
+        </w:tc>
+        <w:tc>
+          <w:tcPr>
+            <w:tcW w:type="dxa" w:w="2422"/>
+            <w:tcBorders>
+              <w:top w:val="single" w:sz="4" w:space="0" w:color="CBCBCB"/>
+              <w:left w:val="single" w:sz="4" w:space="0" w:color="CBCBCB"/>
+              <w:bottom w:val="single" w:sz="4" w:space="0" w:color="CBCBCB"/>
+              <w:right w:val="single" w:sz="4" w:space="0" w:color="CBCBCB"/>
+            </w:tcBorders>
+          </w:tcPr>
+          <w:p>
+            <w:r>
+              <w:rPr>
+                <w:sz w:val="20"/>
+              </w:rPr>
+              <w:t>✅ Đã áp dụng</w:t>
+            </w:r>
+          </w:p>
+        </w:tc>
+        <w:tc>
+          <w:tcPr>
+            <w:tcW w:type="dxa" w:w="2422"/>
+            <w:tcBorders>
+              <w:top w:val="single" w:sz="4" w:space="0" w:color="CBCBCB"/>
+              <w:left w:val="single" w:sz="4" w:space="0" w:color="CBCBCB"/>
+              <w:bottom w:val="single" w:sz="4" w:space="0" w:color="CBCBCB"/>
+              <w:right w:val="single" w:sz="4" w:space="0" w:color="CBCBCB"/>
+            </w:tcBorders>
+          </w:tcPr>
+          <w:p>
+            <w:r>
+              <w:rPr>
+                <w:rFonts w:ascii="Courier New" w:hAnsi="Courier New"/>
+                <w:color w:val="F05922"/>
+                <w:sz w:val="20"/>
+              </w:rPr>
+              <w:t>.claude/evals/tdd.md</w:t>
+            </w:r>
+            <w:r>
+              <w:rPr>
+                <w:sz w:val="20"/>
+              </w:rPr>
+              <w:t xml:space="preserve"> (mới), </w:t>
+            </w:r>
+            <w:r>
+              <w:rPr>
+                <w:rFonts w:ascii="Courier New" w:hAnsi="Courier New"/>
+                <w:color w:val="F05922"/>
+                <w:sz w:val="20"/>
+              </w:rPr>
+              <w:t>.claude/commands/tdd.md</w:t>
+            </w:r>
+            <w:r>
+              <w:rPr>
+                <w:sz w:val="20"/>
+              </w:rPr>
+              <w:t xml:space="preserve"> (mới)</w:t>
+            </w:r>
+          </w:p>
+        </w:tc>
+      </w:tr>
+      <w:tr>
+        <w:tc>
+          <w:tcPr>
+            <w:tcW w:type="dxa" w:w="2422"/>
+            <w:shd w:val="clear" w:color="auto" w:fill="B8B3D6"/>
+            <w:tcBorders>
+              <w:top w:val="single" w:sz="4" w:space="0" w:color="CBCBCB"/>
+              <w:left w:val="single" w:sz="4" w:space="0" w:color="CBCBCB"/>
+              <w:bottom w:val="single" w:sz="4" w:space="0" w:color="CBCBCB"/>
+              <w:right w:val="single" w:sz="4" w:space="0" w:color="CBCBCB"/>
+            </w:tcBorders>
+          </w:tcPr>
+          <w:p>
+            <w:r>
+              <w:rPr>
+                <w:sz w:val="20"/>
+              </w:rPr>
+              <w:t>E5</w:t>
+            </w:r>
+          </w:p>
+        </w:tc>
+        <w:tc>
+          <w:tcPr>
+            <w:tcW w:type="dxa" w:w="2422"/>
+            <w:shd w:val="clear" w:color="auto" w:fill="B8B3D6"/>
+            <w:tcBorders>
+              <w:top w:val="single" w:sz="4" w:space="0" w:color="CBCBCB"/>
+              <w:left w:val="single" w:sz="4" w:space="0" w:color="CBCBCB"/>
+              <w:bottom w:val="single" w:sz="4" w:space="0" w:color="CBCBCB"/>
+              <w:right w:val="single" w:sz="4" w:space="0" w:color="CBCBCB"/>
+            </w:tcBorders>
+          </w:tcPr>
+          <w:p>
+            <w:r>
+              <w:rPr>
+                <w:sz w:val="20"/>
+              </w:rPr>
+              <w:t>code-review.md — 2-axis Standards + Spec</w:t>
+            </w:r>
+          </w:p>
+        </w:tc>
+        <w:tc>
+          <w:tcPr>
+            <w:tcW w:type="dxa" w:w="2422"/>
+            <w:shd w:val="clear" w:color="auto" w:fill="B8B3D6"/>
+            <w:tcBorders>
+              <w:top w:val="single" w:sz="4" w:space="0" w:color="CBCBCB"/>
+              <w:left w:val="single" w:sz="4" w:space="0" w:color="CBCBCB"/>
+              <w:bottom w:val="single" w:sz="4" w:space="0" w:color="CBCBCB"/>
+              <w:right w:val="single" w:sz="4" w:space="0" w:color="CBCBCB"/>
+            </w:tcBorders>
+          </w:tcPr>
+          <w:p>
+            <w:r>
+              <w:rPr>
+                <w:sz w:val="20"/>
+              </w:rPr>
+              <w:t>✅ Đã áp dụng</w:t>
+            </w:r>
+          </w:p>
+        </w:tc>
+        <w:tc>
+          <w:tcPr>
+            <w:tcW w:type="dxa" w:w="2422"/>
+            <w:shd w:val="clear" w:color="auto" w:fill="B8B3D6"/>
+            <w:tcBorders>
+              <w:top w:val="single" w:sz="4" w:space="0" w:color="CBCBCB"/>
+              <w:left w:val="single" w:sz="4" w:space="0" w:color="CBCBCB"/>
+              <w:bottom w:val="single" w:sz="4" w:space="0" w:color="CBCBCB"/>
+              <w:right w:val="single" w:sz="4" w:space="0" w:color="CBCBCB"/>
+            </w:tcBorders>
+          </w:tcPr>
+          <w:p>
+            <w:r>
+              <w:rPr>
+                <w:rFonts w:ascii="Courier New" w:hAnsi="Courier New"/>
+                <w:color w:val="F05922"/>
+                <w:sz w:val="20"/>
+              </w:rPr>
+              <w:t>.claude/evals/code-review.md</w:t>
+            </w:r>
+            <w:r>
+              <w:rPr>
+                <w:sz w:val="20"/>
+              </w:rPr>
+              <w:t xml:space="preserve"> (mới), </w:t>
+            </w:r>
+            <w:r>
+              <w:rPr>
+                <w:rFonts w:ascii="Courier New" w:hAnsi="Courier New"/>
+                <w:color w:val="F05922"/>
+                <w:sz w:val="20"/>
+              </w:rPr>
+              <w:t>.claude/commands/code-review.md</w:t>
+            </w:r>
+            <w:r>
+              <w:rPr>
+                <w:sz w:val="20"/>
+              </w:rPr>
+              <w:t xml:space="preserve"> (mới)</w:t>
+            </w:r>
+          </w:p>
+        </w:tc>
+      </w:tr>
+      <w:tr>
+        <w:tc>
+          <w:tcPr>
+            <w:tcW w:type="dxa" w:w="2422"/>
+            <w:tcBorders>
+              <w:top w:val="single" w:sz="4" w:space="0" w:color="CBCBCB"/>
+              <w:left w:val="single" w:sz="4" w:space="0" w:color="CBCBCB"/>
+              <w:bottom w:val="single" w:sz="4" w:space="0" w:color="CBCBCB"/>
+              <w:right w:val="single" w:sz="4" w:space="0" w:color="CBCBCB"/>
+            </w:tcBorders>
+          </w:tcPr>
+          <w:p>
+            <w:r>
+              <w:rPr>
+                <w:sz w:val="20"/>
+              </w:rPr>
+              <w:t>E6</w:t>
+            </w:r>
+          </w:p>
+        </w:tc>
+        <w:tc>
+          <w:tcPr>
+            <w:tcW w:type="dxa" w:w="2422"/>
+            <w:tcBorders>
+              <w:top w:val="single" w:sz="4" w:space="0" w:color="CBCBCB"/>
+              <w:left w:val="single" w:sz="4" w:space="0" w:color="CBCBCB"/>
+              <w:bottom w:val="single" w:sz="4" w:space="0" w:color="CBCBCB"/>
+              <w:right w:val="single" w:sz="4" w:space="0" w:color="CBCBCB"/>
+            </w:tcBorders>
+          </w:tcPr>
+          <w:p>
+            <w:r>
+              <w:rPr>
+                <w:sz w:val="20"/>
+              </w:rPr>
+              <w:t>domain-modeling.md — CONTEXT.md vocabulary</w:t>
+            </w:r>
+          </w:p>
+        </w:tc>
+        <w:tc>
+          <w:tcPr>
+            <w:tcW w:type="dxa" w:w="2422"/>
+            <w:tcBorders>
+              <w:top w:val="single" w:sz="4" w:space="0" w:color="CBCBCB"/>
+              <w:left w:val="single" w:sz="4" w:space="0" w:color="CBCBCB"/>
+              <w:bottom w:val="single" w:sz="4" w:space="0" w:color="CBCBCB"/>
+              <w:right w:val="single" w:sz="4" w:space="0" w:color="CBCBCB"/>
+            </w:tcBorders>
+          </w:tcPr>
+          <w:p>
+            <w:r>
+              <w:rPr>
+                <w:sz w:val="20"/>
+              </w:rPr>
+              <w:t>✅ Đã áp dụng</w:t>
+            </w:r>
+          </w:p>
+        </w:tc>
+        <w:tc>
+          <w:tcPr>
+            <w:tcW w:type="dxa" w:w="2422"/>
+            <w:tcBorders>
+              <w:top w:val="single" w:sz="4" w:space="0" w:color="CBCBCB"/>
+              <w:left w:val="single" w:sz="4" w:space="0" w:color="CBCBCB"/>
+              <w:bottom w:val="single" w:sz="4" w:space="0" w:color="CBCBCB"/>
+              <w:right w:val="single" w:sz="4" w:space="0" w:color="CBCBCB"/>
+            </w:tcBorders>
+          </w:tcPr>
+          <w:p>
+            <w:r>
+              <w:rPr>
+                <w:rFonts w:ascii="Courier New" w:hAnsi="Courier New"/>
+                <w:color w:val="F05922"/>
+                <w:sz w:val="20"/>
+              </w:rPr>
+              <w:t>.claude/evals/domain-modeling.md</w:t>
+            </w:r>
+            <w:r>
+              <w:rPr>
+                <w:sz w:val="20"/>
+              </w:rPr>
+              <w:t xml:space="preserve"> (mới), </w:t>
+            </w:r>
+            <w:r>
+              <w:rPr>
+                <w:rFonts w:ascii="Courier New" w:hAnsi="Courier New"/>
+                <w:color w:val="F05922"/>
+                <w:sz w:val="20"/>
+              </w:rPr>
+              <w:t>.claude/commands/domain-modeling.md</w:t>
+            </w:r>
+            <w:r>
+              <w:rPr>
+                <w:sz w:val="20"/>
+              </w:rPr>
+              <w:t xml:space="preserve"> (mới), </w:t>
+            </w:r>
+            <w:r>
+              <w:rPr>
+                <w:rFonts w:ascii="Courier New" w:hAnsi="Courier New"/>
+                <w:color w:val="F05922"/>
+                <w:sz w:val="20"/>
+              </w:rPr>
+              <w:t>docs/CONTEXT-template.md</w:t>
+            </w:r>
+            <w:r>
+              <w:rPr>
+                <w:sz w:val="20"/>
+              </w:rPr>
+              <w:t xml:space="preserve"> (mới)</w:t>
+            </w:r>
+          </w:p>
+        </w:tc>
+      </w:tr>
+      <w:tr>
+        <w:tc>
+          <w:tcPr>
+            <w:tcW w:type="dxa" w:w="2422"/>
+            <w:shd w:val="clear" w:color="auto" w:fill="B8B3D6"/>
+            <w:tcBorders>
+              <w:top w:val="single" w:sz="4" w:space="0" w:color="CBCBCB"/>
+              <w:left w:val="single" w:sz="4" w:space="0" w:color="CBCBCB"/>
+              <w:bottom w:val="single" w:sz="4" w:space="0" w:color="CBCBCB"/>
+              <w:right w:val="single" w:sz="4" w:space="0" w:color="CBCBCB"/>
+            </w:tcBorders>
+          </w:tcPr>
+          <w:p>
+            <w:r>
+              <w:rPr>
+                <w:sz w:val="20"/>
+              </w:rPr>
+              <w:t>E7</w:t>
+            </w:r>
+          </w:p>
+        </w:tc>
+        <w:tc>
+          <w:tcPr>
+            <w:tcW w:type="dxa" w:w="2422"/>
+            <w:shd w:val="clear" w:color="auto" w:fill="B8B3D6"/>
+            <w:tcBorders>
+              <w:top w:val="single" w:sz="4" w:space="0" w:color="CBCBCB"/>
+              <w:left w:val="single" w:sz="4" w:space="0" w:color="CBCBCB"/>
+              <w:bottom w:val="single" w:sz="4" w:space="0" w:color="CBCBCB"/>
+              <w:right w:val="single" w:sz="4" w:space="0" w:color="CBCBCB"/>
+            </w:tcBorders>
+          </w:tcPr>
+          <w:p>
+            <w:r>
+              <w:rPr>
+                <w:sz w:val="20"/>
+              </w:rPr>
+              <w:t>codebase-design.md — 7-term vocabulary</w:t>
+            </w:r>
+          </w:p>
+        </w:tc>
+        <w:tc>
+          <w:tcPr>
+            <w:tcW w:type="dxa" w:w="2422"/>
+            <w:shd w:val="clear" w:color="auto" w:fill="B8B3D6"/>
+            <w:tcBorders>
+              <w:top w:val="single" w:sz="4" w:space="0" w:color="CBCBCB"/>
+              <w:left w:val="single" w:sz="4" w:space="0" w:color="CBCBCB"/>
+              <w:bottom w:val="single" w:sz="4" w:space="0" w:color="CBCBCB"/>
+              <w:right w:val="single" w:sz="4" w:space="0" w:color="CBCBCB"/>
+            </w:tcBorders>
+          </w:tcPr>
+          <w:p>
+            <w:r>
+              <w:rPr>
+                <w:sz w:val="20"/>
+              </w:rPr>
+              <w:t>✅ Đã áp dụng</w:t>
+            </w:r>
+          </w:p>
+        </w:tc>
+        <w:tc>
+          <w:tcPr>
+            <w:tcW w:type="dxa" w:w="2422"/>
+            <w:shd w:val="clear" w:color="auto" w:fill="B8B3D6"/>
+            <w:tcBorders>
+              <w:top w:val="single" w:sz="4" w:space="0" w:color="CBCBCB"/>
+              <w:left w:val="single" w:sz="4" w:space="0" w:color="CBCBCB"/>
+              <w:bottom w:val="single" w:sz="4" w:space="0" w:color="CBCBCB"/>
+              <w:right w:val="single" w:sz="4" w:space="0" w:color="CBCBCB"/>
+            </w:tcBorders>
+          </w:tcPr>
+          <w:p>
+            <w:r>
+              <w:rPr>
+                <w:rFonts w:ascii="Courier New" w:hAnsi="Courier New"/>
+                <w:color w:val="F05922"/>
+                <w:sz w:val="20"/>
+              </w:rPr>
+              <w:t>.claude/evals/codebase-design.md</w:t>
+            </w:r>
+            <w:r>
+              <w:rPr>
+                <w:sz w:val="20"/>
+              </w:rPr>
+              <w:t xml:space="preserve"> (mới), </w:t>
+            </w:r>
+            <w:r>
+              <w:rPr>
+                <w:rFonts w:ascii="Courier New" w:hAnsi="Courier New"/>
+                <w:color w:val="F05922"/>
+                <w:sz w:val="20"/>
+              </w:rPr>
+              <w:t>.claude/commands/codebase-design.md</w:t>
+            </w:r>
+            <w:r>
+              <w:rPr>
+                <w:sz w:val="20"/>
+              </w:rPr>
+              <w:t xml:space="preserve"> (mới)</w:t>
+            </w:r>
+          </w:p>
+        </w:tc>
+      </w:tr>
+      <w:tr>
+        <w:tc>
+          <w:tcPr>
+            <w:tcW w:type="dxa" w:w="2422"/>
+            <w:tcBorders>
+              <w:top w:val="single" w:sz="4" w:space="0" w:color="CBCBCB"/>
+              <w:left w:val="single" w:sz="4" w:space="0" w:color="CBCBCB"/>
+              <w:bottom w:val="single" w:sz="4" w:space="0" w:color="CBCBCB"/>
+              <w:right w:val="single" w:sz="4" w:space="0" w:color="CBCBCB"/>
+            </w:tcBorders>
+          </w:tcPr>
+          <w:p>
+            <w:r>
+              <w:rPr>
+                <w:sz w:val="20"/>
+              </w:rPr>
+              <w:t>E8</w:t>
+            </w:r>
+          </w:p>
+        </w:tc>
+        <w:tc>
+          <w:tcPr>
+            <w:tcW w:type="dxa" w:w="2422"/>
+            <w:tcBorders>
+              <w:top w:val="single" w:sz="4" w:space="0" w:color="CBCBCB"/>
+              <w:left w:val="single" w:sz="4" w:space="0" w:color="CBCBCB"/>
+              <w:bottom w:val="single" w:sz="4" w:space="0" w:color="CBCBCB"/>
+              <w:right w:val="single" w:sz="4" w:space="0" w:color="CBCBCB"/>
+            </w:tcBorders>
+          </w:tcPr>
+          <w:p>
+            <w:r>
+              <w:rPr>
+                <w:sz w:val="20"/>
+              </w:rPr>
+              <w:t>wayfinder-lite.md — foggy work decision ticket</w:t>
+            </w:r>
+          </w:p>
+        </w:tc>
+        <w:tc>
+          <w:tcPr>
+            <w:tcW w:type="dxa" w:w="2422"/>
+            <w:tcBorders>
+              <w:top w:val="single" w:sz="4" w:space="0" w:color="CBCBCB"/>
+              <w:left w:val="single" w:sz="4" w:space="0" w:color="CBCBCB"/>
+              <w:bottom w:val="single" w:sz="4" w:space="0" w:color="CBCBCB"/>
+              <w:right w:val="single" w:sz="4" w:space="0" w:color="CBCBCB"/>
+            </w:tcBorders>
+          </w:tcPr>
+          <w:p>
+            <w:r>
+              <w:rPr>
+                <w:sz w:val="20"/>
+              </w:rPr>
+              <w:t>✅ Đã áp dụng</w:t>
+            </w:r>
+          </w:p>
+        </w:tc>
+        <w:tc>
+          <w:tcPr>
+            <w:tcW w:type="dxa" w:w="2422"/>
+            <w:tcBorders>
+              <w:top w:val="single" w:sz="4" w:space="0" w:color="CBCBCB"/>
+              <w:left w:val="single" w:sz="4" w:space="0" w:color="CBCBCB"/>
+              <w:bottom w:val="single" w:sz="4" w:space="0" w:color="CBCBCB"/>
+              <w:right w:val="single" w:sz="4" w:space="0" w:color="CBCBCB"/>
+            </w:tcBorders>
+          </w:tcPr>
+          <w:p>
+            <w:r>
+              <w:rPr>
+                <w:rFonts w:ascii="Courier New" w:hAnsi="Courier New"/>
+                <w:color w:val="F05922"/>
+                <w:sz w:val="20"/>
+              </w:rPr>
+              <w:t>.claude/evals/wayfinder-lite.md</w:t>
+            </w:r>
+            <w:r>
+              <w:rPr>
+                <w:sz w:val="20"/>
+              </w:rPr>
+              <w:t xml:space="preserve"> (mới), </w:t>
+            </w:r>
+            <w:r>
+              <w:rPr>
+                <w:rFonts w:ascii="Courier New" w:hAnsi="Courier New"/>
+                <w:color w:val="F05922"/>
+                <w:sz w:val="20"/>
+              </w:rPr>
+              <w:t>.claude/commands/wayfinder-lite.md</w:t>
+            </w:r>
+            <w:r>
+              <w:rPr>
+                <w:sz w:val="20"/>
+              </w:rPr>
+              <w:t xml:space="preserve"> (mới)</w:t>
+            </w:r>
+          </w:p>
+        </w:tc>
+      </w:tr>
+      <w:tr>
+        <w:tc>
+          <w:tcPr>
+            <w:tcW w:type="dxa" w:w="2422"/>
+            <w:shd w:val="clear" w:color="auto" w:fill="B8B3D6"/>
+            <w:tcBorders>
+              <w:top w:val="single" w:sz="4" w:space="0" w:color="CBCBCB"/>
+              <w:left w:val="single" w:sz="4" w:space="0" w:color="CBCBCB"/>
+              <w:bottom w:val="single" w:sz="4" w:space="0" w:color="CBCBCB"/>
+              <w:right w:val="single" w:sz="4" w:space="0" w:color="CBCBCB"/>
+            </w:tcBorders>
+          </w:tcPr>
+          <w:p>
+            <w:r>
+              <w:rPr>
+                <w:sz w:val="20"/>
+              </w:rPr>
+              <w:t>E9</w:t>
+            </w:r>
+          </w:p>
+        </w:tc>
+        <w:tc>
+          <w:tcPr>
+            <w:tcW w:type="dxa" w:w="2422"/>
+            <w:shd w:val="clear" w:color="auto" w:fill="B8B3D6"/>
+            <w:tcBorders>
+              <w:top w:val="single" w:sz="4" w:space="0" w:color="CBCBCB"/>
+              <w:left w:val="single" w:sz="4" w:space="0" w:color="CBCBCB"/>
+              <w:bottom w:val="single" w:sz="4" w:space="0" w:color="CBCBCB"/>
+              <w:right w:val="single" w:sz="4" w:space="0" w:color="CBCBCB"/>
+            </w:tcBorders>
+          </w:tcPr>
+          <w:p>
+            <w:r>
+              <w:rPr>
+                <w:sz w:val="20"/>
+              </w:rPr>
+              <w:t>Nâng cấp cấu trúc thông tin trong agent/skill definitions</w:t>
+            </w:r>
+          </w:p>
+        </w:tc>
+        <w:tc>
+          <w:tcPr>
+            <w:tcW w:type="dxa" w:w="2422"/>
+            <w:shd w:val="clear" w:color="auto" w:fill="B8B3D6"/>
+            <w:tcBorders>
+              <w:top w:val="single" w:sz="4" w:space="0" w:color="CBCBCB"/>
+              <w:left w:val="single" w:sz="4" w:space="0" w:color="CBCBCB"/>
+              <w:bottom w:val="single" w:sz="4" w:space="0" w:color="CBCBCB"/>
+              <w:right w:val="single" w:sz="4" w:space="0" w:color="CBCBCB"/>
+            </w:tcBorders>
+          </w:tcPr>
+          <w:p>
+            <w:r>
+              <w:rPr>
+                <w:sz w:val="20"/>
+              </w:rPr>
+              <w:t>✅ Đã áp dụng</w:t>
+            </w:r>
+          </w:p>
+        </w:tc>
+        <w:tc>
+          <w:tcPr>
+            <w:tcW w:type="dxa" w:w="2422"/>
+            <w:shd w:val="clear" w:color="auto" w:fill="B8B3D6"/>
+            <w:tcBorders>
+              <w:top w:val="single" w:sz="4" w:space="0" w:color="CBCBCB"/>
+              <w:left w:val="single" w:sz="4" w:space="0" w:color="CBCBCB"/>
+              <w:bottom w:val="single" w:sz="4" w:space="0" w:color="CBCBCB"/>
+              <w:right w:val="single" w:sz="4" w:space="0" w:color="CBCBCB"/>
+            </w:tcBorders>
+          </w:tcPr>
+          <w:p>
+            <w:r>
+              <w:rPr>
+                <w:rFonts w:ascii="Courier New" w:hAnsi="Courier New"/>
+                <w:color w:val="F05922"/>
+                <w:sz w:val="20"/>
+              </w:rPr>
+              <w:t>.claude/commands/writing-agent-skill.md</w:t>
+            </w:r>
+            <w:r>
+              <w:rPr>
+                <w:sz w:val="20"/>
+              </w:rPr>
+              <w:t xml:space="preserve"> (thêm Bước 4b — information structure), </w:t>
+            </w:r>
+            <w:r>
+              <w:rPr>
+                <w:rFonts w:ascii="Courier New" w:hAnsi="Courier New"/>
+                <w:color w:val="F05922"/>
+                <w:sz w:val="20"/>
+              </w:rPr>
+              <w:t>.claude/agents/md-optimizer.md</w:t>
+            </w:r>
+            <w:r>
+              <w:rPr>
+                <w:sz w:val="20"/>
+              </w:rPr>
+              <w:t xml:space="preserve"> (thêm PHASE 2b — Information Structure Audit)</w:t>
+            </w:r>
+          </w:p>
+        </w:tc>
+      </w:tr>
+      <w:tr>
+        <w:tc>
+          <w:tcPr>
+            <w:tcW w:type="dxa" w:w="2422"/>
+            <w:tcBorders>
+              <w:top w:val="single" w:sz="4" w:space="0" w:color="CBCBCB"/>
+              <w:left w:val="single" w:sz="4" w:space="0" w:color="CBCBCB"/>
+              <w:bottom w:val="single" w:sz="4" w:space="0" w:color="CBCBCB"/>
+              <w:right w:val="single" w:sz="4" w:space="0" w:color="CBCBCB"/>
+            </w:tcBorders>
+          </w:tcPr>
+          <w:p>
+            <w:r>
+              <w:rPr>
+                <w:sz w:val="20"/>
+              </w:rPr>
+              <w:t>E10</w:t>
+            </w:r>
+          </w:p>
+        </w:tc>
+        <w:tc>
+          <w:tcPr>
+            <w:tcW w:type="dxa" w:w="2422"/>
+            <w:tcBorders>
+              <w:top w:val="single" w:sz="4" w:space="0" w:color="CBCBCB"/>
+              <w:left w:val="single" w:sz="4" w:space="0" w:color="CBCBCB"/>
+              <w:bottom w:val="single" w:sz="4" w:space="0" w:color="CBCBCB"/>
+              <w:right w:val="single" w:sz="4" w:space="0" w:color="CBCBCB"/>
+            </w:tcBorders>
+          </w:tcPr>
+          <w:p>
+            <w:r>
+              <w:rPr>
+                <w:sz w:val="20"/>
+              </w:rPr>
+              <w:t>docs/decisions/REJECTED.md — rejection convention</w:t>
+            </w:r>
+          </w:p>
+        </w:tc>
+        <w:tc>
+          <w:tcPr>
+            <w:tcW w:type="dxa" w:w="2422"/>
+            <w:tcBorders>
+              <w:top w:val="single" w:sz="4" w:space="0" w:color="CBCBCB"/>
+              <w:left w:val="single" w:sz="4" w:space="0" w:color="CBCBCB"/>
+              <w:bottom w:val="single" w:sz="4" w:space="0" w:color="CBCBCB"/>
+              <w:right w:val="single" w:sz="4" w:space="0" w:color="CBCBCB"/>
+            </w:tcBorders>
+          </w:tcPr>
+          <w:p>
+            <w:r>
+              <w:rPr>
+                <w:sz w:val="20"/>
+              </w:rPr>
+              <w:t>✅ Đã áp dụng</w:t>
+            </w:r>
+          </w:p>
+        </w:tc>
+        <w:tc>
+          <w:tcPr>
+            <w:tcW w:type="dxa" w:w="2422"/>
+            <w:tcBorders>
+              <w:top w:val="single" w:sz="4" w:space="0" w:color="CBCBCB"/>
+              <w:left w:val="single" w:sz="4" w:space="0" w:color="CBCBCB"/>
+              <w:bottom w:val="single" w:sz="4" w:space="0" w:color="CBCBCB"/>
+              <w:right w:val="single" w:sz="4" w:space="0" w:color="CBCBCB"/>
+            </w:tcBorders>
+          </w:tcPr>
+          <w:p>
+            <w:r>
+              <w:rPr>
+                <w:rFonts w:ascii="Courier New" w:hAnsi="Courier New"/>
+                <w:color w:val="F05922"/>
+                <w:sz w:val="20"/>
+              </w:rPr>
+              <w:t>docs/decisions/REJECTED.md</w:t>
+            </w:r>
+            <w:r>
+              <w:rPr>
+                <w:sz w:val="20"/>
+              </w:rPr>
+              <w:t xml:space="preserve"> (mới, 10 entries), </w:t>
+            </w:r>
+            <w:r>
+              <w:rPr>
+                <w:rFonts w:ascii="Courier New" w:hAnsi="Courier New"/>
+                <w:color w:val="F05922"/>
+                <w:sz w:val="20"/>
+              </w:rPr>
+              <w:t>docs/decisions/REJECTED.docx</w:t>
+            </w:r>
+            <w:r>
+              <w:rPr>
+                <w:sz w:val="20"/>
+              </w:rPr>
+              <w:t xml:space="preserve"> + </w:t>
+            </w:r>
+            <w:r>
+              <w:rPr>
+                <w:rFonts w:ascii="Courier New" w:hAnsi="Courier New"/>
+                <w:color w:val="F05922"/>
+                <w:sz w:val="20"/>
+              </w:rPr>
+              <w:t>.pdf</w:t>
+            </w:r>
+          </w:p>
+        </w:tc>
+      </w:tr>
+      <w:tr>
+        <w:tc>
+          <w:tcPr>
+            <w:tcW w:type="dxa" w:w="2422"/>
+            <w:shd w:val="clear" w:color="auto" w:fill="B8B3D6"/>
+            <w:tcBorders>
+              <w:top w:val="single" w:sz="4" w:space="0" w:color="CBCBCB"/>
+              <w:left w:val="single" w:sz="4" w:space="0" w:color="CBCBCB"/>
+              <w:bottom w:val="single" w:sz="4" w:space="0" w:color="CBCBCB"/>
+              <w:right w:val="single" w:sz="4" w:space="0" w:color="CBCBCB"/>
+            </w:tcBorders>
+          </w:tcPr>
+          <w:p>
+            <w:r>
+              <w:rPr>
+                <w:sz w:val="20"/>
+              </w:rPr>
+              <w:t>E11</w:t>
+            </w:r>
+          </w:p>
+        </w:tc>
+        <w:tc>
+          <w:tcPr>
+            <w:tcW w:type="dxa" w:w="2422"/>
+            <w:shd w:val="clear" w:color="auto" w:fill="B8B3D6"/>
+            <w:tcBorders>
+              <w:top w:val="single" w:sz="4" w:space="0" w:color="CBCBCB"/>
+              <w:left w:val="single" w:sz="4" w:space="0" w:color="CBCBCB"/>
+              <w:bottom w:val="single" w:sz="4" w:space="0" w:color="CBCBCB"/>
+              <w:right w:val="single" w:sz="4" w:space="0" w:color="CBCBCB"/>
+            </w:tcBorders>
+          </w:tcPr>
+          <w:p>
+            <w:r>
+              <w:rPr>
+                <w:sz w:val="20"/>
+              </w:rPr>
+              <w:t>research.md — general research skill</w:t>
+            </w:r>
+          </w:p>
+        </w:tc>
+        <w:tc>
+          <w:tcPr>
+            <w:tcW w:type="dxa" w:w="2422"/>
+            <w:shd w:val="clear" w:color="auto" w:fill="B8B3D6"/>
+            <w:tcBorders>
+              <w:top w:val="single" w:sz="4" w:space="0" w:color="CBCBCB"/>
+              <w:left w:val="single" w:sz="4" w:space="0" w:color="CBCBCB"/>
+              <w:bottom w:val="single" w:sz="4" w:space="0" w:color="CBCBCB"/>
+              <w:right w:val="single" w:sz="4" w:space="0" w:color="CBCBCB"/>
+            </w:tcBorders>
+          </w:tcPr>
+          <w:p>
+            <w:r>
+              <w:rPr>
+                <w:sz w:val="20"/>
+              </w:rPr>
+              <w:t>✅ Đã áp dụng</w:t>
+            </w:r>
+          </w:p>
+        </w:tc>
+        <w:tc>
+          <w:tcPr>
+            <w:tcW w:type="dxa" w:w="2422"/>
+            <w:shd w:val="clear" w:color="auto" w:fill="B8B3D6"/>
+            <w:tcBorders>
+              <w:top w:val="single" w:sz="4" w:space="0" w:color="CBCBCB"/>
+              <w:left w:val="single" w:sz="4" w:space="0" w:color="CBCBCB"/>
+              <w:bottom w:val="single" w:sz="4" w:space="0" w:color="CBCBCB"/>
+              <w:right w:val="single" w:sz="4" w:space="0" w:color="CBCBCB"/>
+            </w:tcBorders>
+          </w:tcPr>
+          <w:p>
+            <w:r>
+              <w:rPr>
+                <w:rFonts w:ascii="Courier New" w:hAnsi="Courier New"/>
+                <w:color w:val="F05922"/>
+                <w:sz w:val="20"/>
+              </w:rPr>
+              <w:t>.claude/evals/research.md</w:t>
+            </w:r>
+            <w:r>
+              <w:rPr>
+                <w:sz w:val="20"/>
+              </w:rPr>
+              <w:t xml:space="preserve"> (mới), </w:t>
+            </w:r>
+            <w:r>
+              <w:rPr>
+                <w:rFonts w:ascii="Courier New" w:hAnsi="Courier New"/>
+                <w:color w:val="F05922"/>
+                <w:sz w:val="20"/>
+              </w:rPr>
+              <w:t>.claude/commands/research.md</w:t>
+            </w:r>
+            <w:r>
+              <w:rPr>
+                <w:sz w:val="20"/>
+              </w:rPr>
+              <w:t xml:space="preserve"> (mới)</w:t>
+            </w:r>
+          </w:p>
+        </w:tc>
+      </w:tr>
+    </w:tbl>
+    <w:p/>
+    <w:p>
+      <w:pPr>
+        <w:spacing w:after="80"/>
+      </w:pPr>
+      <w:r>
+        <w:rPr>
+          <w:b/>
+          <w:sz w:val="21"/>
+        </w:rPr>
+        <w:t>Cập nhật CLAUDE.md và agent descriptions:</w:t>
+      </w:r>
+    </w:p>
+    <w:p>
+      <w:pPr>
+        <w:pStyle w:val="ListBullet"/>
+        <w:spacing w:after="20"/>
+        <w:ind w:left="283"/>
+      </w:pPr>
+      <w:r>
+        <w:rPr>
+          <w:rFonts w:ascii="Courier New" w:hAnsi="Courier New"/>
+          <w:color w:val="F05922"/>
+          <w:sz w:val="21"/>
+        </w:rPr>
+        <w:t>CLAUDE.md §3.0 Pre-0a</w:t>
+      </w:r>
+      <w:r>
+        <w:rPr>
+          <w:sz w:val="21"/>
+        </w:rPr>
+        <w:t>: Thêm gợi ý grilling khi scope phức tạp sau scope-check</w:t>
+      </w:r>
+    </w:p>
+    <w:p>
+      <w:pPr>
+        <w:pStyle w:val="ListBullet"/>
+        <w:spacing w:after="20"/>
+        <w:ind w:left="283"/>
+      </w:pPr>
+      <w:r>
+        <w:rPr>
+          <w:rFonts w:ascii="Courier New" w:hAnsi="Courier New"/>
+          <w:color w:val="F05922"/>
+          <w:sz w:val="21"/>
+        </w:rPr>
+        <w:t>CLAUDE.md §4 WF-BUGFIX Bước 1</w:t>
+      </w:r>
+      <w:r>
+        <w:rPr>
+          <w:sz w:val="21"/>
+        </w:rPr>
+        <w:t xml:space="preserve">: Thêm mention </w:t>
+      </w:r>
+      <w:r>
+        <w:rPr>
+          <w:rFonts w:ascii="Courier New" w:hAnsi="Courier New"/>
+          <w:color w:val="F05922"/>
+          <w:sz w:val="21"/>
+        </w:rPr>
+        <w:t>/diagnosing-bugs</w:t>
+      </w:r>
+    </w:p>
+    <w:p>
+      <w:pPr>
+        <w:pStyle w:val="ListBullet"/>
+        <w:spacing w:after="20"/>
+        <w:ind w:left="283"/>
+      </w:pPr>
+      <w:r>
+        <w:rPr>
+          <w:rFonts w:ascii="Courier New" w:hAnsi="Courier New"/>
+          <w:color w:val="F05922"/>
+          <w:sz w:val="21"/>
+        </w:rPr>
+        <w:t>CLAUDE.md §4 WF-FEATURE Bước 8-9</w:t>
+      </w:r>
+      <w:r>
+        <w:rPr>
+          <w:sz w:val="21"/>
+        </w:rPr>
+        <w:t xml:space="preserve">: Thêm mention </w:t>
+      </w:r>
+      <w:r>
+        <w:rPr>
+          <w:rFonts w:ascii="Courier New" w:hAnsi="Courier New"/>
+          <w:color w:val="F05922"/>
+          <w:sz w:val="21"/>
+        </w:rPr>
+        <w:t>/tdd</w:t>
+      </w:r>
+    </w:p>
+    <w:p>
+      <w:pPr>
+        <w:pStyle w:val="ListBullet"/>
+        <w:spacing w:after="20"/>
+        <w:ind w:left="283"/>
+      </w:pPr>
+      <w:r>
+        <w:rPr>
+          <w:rFonts w:ascii="Courier New" w:hAnsi="Courier New"/>
+          <w:color w:val="F05922"/>
+          <w:sz w:val="21"/>
+        </w:rPr>
+        <w:t>.claude/agents/senior-developer.md</w:t>
+      </w:r>
+      <w:r>
+        <w:rPr>
+          <w:sz w:val="21"/>
+        </w:rPr>
+        <w:t>: Thêm section "Skills dùng trong công việc" (tdd, diagnosing-bugs, code-review, grilling, codebase-design)</w:t>
+      </w:r>
+    </w:p>
+    <w:p>
+      <w:pPr>
+        <w:pStyle w:val="ListBullet"/>
+        <w:spacing w:after="20"/>
+        <w:ind w:left="283"/>
+      </w:pPr>
+      <w:r>
+        <w:rPr>
+          <w:rFonts w:ascii="Courier New" w:hAnsi="Courier New"/>
+          <w:color w:val="F05922"/>
+          <w:sz w:val="21"/>
+        </w:rPr>
+        <w:t>.claude/agents/tech-lead.md</w:t>
+      </w:r>
+      <w:r>
+        <w:rPr>
+          <w:sz w:val="21"/>
+        </w:rPr>
+        <w:t>: Thêm section "Skills dùng trong công việc" (code-review, codebase-design, grilling)</w:t>
+      </w:r>
+    </w:p>
+    <w:p>
+      <w:pPr>
+        <w:pStyle w:val="ListBullet"/>
+        <w:spacing w:after="20"/>
+        <w:ind w:left="283"/>
+      </w:pPr>
+      <w:r>
+        <w:rPr>
+          <w:rFonts w:ascii="Courier New" w:hAnsi="Courier New"/>
+          <w:color w:val="F05922"/>
+          <w:sz w:val="21"/>
+        </w:rPr>
+        <w:t>.claude/agents/qa-engineer.md</w:t>
+      </w:r>
+      <w:r>
+        <w:rPr>
+          <w:sz w:val="21"/>
+        </w:rPr>
+        <w:t>: Thêm section "Skills dùng trong công việc" (diagnosing-bugs)</w:t>
+      </w:r>
+    </w:p>
+    <w:p>
+      <w:pPr>
+        <w:spacing w:after="80"/>
+      </w:pPr>
+      <w:r>
+        <w:rPr>
+          <w:b/>
+          <w:sz w:val="21"/>
+        </w:rPr>
+        <w:t>Commits:</w:t>
+      </w:r>
+      <w:r>
+        <w:rPr>
+          <w:sz w:val="21"/>
+        </w:rPr>
+        <w:t xml:space="preserve"> 3ea9c3a (Nhóm 1), 5c1f1c7 (Nhóm 2), a4fb3e5 (Nhóm 3)</w:t>
+      </w:r>
+    </w:p>
+    <w:p>
+      <w:pPr>
+        <w:spacing w:after="80"/>
+      </w:pPr>
+      <w:r>
+        <w:rPr>
+          <w:b/>
+          <w:sz w:val="21"/>
+        </w:rPr>
+        <w:t>Chờ xác nhận:</w:t>
+      </w:r>
+      <w:r>
+        <w:rPr>
+          <w:sz w:val="21"/>
+        </w:rPr>
+        <w:t xml:space="preserve"> Bước 5 — user xác nhận merge nhánh </w:t>
+      </w:r>
+      <w:r>
+        <w:rPr>
+          <w:rFonts w:ascii="Courier New" w:hAnsi="Courier New"/>
+          <w:color w:val="F05922"/>
+          <w:sz w:val="18"/>
+        </w:rPr>
+        <w:t>research/skills-2026-08-05</w:t>
+      </w:r>
+      <w:r>
+        <w:rPr>
+          <w:sz w:val="21"/>
+        </w:rPr>
+        <w:t xml:space="preserve"> về </w:t>
+      </w:r>
+      <w:r>
+        <w:rPr>
+          <w:rFonts w:ascii="Courier New" w:hAnsi="Courier New"/>
+          <w:color w:val="F05922"/>
+          <w:sz w:val="18"/>
+        </w:rPr>
+        <w:t>main</w:t>
+      </w:r>
+      <w:r>
+        <w:rPr>
+          <w:sz w:val="21"/>
+        </w:rPr>
+        <w:t>.</w:t>
       </w:r>
     </w:p>
     <w:sectPr>

</xml_diff>